<commit_message>
update publications and mobile size for plot
</commit_message>
<xml_diff>
--- a/files/Zihan_Hei_CV.docx
+++ b/files/Zihan_Hei_CV.docx
@@ -3359,7 +3359,7 @@
     <w:tbl>
       <w:tblPr>
         <w:tblStyle w:val="TableGrid"/>
-        <w:tblW w:w="11513" w:type="dxa"/>
+        <w:tblW w:w="12953" w:type="dxa"/>
         <w:tblInd w:w="-142" w:type="dxa"/>
         <w:tblBorders>
           <w:top w:val="none" w:sz="0" w:space="0" w:color="auto"/>
@@ -3372,23 +3372,22 @@
         <w:tblLook w:val="04A0" w:firstRow="1" w:lastRow="0" w:firstColumn="1" w:lastColumn="0" w:noHBand="0" w:noVBand="1"/>
       </w:tblPr>
       <w:tblGrid>
-        <w:gridCol w:w="34"/>
-        <w:gridCol w:w="1242"/>
+        <w:gridCol w:w="1276"/>
         <w:gridCol w:w="426"/>
         <w:gridCol w:w="9777"/>
         <w:gridCol w:w="28"/>
-        <w:gridCol w:w="6"/>
+        <w:gridCol w:w="1446"/>
       </w:tblGrid>
       <w:tr>
         <w:trPr>
           <w:gridAfter w:val="1"/>
-          <w:wAfter w:w="6" w:type="dxa"/>
+          <w:wAfter w:w="1446" w:type="dxa"/>
           <w:trHeight w:val="153"/>
         </w:trPr>
         <w:tc>
           <w:tcPr>
             <w:tcW w:w="11507" w:type="dxa"/>
-            <w:gridSpan w:val="5"/>
+            <w:gridSpan w:val="4"/>
           </w:tcPr>
           <w:p>
             <w:pPr>
@@ -3453,13 +3452,12 @@
       <w:tr>
         <w:trPr>
           <w:gridAfter w:val="1"/>
-          <w:wAfter w:w="6" w:type="dxa"/>
+          <w:wAfter w:w="1446" w:type="dxa"/>
           <w:trHeight w:val="144"/>
         </w:trPr>
         <w:tc>
           <w:tcPr>
             <w:tcW w:w="1276" w:type="dxa"/>
-            <w:gridSpan w:val="2"/>
             <w:tcMar>
               <w:left w:w="57" w:type="dxa"/>
             </w:tcMar>
@@ -3746,13 +3744,13 @@
       <w:tr>
         <w:trPr>
           <w:gridAfter w:val="2"/>
-          <w:wAfter w:w="34" w:type="dxa"/>
+          <w:wAfter w:w="1474" w:type="dxa"/>
           <w:trHeight w:val="242"/>
         </w:trPr>
         <w:tc>
           <w:tcPr>
             <w:tcW w:w="11479" w:type="dxa"/>
-            <w:gridSpan w:val="4"/>
+            <w:gridSpan w:val="3"/>
           </w:tcPr>
           <w:p/>
           <w:p/>
@@ -3761,12 +3759,12 @@
       <w:tr>
         <w:trPr>
           <w:gridAfter w:val="2"/>
-          <w:wAfter w:w="34" w:type="dxa"/>
+          <w:wAfter w:w="1474" w:type="dxa"/>
         </w:trPr>
         <w:tc>
           <w:tcPr>
             <w:tcW w:w="11479" w:type="dxa"/>
-            <w:gridSpan w:val="4"/>
+            <w:gridSpan w:val="3"/>
           </w:tcPr>
           <w:p>
             <w:pPr>
@@ -3795,13 +3793,13 @@
       </w:tr>
       <w:tr>
         <w:trPr>
-          <w:gridAfter w:val="2"/>
-          <w:wAfter w:w="34" w:type="dxa"/>
+          <w:gridBefore w:val="2"/>
+          <w:wBefore w:w="1702" w:type="dxa"/>
         </w:trPr>
         <w:tc>
           <w:tcPr>
-            <w:tcW w:w="11479" w:type="dxa"/>
-            <w:gridSpan w:val="4"/>
+            <w:tcW w:w="11251" w:type="dxa"/>
+            <w:gridSpan w:val="3"/>
           </w:tcPr>
           <w:p>
             <w:pPr>
@@ -3820,13 +3818,16 @@
       </w:tr>
       <w:tr>
         <w:trPr>
-          <w:gridBefore w:val="1"/>
-          <w:wBefore w:w="34" w:type="dxa"/>
+          <w:gridBefore w:val="2"/>
+          <w:wBefore w:w="1702" w:type="dxa"/>
         </w:trPr>
         <w:tc>
           <w:tcPr>
-            <w:tcW w:w="11479" w:type="dxa"/>
-            <w:gridSpan w:val="5"/>
+            <w:tcW w:w="11251" w:type="dxa"/>
+            <w:gridSpan w:val="3"/>
+            <w:tcBorders>
+              <w:left w:val="single" w:sz="4" w:space="0" w:color="auto"/>
+            </w:tcBorders>
           </w:tcPr>
           <w:p>
             <w:pPr>
@@ -3844,7 +3845,59 @@
                 <w:sz w:val="20"/>
                 <w:szCs w:val="20"/>
               </w:rPr>
-              <w:t xml:space="preserve">McCarty, S., Light, C., Hei, Z., &amp; Fegley, M. (2026). </w:t>
+              <w:t>1</w:t>
+            </w:r>
+            <w:r>
+              <w:rPr>
+                <w:rFonts w:ascii="Roboto" w:eastAsia="Times New Roman" w:hAnsi="Roboto"/>
+                <w:sz w:val="20"/>
+                <w:szCs w:val="20"/>
+              </w:rPr>
+              <w:t xml:space="preserve">.    </w:t>
+            </w:r>
+            <w:r>
+              <w:rPr>
+                <w:rFonts w:ascii="Roboto" w:eastAsia="Times New Roman" w:hAnsi="Roboto"/>
+                <w:sz w:val="20"/>
+                <w:szCs w:val="20"/>
+              </w:rPr>
+              <w:t xml:space="preserve">McCarty, S., Light, C., </w:t>
+            </w:r>
+            <w:r>
+              <w:rPr>
+                <w:rFonts w:ascii="Roboto" w:eastAsia="Times New Roman" w:hAnsi="Roboto"/>
+                <w:b/>
+                <w:bCs/>
+                <w:sz w:val="20"/>
+                <w:szCs w:val="20"/>
+              </w:rPr>
+              <w:t>Hei, Z.</w:t>
+            </w:r>
+            <w:r>
+              <w:rPr>
+                <w:rFonts w:ascii="Roboto" w:eastAsia="Times New Roman" w:hAnsi="Roboto"/>
+                <w:sz w:val="20"/>
+                <w:szCs w:val="20"/>
+              </w:rPr>
+              <w:t xml:space="preserve">, </w:t>
+            </w:r>
+            <w:proofErr w:type="spellStart"/>
+            <w:r>
+              <w:rPr>
+                <w:rFonts w:ascii="Roboto" w:eastAsia="Times New Roman" w:hAnsi="Roboto"/>
+                <w:sz w:val="20"/>
+                <w:szCs w:val="20"/>
+              </w:rPr>
+              <w:t>Panzik</w:t>
+            </w:r>
+            <w:proofErr w:type="spellEnd"/>
+            <w:r>
+              <w:rPr>
+                <w:rFonts w:ascii="Roboto" w:eastAsia="Times New Roman" w:hAnsi="Roboto"/>
+                <w:sz w:val="20"/>
+                <w:szCs w:val="20"/>
+              </w:rPr>
+              <w:t>, J., Wolfe, P., &amp; Fegley, M. (2026).</w:t>
             </w:r>
           </w:p>
           <w:p>
@@ -3860,25 +3913,146 @@
             <w:r>
               <w:rPr>
                 <w:rFonts w:ascii="Roboto" w:eastAsia="Times New Roman" w:hAnsi="Roboto"/>
-                <w:sz w:val="20"/>
-                <w:szCs w:val="20"/>
-              </w:rPr>
-              <w:t xml:space="preserve">FRI Peer Mentor Mindsets Guide. Binghamton University. </w:t>
-            </w:r>
+                <w:i/>
+                <w:iCs/>
+                <w:sz w:val="20"/>
+                <w:szCs w:val="20"/>
+              </w:rPr>
+              <w:t>FRI Semester 3 Peer Mentor Mindsets Guide</w:t>
+            </w:r>
+            <w:r>
+              <w:rPr>
+                <w:rFonts w:ascii="Roboto" w:eastAsia="Times New Roman" w:hAnsi="Roboto"/>
+                <w:sz w:val="20"/>
+                <w:szCs w:val="20"/>
+              </w:rPr>
+              <w:t>. Binghamton University.</w:t>
+            </w:r>
+            <w:r>
+              <w:rPr>
+                <w:rFonts w:ascii="Roboto" w:eastAsia="Times New Roman" w:hAnsi="Roboto"/>
+                <w:sz w:val="20"/>
+                <w:szCs w:val="20"/>
+              </w:rPr>
+              <w:br/>
+            </w:r>
+            <w:hyperlink r:id="rId14" w:tgtFrame="_blank" w:history="1">
+              <w:r>
+                <w:rPr>
+                  <w:rStyle w:val="Hyperlink"/>
+                  <w:rFonts w:ascii="Roboto" w:eastAsia="Times New Roman" w:hAnsi="Roboto"/>
+                  <w:sz w:val="20"/>
+                  <w:szCs w:val="20"/>
+                </w:rPr>
+                <w:t>shanemccarty.github.io/FRImindsets3/</w:t>
+              </w:r>
+            </w:hyperlink>
           </w:p>
           <w:p>
             <w:pPr>
               <w:pStyle w:val="NormalWeb"/>
               <w:spacing w:before="0" w:beforeAutospacing="0" w:after="0" w:afterAutospacing="0"/>
-              <w:rPr>
-                <w:rFonts w:ascii="Roboto" w:hAnsi="Roboto"/>
-                <w:b/>
-                <w:bCs/>
-                <w:sz w:val="20"/>
-                <w:szCs w:val="20"/>
-              </w:rPr>
-            </w:pPr>
-            <w:hyperlink r:id="rId14" w:history="1">
+              <w:ind w:left="720"/>
+              <w:rPr>
+                <w:rFonts w:ascii="Roboto" w:eastAsia="Times New Roman" w:hAnsi="Roboto"/>
+                <w:sz w:val="20"/>
+                <w:szCs w:val="20"/>
+              </w:rPr>
+            </w:pPr>
+          </w:p>
+          <w:p>
+            <w:pPr>
+              <w:pStyle w:val="NormalWeb"/>
+              <w:spacing w:before="0" w:beforeAutospacing="0" w:after="0" w:afterAutospacing="0"/>
+              <w:rPr>
+                <w:rFonts w:ascii="Roboto" w:eastAsia="Times New Roman" w:hAnsi="Roboto"/>
+                <w:sz w:val="20"/>
+                <w:szCs w:val="20"/>
+              </w:rPr>
+            </w:pPr>
+            <w:r>
+              <w:rPr>
+                <w:rFonts w:ascii="Roboto" w:eastAsia="Times New Roman" w:hAnsi="Roboto"/>
+                <w:sz w:val="20"/>
+                <w:szCs w:val="20"/>
+              </w:rPr>
+              <w:t>2.</w:t>
+            </w:r>
+            <w:r>
+              <w:rPr>
+                <w:rFonts w:ascii="Roboto" w:eastAsia="Times New Roman" w:hAnsi="Roboto"/>
+                <w:sz w:val="20"/>
+                <w:szCs w:val="20"/>
+              </w:rPr>
+              <w:t xml:space="preserve">    </w:t>
+            </w:r>
+            <w:r>
+              <w:rPr>
+                <w:rFonts w:ascii="Roboto" w:eastAsia="Times New Roman" w:hAnsi="Roboto"/>
+                <w:sz w:val="20"/>
+                <w:szCs w:val="20"/>
+              </w:rPr>
+              <w:t xml:space="preserve">McCarty, S., Light, C., </w:t>
+            </w:r>
+            <w:r>
+              <w:rPr>
+                <w:rFonts w:ascii="Roboto" w:eastAsia="Times New Roman" w:hAnsi="Roboto"/>
+                <w:b/>
+                <w:bCs/>
+                <w:sz w:val="20"/>
+                <w:szCs w:val="20"/>
+              </w:rPr>
+              <w:t>Hei, Z.</w:t>
+            </w:r>
+            <w:r>
+              <w:rPr>
+                <w:rFonts w:ascii="Roboto" w:eastAsia="Times New Roman" w:hAnsi="Roboto"/>
+                <w:sz w:val="20"/>
+                <w:szCs w:val="20"/>
+              </w:rPr>
+              <w:t>, &amp; Fegley, M. (2026).</w:t>
+            </w:r>
+          </w:p>
+          <w:p>
+            <w:pPr>
+              <w:pStyle w:val="NormalWeb"/>
+              <w:spacing w:before="0" w:beforeAutospacing="0" w:after="0" w:afterAutospacing="0"/>
+              <w:rPr>
+                <w:rFonts w:ascii="Roboto" w:eastAsia="Times New Roman" w:hAnsi="Roboto"/>
+                <w:sz w:val="20"/>
+                <w:szCs w:val="20"/>
+              </w:rPr>
+            </w:pPr>
+            <w:r>
+              <w:rPr>
+                <w:rFonts w:ascii="Roboto" w:eastAsia="Times New Roman" w:hAnsi="Roboto"/>
+                <w:i/>
+                <w:iCs/>
+                <w:sz w:val="20"/>
+                <w:szCs w:val="20"/>
+              </w:rPr>
+              <w:t xml:space="preserve">FRI Peer Mentor Mindsets Guide. </w:t>
+            </w:r>
+            <w:r>
+              <w:rPr>
+                <w:rFonts w:ascii="Roboto" w:eastAsia="Times New Roman" w:hAnsi="Roboto"/>
+                <w:sz w:val="20"/>
+                <w:szCs w:val="20"/>
+              </w:rPr>
+              <w:t>Binghamton University.</w:t>
+            </w:r>
+          </w:p>
+          <w:p>
+            <w:pPr>
+              <w:pStyle w:val="NormalWeb"/>
+              <w:spacing w:before="0" w:beforeAutospacing="0" w:after="0" w:afterAutospacing="0"/>
+              <w:rPr>
+                <w:rFonts w:ascii="Roboto" w:eastAsia="Times New Roman" w:hAnsi="Roboto"/>
+                <w:sz w:val="20"/>
+                <w:szCs w:val="20"/>
+              </w:rPr>
+            </w:pPr>
+            <w:hyperlink r:id="rId15" w:history="1">
               <w:r>
                 <w:rPr>
                   <w:rStyle w:val="Hyperlink"/>
@@ -3905,13 +4079,16 @@
       </w:tr>
       <w:tr>
         <w:trPr>
-          <w:gridBefore w:val="1"/>
-          <w:wBefore w:w="34" w:type="dxa"/>
+          <w:gridBefore w:val="2"/>
+          <w:wBefore w:w="1702" w:type="dxa"/>
         </w:trPr>
         <w:tc>
           <w:tcPr>
-            <w:tcW w:w="11479" w:type="dxa"/>
-            <w:gridSpan w:val="5"/>
+            <w:tcW w:w="11251" w:type="dxa"/>
+            <w:gridSpan w:val="3"/>
+            <w:tcBorders>
+              <w:left w:val="single" w:sz="4" w:space="0" w:color="auto"/>
+            </w:tcBorders>
           </w:tcPr>
           <w:p>
             <w:pPr>
@@ -3929,13 +4106,16 @@
       </w:tr>
       <w:tr>
         <w:trPr>
-          <w:gridBefore w:val="1"/>
-          <w:wBefore w:w="34" w:type="dxa"/>
+          <w:gridBefore w:val="2"/>
+          <w:wBefore w:w="1702" w:type="dxa"/>
         </w:trPr>
         <w:tc>
           <w:tcPr>
-            <w:tcW w:w="11479" w:type="dxa"/>
-            <w:gridSpan w:val="5"/>
+            <w:tcW w:w="11251" w:type="dxa"/>
+            <w:gridSpan w:val="3"/>
+            <w:tcBorders>
+              <w:left w:val="single" w:sz="4" w:space="0" w:color="auto"/>
+            </w:tcBorders>
           </w:tcPr>
           <w:p>
             <w:pPr>
@@ -3953,7 +4133,67 @@
                 <w:sz w:val="20"/>
                 <w:szCs w:val="20"/>
               </w:rPr>
-              <w:t xml:space="preserve">McCarty, S., &amp; Hei, Z. (2025). </w:t>
+              <w:t>3.</w:t>
+            </w:r>
+            <w:r>
+              <w:rPr>
+                <w:rFonts w:ascii="Roboto" w:eastAsia="Times New Roman" w:hAnsi="Roboto"/>
+                <w:sz w:val="20"/>
+                <w:szCs w:val="20"/>
+              </w:rPr>
+              <w:t xml:space="preserve">    </w:t>
+            </w:r>
+            <w:r>
+              <w:rPr>
+                <w:rFonts w:ascii="Roboto" w:eastAsia="Times New Roman" w:hAnsi="Roboto"/>
+                <w:sz w:val="20"/>
+                <w:szCs w:val="20"/>
+              </w:rPr>
+              <w:t>McCarty, S.</w:t>
+            </w:r>
+            <w:r>
+              <w:rPr>
+                <w:rFonts w:ascii="Roboto" w:eastAsia="Times New Roman" w:hAnsi="Roboto"/>
+                <w:sz w:val="20"/>
+                <w:szCs w:val="20"/>
+              </w:rPr>
+              <w:t xml:space="preserve">, </w:t>
+            </w:r>
+            <w:r>
+              <w:rPr>
+                <w:rFonts w:ascii="Roboto" w:eastAsia="Times New Roman" w:hAnsi="Roboto"/>
+                <w:sz w:val="20"/>
+                <w:szCs w:val="20"/>
+              </w:rPr>
+              <w:t>&amp;</w:t>
+            </w:r>
+            <w:r>
+              <w:rPr>
+                <w:rFonts w:ascii="Roboto" w:eastAsia="Times New Roman" w:hAnsi="Roboto"/>
+                <w:b/>
+                <w:bCs/>
+                <w:sz w:val="20"/>
+                <w:szCs w:val="20"/>
+              </w:rPr>
+              <w:t xml:space="preserve"> Hei, Z.</w:t>
+            </w:r>
+            <w:r>
+              <w:rPr>
+                <w:rFonts w:ascii="Roboto" w:eastAsia="Times New Roman" w:hAnsi="Roboto"/>
+                <w:b/>
+                <w:bCs/>
+                <w:sz w:val="20"/>
+                <w:szCs w:val="20"/>
+              </w:rPr>
+              <w:t xml:space="preserve"> </w:t>
+            </w:r>
+            <w:r>
+              <w:rPr>
+                <w:rFonts w:ascii="Roboto" w:eastAsia="Times New Roman" w:hAnsi="Roboto"/>
+                <w:sz w:val="20"/>
+                <w:szCs w:val="20"/>
+              </w:rPr>
+              <w:t>(2025).</w:t>
             </w:r>
           </w:p>
           <w:p>
@@ -3962,25 +4202,289 @@
               <w:spacing w:before="0" w:beforeAutospacing="0" w:after="0" w:afterAutospacing="0"/>
               <w:rPr>
                 <w:rFonts w:ascii="Roboto" w:eastAsia="Times New Roman" w:hAnsi="Roboto"/>
-                <w:sz w:val="21"/>
-                <w:szCs w:val="21"/>
-              </w:rPr>
-            </w:pPr>
-            <w:r>
-              <w:rPr>
-                <w:rFonts w:ascii="Roboto" w:eastAsia="Times New Roman" w:hAnsi="Roboto"/>
-                <w:sz w:val="20"/>
-                <w:szCs w:val="20"/>
-              </w:rPr>
-              <w:t xml:space="preserve">Selected chapters. In S. McCarty (Ed.), The Quantitative Playbook for Public Health Research in R. </w:t>
-            </w:r>
-            <w:hyperlink r:id="rId15" w:history="1">
+                <w:sz w:val="20"/>
+                <w:szCs w:val="20"/>
+              </w:rPr>
+            </w:pPr>
+            <w:r>
+              <w:rPr>
+                <w:rFonts w:ascii="Roboto" w:eastAsia="Times New Roman" w:hAnsi="Roboto"/>
+                <w:sz w:val="20"/>
+                <w:szCs w:val="20"/>
+              </w:rPr>
+              <w:t>Chapter</w:t>
+            </w:r>
+            <w:r>
+              <w:rPr>
+                <w:rFonts w:ascii="Roboto" w:eastAsia="Times New Roman" w:hAnsi="Roboto"/>
+                <w:sz w:val="20"/>
+                <w:szCs w:val="20"/>
+              </w:rPr>
+              <w:t xml:space="preserve"> contributions to </w:t>
+            </w:r>
+            <w:r>
+              <w:rPr>
+                <w:rFonts w:ascii="Roboto" w:eastAsia="Times New Roman" w:hAnsi="Roboto"/>
+                <w:i/>
+                <w:iCs/>
+                <w:sz w:val="20"/>
+                <w:szCs w:val="20"/>
+              </w:rPr>
+              <w:t>The Quantitative Playbook for Public Health Research in R</w:t>
+            </w:r>
+            <w:r>
+              <w:rPr>
+                <w:rFonts w:ascii="Roboto" w:eastAsia="Times New Roman" w:hAnsi="Roboto"/>
+                <w:sz w:val="20"/>
+                <w:szCs w:val="20"/>
+              </w:rPr>
+              <w:t>, S. McCarty (Ed.).</w:t>
+            </w:r>
+          </w:p>
+          <w:p>
+            <w:pPr>
+              <w:pStyle w:val="NormalWeb"/>
+              <w:numPr>
+                <w:ilvl w:val="0"/>
+                <w:numId w:val="8"/>
+              </w:numPr>
+              <w:spacing w:before="0" w:beforeAutospacing="0" w:after="0" w:afterAutospacing="0"/>
+              <w:rPr>
+                <w:rFonts w:ascii="Roboto" w:eastAsia="Times New Roman" w:hAnsi="Roboto"/>
+                <w:sz w:val="20"/>
+                <w:szCs w:val="20"/>
+                <w:lang w:val="en-US"/>
+              </w:rPr>
+            </w:pPr>
+            <w:r>
+              <w:rPr>
+                <w:rFonts w:ascii="Roboto" w:eastAsia="Times New Roman" w:hAnsi="Roboto"/>
+                <w:sz w:val="20"/>
+                <w:szCs w:val="20"/>
+                <w:lang w:val="en-US"/>
+              </w:rPr>
+              <w:t xml:space="preserve">McCarty, S., &amp; </w:t>
+            </w:r>
+            <w:r>
+              <w:rPr>
+                <w:rFonts w:ascii="Roboto" w:eastAsia="Times New Roman" w:hAnsi="Roboto"/>
+                <w:b/>
+                <w:bCs/>
+                <w:sz w:val="20"/>
+                <w:szCs w:val="20"/>
+                <w:lang w:val="en-US"/>
+              </w:rPr>
+              <w:t>Hei, Z.</w:t>
+            </w:r>
+            <w:r>
+              <w:rPr>
+                <w:rFonts w:ascii="Roboto" w:eastAsia="Times New Roman" w:hAnsi="Roboto"/>
+                <w:sz w:val="20"/>
+                <w:szCs w:val="20"/>
+                <w:lang w:val="en-US"/>
+              </w:rPr>
+              <w:t xml:space="preserve"> “Reproducible Reports.”</w:t>
+            </w:r>
+          </w:p>
+          <w:p>
+            <w:pPr>
+              <w:pStyle w:val="NormalWeb"/>
+              <w:numPr>
+                <w:ilvl w:val="0"/>
+                <w:numId w:val="8"/>
+              </w:numPr>
+              <w:spacing w:before="0" w:beforeAutospacing="0" w:after="0" w:afterAutospacing="0"/>
+              <w:rPr>
+                <w:rFonts w:ascii="Roboto" w:eastAsia="Times New Roman" w:hAnsi="Roboto"/>
+                <w:sz w:val="20"/>
+                <w:szCs w:val="20"/>
+                <w:lang w:val="en-US"/>
+              </w:rPr>
+            </w:pPr>
+            <w:r>
+              <w:rPr>
+                <w:rFonts w:ascii="Roboto" w:eastAsia="Times New Roman" w:hAnsi="Roboto"/>
+                <w:b/>
+                <w:bCs/>
+                <w:sz w:val="20"/>
+                <w:szCs w:val="20"/>
+                <w:lang w:val="en-US"/>
+              </w:rPr>
+              <w:t>Hei, Z.</w:t>
+            </w:r>
+            <w:r>
+              <w:rPr>
+                <w:rFonts w:ascii="Roboto" w:eastAsia="Times New Roman" w:hAnsi="Roboto"/>
+                <w:sz w:val="20"/>
+                <w:szCs w:val="20"/>
+                <w:lang w:val="en-US"/>
+              </w:rPr>
+              <w:t>, &amp; McCarty, S. “Import Data Once.”</w:t>
+            </w:r>
+          </w:p>
+          <w:p>
+            <w:pPr>
+              <w:pStyle w:val="NormalWeb"/>
+              <w:numPr>
+                <w:ilvl w:val="0"/>
+                <w:numId w:val="8"/>
+              </w:numPr>
+              <w:spacing w:before="0" w:beforeAutospacing="0" w:after="0" w:afterAutospacing="0"/>
+              <w:rPr>
+                <w:rFonts w:ascii="Roboto" w:eastAsia="Times New Roman" w:hAnsi="Roboto"/>
+                <w:sz w:val="20"/>
+                <w:szCs w:val="20"/>
+                <w:lang w:val="en-US"/>
+              </w:rPr>
+            </w:pPr>
+            <w:r>
+              <w:rPr>
+                <w:rFonts w:ascii="Roboto" w:eastAsia="Times New Roman" w:hAnsi="Roboto"/>
+                <w:b/>
+                <w:bCs/>
+                <w:sz w:val="20"/>
+                <w:szCs w:val="20"/>
+                <w:lang w:val="en-US"/>
+              </w:rPr>
+              <w:t>Hei, Z.</w:t>
+            </w:r>
+            <w:r>
+              <w:rPr>
+                <w:rFonts w:ascii="Roboto" w:eastAsia="Times New Roman" w:hAnsi="Roboto"/>
+                <w:sz w:val="20"/>
+                <w:szCs w:val="20"/>
+                <w:lang w:val="en-US"/>
+              </w:rPr>
+              <w:t>, &amp; McCarty, S. “Read Me.”</w:t>
+            </w:r>
+          </w:p>
+          <w:p>
+            <w:pPr>
+              <w:pStyle w:val="NormalWeb"/>
+              <w:numPr>
+                <w:ilvl w:val="0"/>
+                <w:numId w:val="8"/>
+              </w:numPr>
+              <w:spacing w:before="0" w:beforeAutospacing="0" w:after="0" w:afterAutospacing="0"/>
+              <w:rPr>
+                <w:rFonts w:ascii="Roboto" w:eastAsia="Times New Roman" w:hAnsi="Roboto"/>
+                <w:sz w:val="20"/>
+                <w:szCs w:val="20"/>
+                <w:lang w:val="en-US"/>
+              </w:rPr>
+            </w:pPr>
+            <w:r>
+              <w:rPr>
+                <w:rFonts w:ascii="Roboto" w:eastAsia="Times New Roman" w:hAnsi="Roboto"/>
+                <w:b/>
+                <w:bCs/>
+                <w:sz w:val="20"/>
+                <w:szCs w:val="20"/>
+                <w:lang w:val="en-US"/>
+              </w:rPr>
+              <w:t>Hei, Z.</w:t>
+            </w:r>
+            <w:r>
+              <w:rPr>
+                <w:rFonts w:ascii="Roboto" w:eastAsia="Times New Roman" w:hAnsi="Roboto"/>
+                <w:sz w:val="20"/>
+                <w:szCs w:val="20"/>
+                <w:lang w:val="en-US"/>
+              </w:rPr>
+              <w:t xml:space="preserve"> “Writing Methods &amp; Results Reproducibly.”</w:t>
+            </w:r>
+          </w:p>
+          <w:p>
+            <w:pPr>
+              <w:pStyle w:val="NormalWeb"/>
+              <w:numPr>
+                <w:ilvl w:val="0"/>
+                <w:numId w:val="8"/>
+              </w:numPr>
+              <w:spacing w:before="0" w:beforeAutospacing="0" w:after="0" w:afterAutospacing="0"/>
+              <w:rPr>
+                <w:rFonts w:ascii="Roboto" w:eastAsia="Times New Roman" w:hAnsi="Roboto"/>
+                <w:sz w:val="20"/>
+                <w:szCs w:val="20"/>
+                <w:lang w:val="en-US"/>
+              </w:rPr>
+            </w:pPr>
+            <w:r>
+              <w:rPr>
+                <w:rFonts w:ascii="Roboto" w:eastAsia="Times New Roman" w:hAnsi="Roboto"/>
+                <w:b/>
+                <w:bCs/>
+                <w:sz w:val="20"/>
+                <w:szCs w:val="20"/>
+                <w:lang w:val="en-US"/>
+              </w:rPr>
+              <w:t>Hei, Z.</w:t>
+            </w:r>
+            <w:r>
+              <w:rPr>
+                <w:rFonts w:ascii="Roboto" w:eastAsia="Times New Roman" w:hAnsi="Roboto"/>
+                <w:sz w:val="20"/>
+                <w:szCs w:val="20"/>
+                <w:lang w:val="en-US"/>
+              </w:rPr>
+              <w:t xml:space="preserve"> “APA Citations &amp; References.”</w:t>
+            </w:r>
+          </w:p>
+          <w:p>
+            <w:pPr>
+              <w:pStyle w:val="NormalWeb"/>
+              <w:numPr>
+                <w:ilvl w:val="0"/>
+                <w:numId w:val="8"/>
+              </w:numPr>
+              <w:spacing w:before="0" w:beforeAutospacing="0" w:after="0" w:afterAutospacing="0"/>
+              <w:rPr>
+                <w:rFonts w:ascii="Roboto" w:eastAsia="Times New Roman" w:hAnsi="Roboto"/>
+                <w:sz w:val="20"/>
+                <w:szCs w:val="20"/>
+                <w:lang w:val="en-US"/>
+              </w:rPr>
+            </w:pPr>
+            <w:r>
+              <w:rPr>
+                <w:rFonts w:ascii="Roboto" w:eastAsia="Times New Roman" w:hAnsi="Roboto"/>
+                <w:b/>
+                <w:bCs/>
+                <w:sz w:val="20"/>
+                <w:szCs w:val="20"/>
+                <w:lang w:val="en-US"/>
+              </w:rPr>
+              <w:t>Hei, Z.</w:t>
+            </w:r>
+            <w:r>
+              <w:rPr>
+                <w:rFonts w:ascii="Roboto" w:eastAsia="Times New Roman" w:hAnsi="Roboto"/>
+                <w:sz w:val="20"/>
+                <w:szCs w:val="20"/>
+                <w:lang w:val="en-US"/>
+              </w:rPr>
+              <w:t xml:space="preserve"> “Publish Your Report to Quarto Pub.”</w:t>
+            </w:r>
+          </w:p>
+          <w:p>
+            <w:pPr>
+              <w:pStyle w:val="NormalWeb"/>
+              <w:spacing w:before="0" w:beforeAutospacing="0" w:after="0" w:afterAutospacing="0"/>
+              <w:rPr>
+                <w:rFonts w:ascii="Roboto" w:eastAsia="Times New Roman" w:hAnsi="Roboto"/>
+                <w:sz w:val="20"/>
+                <w:szCs w:val="20"/>
+                <w:lang w:val="en-US"/>
+              </w:rPr>
+            </w:pPr>
+            <w:hyperlink r:id="rId16" w:history="1">
               <w:r>
                 <w:rPr>
                   <w:rStyle w:val="Hyperlink"/>
                   <w:rFonts w:ascii="Roboto" w:eastAsia="Times New Roman" w:hAnsi="Roboto"/>
                   <w:sz w:val="20"/>
                   <w:szCs w:val="20"/>
+                  <w:lang w:val="en-US"/>
                 </w:rPr>
                 <w:t>shanemccarty.github.io/</w:t>
               </w:r>
@@ -3991,6 +4495,7 @@
                   <w:rFonts w:ascii="Roboto" w:eastAsia="Times New Roman" w:hAnsi="Roboto"/>
                   <w:sz w:val="20"/>
                   <w:szCs w:val="20"/>
+                  <w:lang w:val="en-US"/>
                 </w:rPr>
                 <w:t>FRIplaybook</w:t>
               </w:r>
@@ -4001,6 +4506,7 @@
                   <w:rFonts w:ascii="Roboto" w:eastAsia="Times New Roman" w:hAnsi="Roboto"/>
                   <w:sz w:val="20"/>
                   <w:szCs w:val="20"/>
+                  <w:lang w:val="en-US"/>
                 </w:rPr>
                 <w:t>/</w:t>
               </w:r>
@@ -4011,12 +4517,12 @@
       <w:tr>
         <w:trPr>
           <w:gridAfter w:val="2"/>
-          <w:wAfter w:w="34" w:type="dxa"/>
+          <w:wAfter w:w="1474" w:type="dxa"/>
         </w:trPr>
         <w:tc>
           <w:tcPr>
             <w:tcW w:w="11479" w:type="dxa"/>
-            <w:gridSpan w:val="4"/>
+            <w:gridSpan w:val="3"/>
           </w:tcPr>
           <w:p>
             <w:pPr>
@@ -4026,22 +4532,36 @@
                 <w:rFonts w:ascii="Roboto" w:eastAsia="Times New Roman" w:hAnsi="Roboto"/>
                 <w:b/>
                 <w:bCs/>
+                <w:color w:val="2D4239"/>
                 <w:sz w:val="32"/>
                 <w:szCs w:val="32"/>
                 <w:lang w:val="en-US"/>
               </w:rPr>
             </w:pPr>
-            <w:r>
-              <w:rPr>
-                <w:rFonts w:ascii="Roboto" w:eastAsia="Times New Roman" w:hAnsi="Roboto"/>
-                <w:b/>
-                <w:bCs/>
-                <w:color w:val="2D4239"/>
+          </w:p>
+          <w:p>
+            <w:pPr>
+              <w:pStyle w:val="NormalWeb"/>
+              <w:spacing w:before="0" w:beforeAutospacing="0" w:after="0" w:afterAutospacing="0" w:line="276" w:lineRule="auto"/>
+              <w:rPr>
+                <w:rFonts w:ascii="Roboto" w:eastAsia="Times New Roman" w:hAnsi="Roboto"/>
+                <w:b/>
+                <w:bCs/>
                 <w:sz w:val="32"/>
                 <w:szCs w:val="32"/>
                 <w:lang w:val="en-US"/>
               </w:rPr>
-              <w:lastRenderedPageBreak/>
+            </w:pPr>
+            <w:r>
+              <w:rPr>
+                <w:rFonts w:ascii="Roboto" w:eastAsia="Times New Roman" w:hAnsi="Roboto"/>
+                <w:b/>
+                <w:bCs/>
+                <w:color w:val="2D4239"/>
+                <w:sz w:val="32"/>
+                <w:szCs w:val="32"/>
+                <w:lang w:val="en-US"/>
+              </w:rPr>
               <w:t>Presentations &amp; Con</w:t>
             </w:r>
             <w:r>
@@ -4086,12 +4606,12 @@
       <w:tr>
         <w:trPr>
           <w:gridAfter w:val="2"/>
-          <w:wAfter w:w="34" w:type="dxa"/>
+          <w:wAfter w:w="1474" w:type="dxa"/>
         </w:trPr>
         <w:tc>
           <w:tcPr>
             <w:tcW w:w="11479" w:type="dxa"/>
-            <w:gridSpan w:val="4"/>
+            <w:gridSpan w:val="3"/>
           </w:tcPr>
           <w:p>
             <w:pPr>
@@ -4110,12 +4630,11 @@
       <w:tr>
         <w:trPr>
           <w:gridAfter w:val="2"/>
-          <w:wAfter w:w="34" w:type="dxa"/>
+          <w:wAfter w:w="1474" w:type="dxa"/>
         </w:trPr>
         <w:tc>
           <w:tcPr>
             <w:tcW w:w="1276" w:type="dxa"/>
-            <w:gridSpan w:val="2"/>
           </w:tcPr>
           <w:p>
             <w:pPr>
@@ -4300,7 +4819,7 @@
               </w:rPr>
               <w:t xml:space="preserve"> </w:t>
             </w:r>
-            <w:hyperlink r:id="rId16" w:history="1">
+            <w:hyperlink r:id="rId17" w:history="1">
               <w:r>
                 <w:rPr>
                   <w:rStyle w:val="Hyperlink"/>
@@ -4319,12 +4838,12 @@
       <w:tr>
         <w:trPr>
           <w:gridAfter w:val="2"/>
-          <w:wAfter w:w="34" w:type="dxa"/>
+          <w:wAfter w:w="1474" w:type="dxa"/>
         </w:trPr>
         <w:tc>
           <w:tcPr>
             <w:tcW w:w="11479" w:type="dxa"/>
-            <w:gridSpan w:val="4"/>
+            <w:gridSpan w:val="3"/>
           </w:tcPr>
           <w:p>
             <w:pPr>
@@ -4342,12 +4861,11 @@
       <w:tr>
         <w:trPr>
           <w:gridAfter w:val="2"/>
-          <w:wAfter w:w="34" w:type="dxa"/>
+          <w:wAfter w:w="1474" w:type="dxa"/>
         </w:trPr>
         <w:tc>
           <w:tcPr>
             <w:tcW w:w="1276" w:type="dxa"/>
-            <w:gridSpan w:val="2"/>
           </w:tcPr>
           <w:p>
             <w:pPr>
@@ -4514,12 +5032,12 @@
       <w:tr>
         <w:trPr>
           <w:gridAfter w:val="2"/>
-          <w:wAfter w:w="34" w:type="dxa"/>
+          <w:wAfter w:w="1474" w:type="dxa"/>
         </w:trPr>
         <w:tc>
           <w:tcPr>
             <w:tcW w:w="11479" w:type="dxa"/>
-            <w:gridSpan w:val="4"/>
+            <w:gridSpan w:val="3"/>
           </w:tcPr>
           <w:p>
             <w:pPr>
@@ -4537,12 +5055,11 @@
       <w:tr>
         <w:trPr>
           <w:gridAfter w:val="2"/>
-          <w:wAfter w:w="34" w:type="dxa"/>
+          <w:wAfter w:w="1474" w:type="dxa"/>
         </w:trPr>
         <w:tc>
           <w:tcPr>
             <w:tcW w:w="1276" w:type="dxa"/>
-            <w:gridSpan w:val="2"/>
           </w:tcPr>
           <w:p>
             <w:pPr>
@@ -4659,12 +5176,12 @@
       <w:tr>
         <w:trPr>
           <w:gridAfter w:val="2"/>
-          <w:wAfter w:w="34" w:type="dxa"/>
+          <w:wAfter w:w="1474" w:type="dxa"/>
         </w:trPr>
         <w:tc>
           <w:tcPr>
             <w:tcW w:w="11479" w:type="dxa"/>
-            <w:gridSpan w:val="4"/>
+            <w:gridSpan w:val="3"/>
           </w:tcPr>
           <w:p>
             <w:pPr>
@@ -4682,12 +5199,11 @@
       <w:tr>
         <w:trPr>
           <w:gridAfter w:val="2"/>
-          <w:wAfter w:w="34" w:type="dxa"/>
+          <w:wAfter w:w="1474" w:type="dxa"/>
         </w:trPr>
         <w:tc>
           <w:tcPr>
             <w:tcW w:w="1276" w:type="dxa"/>
-            <w:gridSpan w:val="2"/>
           </w:tcPr>
           <w:p>
             <w:pPr>
@@ -4862,12 +5378,12 @@
       <w:tr>
         <w:trPr>
           <w:gridAfter w:val="2"/>
-          <w:wAfter w:w="34" w:type="dxa"/>
+          <w:wAfter w:w="1474" w:type="dxa"/>
         </w:trPr>
         <w:tc>
           <w:tcPr>
             <w:tcW w:w="11479" w:type="dxa"/>
-            <w:gridSpan w:val="4"/>
+            <w:gridSpan w:val="3"/>
           </w:tcPr>
           <w:p>
             <w:pPr>
@@ -4951,12 +5467,12 @@
       <w:tr>
         <w:trPr>
           <w:gridAfter w:val="2"/>
-          <w:wAfter w:w="34" w:type="dxa"/>
+          <w:wAfter w:w="1474" w:type="dxa"/>
         </w:trPr>
         <w:tc>
           <w:tcPr>
             <w:tcW w:w="11479" w:type="dxa"/>
-            <w:gridSpan w:val="4"/>
+            <w:gridSpan w:val="3"/>
           </w:tcPr>
           <w:p>
             <w:pPr>
@@ -4975,12 +5491,11 @@
       <w:tr>
         <w:trPr>
           <w:gridAfter w:val="2"/>
-          <w:wAfter w:w="34" w:type="dxa"/>
+          <w:wAfter w:w="1474" w:type="dxa"/>
         </w:trPr>
         <w:tc>
           <w:tcPr>
             <w:tcW w:w="1276" w:type="dxa"/>
-            <w:gridSpan w:val="2"/>
           </w:tcPr>
           <w:p>
             <w:pPr>
@@ -5097,6 +5612,35 @@
                 <w:szCs w:val="26"/>
               </w:rPr>
               <w:t>Histopathology Thyroid Cancer Detection Using YOLO26</w:t>
+            </w:r>
+            <w:r>
+              <w:rPr>
+                <w:rFonts w:ascii="Roboto" w:hAnsi="Roboto"/>
+                <w:b/>
+                <w:bCs/>
+                <w:sz w:val="26"/>
+                <w:szCs w:val="26"/>
+              </w:rPr>
+              <w:t xml:space="preserve"> | </w:t>
+            </w:r>
+            <w:hyperlink r:id="rId18" w:history="1">
+              <w:r>
+                <w:rPr>
+                  <w:rStyle w:val="Hyperlink"/>
+                  <w:rFonts w:ascii="Roboto" w:hAnsi="Roboto" w:cs="Times New Roman"/>
+                  <w:sz w:val="20"/>
+                  <w:szCs w:val="20"/>
+                </w:rPr>
+                <w:t>Group Project</w:t>
+              </w:r>
+            </w:hyperlink>
+            <w:r>
+              <w:rPr>
+                <w:rFonts w:ascii="Times New Roman" w:hAnsi="Times New Roman" w:cs="Times New Roman"/>
+                <w:b/>
+                <w:sz w:val="24"/>
+              </w:rPr>
+              <w:t xml:space="preserve">                         </w:t>
             </w:r>
           </w:p>
           <w:p>
@@ -5192,12 +5736,12 @@
       <w:tr>
         <w:trPr>
           <w:gridAfter w:val="2"/>
-          <w:wAfter w:w="34" w:type="dxa"/>
+          <w:wAfter w:w="1474" w:type="dxa"/>
         </w:trPr>
         <w:tc>
           <w:tcPr>
             <w:tcW w:w="11479" w:type="dxa"/>
-            <w:gridSpan w:val="4"/>
+            <w:gridSpan w:val="3"/>
           </w:tcPr>
           <w:p>
             <w:pPr>
@@ -5215,12 +5759,11 @@
       <w:tr>
         <w:trPr>
           <w:gridAfter w:val="2"/>
-          <w:wAfter w:w="34" w:type="dxa"/>
+          <w:wAfter w:w="1474" w:type="dxa"/>
         </w:trPr>
         <w:tc>
           <w:tcPr>
             <w:tcW w:w="1276" w:type="dxa"/>
-            <w:gridSpan w:val="2"/>
           </w:tcPr>
           <w:p>
             <w:pPr>
@@ -5329,6 +5872,42 @@
                 <w:szCs w:val="26"/>
               </w:rPr>
               <w:t>Deep Reinforcement Learning in Board Games</w:t>
+            </w:r>
+            <w:r>
+              <w:rPr>
+                <w:rFonts w:ascii="Roboto" w:hAnsi="Roboto"/>
+                <w:b/>
+                <w:bCs/>
+                <w:sz w:val="26"/>
+                <w:szCs w:val="26"/>
+              </w:rPr>
+              <w:t xml:space="preserve"> | </w:t>
+            </w:r>
+            <w:hyperlink r:id="rId19" w:history="1">
+              <w:r>
+                <w:rPr>
+                  <w:rStyle w:val="Hyperlink"/>
+                  <w:rFonts w:ascii="Roboto" w:hAnsi="Roboto" w:cs="Times New Roman"/>
+                  <w:sz w:val="20"/>
+                  <w:szCs w:val="20"/>
+                </w:rPr>
+                <w:t>Group Project</w:t>
+              </w:r>
+            </w:hyperlink>
+            <w:r>
+              <w:rPr>
+                <w:rFonts w:ascii="Roboto" w:hAnsi="Roboto" w:cs="Times New Roman"/>
+                <w:sz w:val="20"/>
+                <w:szCs w:val="20"/>
+              </w:rPr>
+              <w:t xml:space="preserve"> </w:t>
+            </w:r>
+            <w:r>
+              <w:rPr>
+                <w:rFonts w:ascii="Times New Roman" w:hAnsi="Times New Roman" w:cs="Times New Roman"/>
+                <w:sz w:val="24"/>
+              </w:rPr>
+              <w:t xml:space="preserve">                        </w:t>
             </w:r>
           </w:p>
           <w:p>
@@ -5426,12 +6005,12 @@
       <w:tr>
         <w:trPr>
           <w:gridAfter w:val="2"/>
-          <w:wAfter w:w="34" w:type="dxa"/>
+          <w:wAfter w:w="1474" w:type="dxa"/>
         </w:trPr>
         <w:tc>
           <w:tcPr>
             <w:tcW w:w="11479" w:type="dxa"/>
-            <w:gridSpan w:val="4"/>
+            <w:gridSpan w:val="3"/>
           </w:tcPr>
           <w:p>
             <w:pPr>
@@ -5529,12 +6108,12 @@
       <w:tr>
         <w:trPr>
           <w:gridAfter w:val="2"/>
-          <w:wAfter w:w="34" w:type="dxa"/>
+          <w:wAfter w:w="1474" w:type="dxa"/>
         </w:trPr>
         <w:tc>
           <w:tcPr>
             <w:tcW w:w="11479" w:type="dxa"/>
-            <w:gridSpan w:val="4"/>
+            <w:gridSpan w:val="3"/>
           </w:tcPr>
           <w:p>
             <w:pPr>
@@ -5553,12 +6132,11 @@
       <w:tr>
         <w:trPr>
           <w:gridAfter w:val="2"/>
-          <w:wAfter w:w="34" w:type="dxa"/>
+          <w:wAfter w:w="1474" w:type="dxa"/>
         </w:trPr>
         <w:tc>
           <w:tcPr>
             <w:tcW w:w="1276" w:type="dxa"/>
-            <w:gridSpan w:val="2"/>
           </w:tcPr>
           <w:p>
             <w:pPr>
@@ -5742,6 +6320,7 @@
                 <w:szCs w:val="20"/>
                 <w:lang w:eastAsia="zh-TW"/>
               </w:rPr>
+              <w:lastRenderedPageBreak/>
               <w:t>Year-long research stipend supporting transcriptomic biomarker discovery and validation in chemo-immunotherapy with Dr. Nancy Guo.</w:t>
             </w:r>
           </w:p>
@@ -5750,12 +6329,12 @@
       <w:tr>
         <w:trPr>
           <w:gridAfter w:val="2"/>
-          <w:wAfter w:w="34" w:type="dxa"/>
+          <w:wAfter w:w="1474" w:type="dxa"/>
         </w:trPr>
         <w:tc>
           <w:tcPr>
             <w:tcW w:w="11479" w:type="dxa"/>
-            <w:gridSpan w:val="4"/>
+            <w:gridSpan w:val="3"/>
           </w:tcPr>
           <w:p>
             <w:pPr>
@@ -5773,12 +6352,11 @@
       <w:tr>
         <w:trPr>
           <w:gridAfter w:val="2"/>
-          <w:wAfter w:w="34" w:type="dxa"/>
+          <w:wAfter w:w="1474" w:type="dxa"/>
         </w:trPr>
         <w:tc>
           <w:tcPr>
             <w:tcW w:w="1276" w:type="dxa"/>
-            <w:gridSpan w:val="2"/>
           </w:tcPr>
           <w:p>
             <w:pPr>
@@ -5797,7 +6375,7 @@
                 <w:sz w:val="20"/>
                 <w:szCs w:val="20"/>
               </w:rPr>
-              <w:t>FEB 2026</w:t>
+              <w:t>SUMMER 2026</w:t>
             </w:r>
           </w:p>
         </w:tc>
@@ -5846,7 +6424,7 @@
                 <w:sz w:val="26"/>
                 <w:szCs w:val="26"/>
               </w:rPr>
-              <w:t>Pi Mu Epsilon</w:t>
+              <w:t>Fleishman Internship Funding Award</w:t>
             </w:r>
           </w:p>
           <w:p>
@@ -5873,178 +6451,6 @@
                 <w:szCs w:val="21"/>
                 <w:lang w:eastAsia="zh-TW"/>
               </w:rPr>
-              <w:t>National Mathematics Honor Society</w:t>
-            </w:r>
-          </w:p>
-        </w:tc>
-      </w:tr>
-      <w:tr>
-        <w:trPr>
-          <w:gridAfter w:val="2"/>
-          <w:wAfter w:w="34" w:type="dxa"/>
-        </w:trPr>
-        <w:tc>
-          <w:tcPr>
-            <w:tcW w:w="11479" w:type="dxa"/>
-            <w:gridSpan w:val="4"/>
-          </w:tcPr>
-          <w:p>
-            <w:pPr>
-              <w:pStyle w:val="NormalWeb"/>
-              <w:spacing w:before="0" w:beforeAutospacing="0" w:after="0" w:afterAutospacing="0"/>
-              <w:rPr>
-                <w:rFonts w:ascii="Roboto" w:eastAsia="Times New Roman" w:hAnsi="Roboto"/>
-                <w:sz w:val="22"/>
-                <w:szCs w:val="22"/>
-                <w:lang w:val="en-US"/>
-              </w:rPr>
-            </w:pPr>
-          </w:p>
-        </w:tc>
-      </w:tr>
-      <w:tr>
-        <w:trPr>
-          <w:gridAfter w:val="2"/>
-          <w:wAfter w:w="34" w:type="dxa"/>
-        </w:trPr>
-        <w:tc>
-          <w:tcPr>
-            <w:tcW w:w="1276" w:type="dxa"/>
-            <w:gridSpan w:val="2"/>
-          </w:tcPr>
-          <w:p>
-            <w:pPr>
-              <w:pStyle w:val="NormalWeb"/>
-              <w:spacing w:before="0" w:beforeAutospacing="0" w:after="0" w:afterAutospacing="0"/>
-              <w:rPr>
-                <w:rFonts w:ascii="Roboto" w:eastAsia="Times New Roman" w:hAnsi="Roboto"/>
-                <w:sz w:val="20"/>
-                <w:szCs w:val="20"/>
-                <w:lang w:val="en-US"/>
-              </w:rPr>
-            </w:pPr>
-            <w:r>
-              <w:rPr>
-                <w:rFonts w:ascii="Roboto" w:hAnsi="Roboto" w:cs="Times New Roman (Body CS)"/>
-                <w:sz w:val="20"/>
-                <w:szCs w:val="20"/>
-              </w:rPr>
-              <w:t>FALL</w:t>
-            </w:r>
-            <w:r>
-              <w:rPr>
-                <w:rFonts w:ascii="Roboto" w:hAnsi="Roboto" w:cs="Times New Roman (Body CS)"/>
-                <w:sz w:val="20"/>
-                <w:szCs w:val="20"/>
-              </w:rPr>
-              <w:t xml:space="preserve"> 20</w:t>
-            </w:r>
-            <w:r>
-              <w:rPr>
-                <w:rFonts w:ascii="Roboto" w:hAnsi="Roboto" w:cs="Times New Roman (Body CS)"/>
-                <w:sz w:val="20"/>
-                <w:szCs w:val="20"/>
-              </w:rPr>
-              <w:t>2</w:t>
-            </w:r>
-            <w:r>
-              <w:rPr>
-                <w:rFonts w:ascii="Roboto" w:hAnsi="Roboto" w:cs="Times New Roman (Body CS)"/>
-                <w:sz w:val="20"/>
-                <w:szCs w:val="20"/>
-              </w:rPr>
-              <w:t>3</w:t>
-            </w:r>
-            <w:r>
-              <w:rPr>
-                <w:rFonts w:ascii="Roboto" w:hAnsi="Roboto" w:cs="Times New Roman (Body CS)"/>
-                <w:sz w:val="20"/>
-                <w:szCs w:val="20"/>
-              </w:rPr>
-              <w:t xml:space="preserve"> - </w:t>
-            </w:r>
-            <w:r>
-              <w:rPr>
-                <w:rFonts w:ascii="Roboto" w:hAnsi="Roboto" w:cs="Times New Roman (Body CS)"/>
-                <w:sz w:val="20"/>
-                <w:szCs w:val="20"/>
-              </w:rPr>
-              <w:t>PRESENT</w:t>
-            </w:r>
-          </w:p>
-        </w:tc>
-        <w:tc>
-          <w:tcPr>
-            <w:tcW w:w="426" w:type="dxa"/>
-            <w:tcBorders>
-              <w:right w:val="single" w:sz="4" w:space="0" w:color="000000"/>
-            </w:tcBorders>
-          </w:tcPr>
-          <w:p>
-            <w:pPr>
-              <w:pStyle w:val="NormalWeb"/>
-              <w:spacing w:before="0" w:beforeAutospacing="0" w:after="0" w:afterAutospacing="0"/>
-              <w:rPr>
-                <w:rFonts w:ascii="Lora" w:eastAsia="Times New Roman" w:hAnsi="Lora"/>
-                <w:sz w:val="21"/>
-                <w:szCs w:val="21"/>
-                <w:lang w:val="en-US"/>
-              </w:rPr>
-            </w:pPr>
-          </w:p>
-        </w:tc>
-        <w:tc>
-          <w:tcPr>
-            <w:tcW w:w="9777" w:type="dxa"/>
-            <w:tcBorders>
-              <w:left w:val="single" w:sz="4" w:space="0" w:color="000000"/>
-            </w:tcBorders>
-          </w:tcPr>
-          <w:p>
-            <w:pPr>
-              <w:rPr>
-                <w:rFonts w:ascii="Roboto" w:hAnsi="Roboto"/>
-                <w:b/>
-                <w:bCs/>
-                <w:sz w:val="26"/>
-                <w:szCs w:val="26"/>
-              </w:rPr>
-            </w:pPr>
-            <w:r>
-              <w:rPr>
-                <w:rFonts w:ascii="Roboto" w:hAnsi="Roboto"/>
-                <w:b/>
-                <w:bCs/>
-                <w:sz w:val="26"/>
-                <w:szCs w:val="26"/>
-              </w:rPr>
-              <w:t>Harpur College Dean’s List</w:t>
-            </w:r>
-          </w:p>
-          <w:p>
-            <w:pPr>
-              <w:rPr>
-                <w:rFonts w:ascii="Lora" w:eastAsia="Times New Roman" w:hAnsi="Lora"/>
-                <w:b/>
-                <w:i/>
-                <w:iCs/>
-                <w:color w:val="2D4239"/>
-                <w:sz w:val="21"/>
-                <w:szCs w:val="21"/>
-                <w:lang w:eastAsia="zh-TW"/>
-              </w:rPr>
-            </w:pPr>
-            <w:r>
-              <w:rPr>
-                <w:rFonts w:ascii="Lora" w:eastAsia="Times New Roman" w:hAnsi="Lora"/>
-                <w:b/>
-                <w:i/>
-                <w:iCs/>
-                <w:color w:val="2D4239"/>
-                <w:sz w:val="21"/>
-                <w:szCs w:val="21"/>
-                <w:lang w:eastAsia="zh-TW"/>
-              </w:rPr>
               <w:t>Binghamton University</w:t>
             </w:r>
           </w:p>
@@ -6053,8 +6459,6 @@
               <w:rPr>
                 <w:rFonts w:ascii="Lora" w:eastAsia="Times New Roman" w:hAnsi="Lora"/>
                 <w:b/>
-                <w:i/>
-                <w:iCs/>
                 <w:color w:val="2D4239"/>
                 <w:sz w:val="21"/>
                 <w:szCs w:val="21"/>
@@ -6088,17 +6492,7 @@
                 <w:szCs w:val="20"/>
                 <w:lang w:eastAsia="zh-TW"/>
               </w:rPr>
-              <w:t>Named to the Dean’s List every semester attended</w:t>
-            </w:r>
-            <w:r>
-              <w:rPr>
-                <w:rFonts w:ascii="Roboto" w:eastAsia="Times New Roman" w:hAnsi="Roboto"/>
-                <w:bCs/>
-                <w:sz w:val="20"/>
-                <w:szCs w:val="20"/>
-                <w:lang w:eastAsia="zh-TW"/>
-              </w:rPr>
-              <w:t>.</w:t>
+              <w:t>Awarded summer internship funding to support a quantitative research internship with the First-year Research Immersion (FRI) program.</w:t>
             </w:r>
           </w:p>
         </w:tc>
@@ -6106,12 +6500,12 @@
       <w:tr>
         <w:trPr>
           <w:gridAfter w:val="2"/>
-          <w:wAfter w:w="34" w:type="dxa"/>
+          <w:wAfter w:w="1474" w:type="dxa"/>
         </w:trPr>
         <w:tc>
           <w:tcPr>
             <w:tcW w:w="11479" w:type="dxa"/>
-            <w:gridSpan w:val="4"/>
+            <w:gridSpan w:val="3"/>
           </w:tcPr>
           <w:p>
             <w:pPr>
@@ -6129,12 +6523,11 @@
       <w:tr>
         <w:trPr>
           <w:gridAfter w:val="2"/>
-          <w:wAfter w:w="34" w:type="dxa"/>
+          <w:wAfter w:w="1474" w:type="dxa"/>
         </w:trPr>
         <w:tc>
           <w:tcPr>
             <w:tcW w:w="1276" w:type="dxa"/>
-            <w:gridSpan w:val="2"/>
           </w:tcPr>
           <w:p>
             <w:pPr>
@@ -6153,7 +6546,7 @@
                 <w:sz w:val="20"/>
                 <w:szCs w:val="20"/>
               </w:rPr>
-              <w:t>EACH SEMESTER</w:t>
+              <w:t>FEB 2026</w:t>
             </w:r>
           </w:p>
         </w:tc>
@@ -6202,7 +6595,7 @@
                 <w:sz w:val="26"/>
                 <w:szCs w:val="26"/>
               </w:rPr>
-              <w:t>Provost’s Promise Scholarship</w:t>
+              <w:t>Pi Mu Epsilon</w:t>
             </w:r>
           </w:p>
           <w:p>
@@ -6229,6 +6622,169 @@
                 <w:szCs w:val="21"/>
                 <w:lang w:eastAsia="zh-TW"/>
               </w:rPr>
+              <w:t>National Mathematics Honor Society</w:t>
+            </w:r>
+          </w:p>
+        </w:tc>
+      </w:tr>
+      <w:tr>
+        <w:trPr>
+          <w:gridAfter w:val="2"/>
+          <w:wAfter w:w="1474" w:type="dxa"/>
+        </w:trPr>
+        <w:tc>
+          <w:tcPr>
+            <w:tcW w:w="11479" w:type="dxa"/>
+            <w:gridSpan w:val="3"/>
+          </w:tcPr>
+          <w:p>
+            <w:pPr>
+              <w:pStyle w:val="NormalWeb"/>
+              <w:spacing w:before="0" w:beforeAutospacing="0" w:after="0" w:afterAutospacing="0"/>
+              <w:rPr>
+                <w:rFonts w:ascii="Roboto" w:eastAsia="Times New Roman" w:hAnsi="Roboto"/>
+                <w:sz w:val="22"/>
+                <w:szCs w:val="22"/>
+                <w:lang w:val="en-US"/>
+              </w:rPr>
+            </w:pPr>
+          </w:p>
+        </w:tc>
+      </w:tr>
+      <w:tr>
+        <w:trPr>
+          <w:gridAfter w:val="2"/>
+          <w:wAfter w:w="1474" w:type="dxa"/>
+        </w:trPr>
+        <w:tc>
+          <w:tcPr>
+            <w:tcW w:w="1276" w:type="dxa"/>
+          </w:tcPr>
+          <w:p>
+            <w:pPr>
+              <w:pStyle w:val="NormalWeb"/>
+              <w:spacing w:before="0" w:beforeAutospacing="0" w:after="0" w:afterAutospacing="0"/>
+              <w:rPr>
+                <w:rFonts w:ascii="Roboto" w:eastAsia="Times New Roman" w:hAnsi="Roboto"/>
+                <w:sz w:val="20"/>
+                <w:szCs w:val="20"/>
+                <w:lang w:val="en-US"/>
+              </w:rPr>
+            </w:pPr>
+            <w:r>
+              <w:rPr>
+                <w:rFonts w:ascii="Roboto" w:hAnsi="Roboto" w:cs="Times New Roman (Body CS)"/>
+                <w:sz w:val="20"/>
+                <w:szCs w:val="20"/>
+              </w:rPr>
+              <w:t>FALL</w:t>
+            </w:r>
+            <w:r>
+              <w:rPr>
+                <w:rFonts w:ascii="Roboto" w:hAnsi="Roboto" w:cs="Times New Roman (Body CS)"/>
+                <w:sz w:val="20"/>
+                <w:szCs w:val="20"/>
+              </w:rPr>
+              <w:t xml:space="preserve"> 20</w:t>
+            </w:r>
+            <w:r>
+              <w:rPr>
+                <w:rFonts w:ascii="Roboto" w:hAnsi="Roboto" w:cs="Times New Roman (Body CS)"/>
+                <w:sz w:val="20"/>
+                <w:szCs w:val="20"/>
+              </w:rPr>
+              <w:t>23</w:t>
+            </w:r>
+            <w:r>
+              <w:rPr>
+                <w:rFonts w:ascii="Roboto" w:hAnsi="Roboto" w:cs="Times New Roman (Body CS)"/>
+                <w:sz w:val="20"/>
+                <w:szCs w:val="20"/>
+              </w:rPr>
+              <w:t xml:space="preserve"> - </w:t>
+            </w:r>
+            <w:r>
+              <w:rPr>
+                <w:rFonts w:ascii="Roboto" w:hAnsi="Roboto" w:cs="Times New Roman (Body CS)"/>
+                <w:sz w:val="20"/>
+                <w:szCs w:val="20"/>
+              </w:rPr>
+              <w:t>PRESENT</w:t>
+            </w:r>
+          </w:p>
+        </w:tc>
+        <w:tc>
+          <w:tcPr>
+            <w:tcW w:w="426" w:type="dxa"/>
+            <w:tcBorders>
+              <w:right w:val="single" w:sz="4" w:space="0" w:color="000000"/>
+            </w:tcBorders>
+          </w:tcPr>
+          <w:p>
+            <w:pPr>
+              <w:pStyle w:val="NormalWeb"/>
+              <w:spacing w:before="0" w:beforeAutospacing="0" w:after="0" w:afterAutospacing="0"/>
+              <w:rPr>
+                <w:rFonts w:ascii="Lora" w:eastAsia="Times New Roman" w:hAnsi="Lora"/>
+                <w:sz w:val="21"/>
+                <w:szCs w:val="21"/>
+                <w:lang w:val="en-US"/>
+              </w:rPr>
+            </w:pPr>
+          </w:p>
+        </w:tc>
+        <w:tc>
+          <w:tcPr>
+            <w:tcW w:w="9777" w:type="dxa"/>
+            <w:tcBorders>
+              <w:left w:val="single" w:sz="4" w:space="0" w:color="000000"/>
+            </w:tcBorders>
+          </w:tcPr>
+          <w:p>
+            <w:pPr>
+              <w:rPr>
+                <w:rFonts w:ascii="Roboto" w:hAnsi="Roboto"/>
+                <w:b/>
+                <w:bCs/>
+                <w:sz w:val="26"/>
+                <w:szCs w:val="26"/>
+              </w:rPr>
+            </w:pPr>
+            <w:r>
+              <w:rPr>
+                <w:rFonts w:ascii="Roboto" w:hAnsi="Roboto"/>
+                <w:b/>
+                <w:bCs/>
+                <w:sz w:val="26"/>
+                <w:szCs w:val="26"/>
+              </w:rPr>
+              <w:t>Harpur College Dean’s List</w:t>
+            </w:r>
+          </w:p>
+          <w:p>
+            <w:pPr>
+              <w:rPr>
+                <w:rFonts w:ascii="Lora" w:eastAsia="Times New Roman" w:hAnsi="Lora"/>
+                <w:b/>
+                <w:i/>
+                <w:iCs/>
+                <w:color w:val="2D4239"/>
+                <w:sz w:val="21"/>
+                <w:szCs w:val="21"/>
+                <w:lang w:eastAsia="zh-TW"/>
+              </w:rPr>
+            </w:pPr>
+            <w:r>
+              <w:rPr>
+                <w:rFonts w:ascii="Lora" w:eastAsia="Times New Roman" w:hAnsi="Lora"/>
+                <w:b/>
+                <w:i/>
+                <w:iCs/>
+                <w:color w:val="2D4239"/>
+                <w:sz w:val="21"/>
+                <w:szCs w:val="21"/>
+                <w:lang w:eastAsia="zh-TW"/>
+              </w:rPr>
               <w:t>Binghamton University</w:t>
             </w:r>
           </w:p>
@@ -6237,6 +6793,8 @@
               <w:rPr>
                 <w:rFonts w:ascii="Lora" w:eastAsia="Times New Roman" w:hAnsi="Lora"/>
                 <w:b/>
+                <w:i/>
+                <w:iCs/>
                 <w:color w:val="2D4239"/>
                 <w:sz w:val="21"/>
                 <w:szCs w:val="21"/>
@@ -6270,7 +6828,7 @@
                 <w:szCs w:val="20"/>
                 <w:lang w:eastAsia="zh-TW"/>
               </w:rPr>
-              <w:t>Recipient of renewable financial support each semester throughout undergraduate study</w:t>
+              <w:t>Named to the Dean’s List every semester attended</w:t>
             </w:r>
             <w:r>
               <w:rPr>
@@ -6288,91 +6846,34 @@
       <w:tr>
         <w:trPr>
           <w:gridAfter w:val="2"/>
-          <w:wAfter w:w="34" w:type="dxa"/>
+          <w:wAfter w:w="1474" w:type="dxa"/>
         </w:trPr>
         <w:tc>
           <w:tcPr>
             <w:tcW w:w="11479" w:type="dxa"/>
-            <w:gridSpan w:val="4"/>
+            <w:gridSpan w:val="3"/>
           </w:tcPr>
           <w:p>
             <w:pPr>
               <w:pStyle w:val="NormalWeb"/>
               <w:spacing w:before="0" w:beforeAutospacing="0" w:after="0" w:afterAutospacing="0"/>
               <w:rPr>
-                <w:rFonts w:ascii="Roboto" w:eastAsia="Times New Roman" w:hAnsi="Roboto"/>
-                <w:b/>
-                <w:bCs/>
-                <w:color w:val="2D4239"/>
-                <w:sz w:val="32"/>
-                <w:szCs w:val="32"/>
-                <w:lang w:val="en-US"/>
-              </w:rPr>
-            </w:pPr>
-          </w:p>
-          <w:p>
-            <w:pPr>
-              <w:pStyle w:val="NormalWeb"/>
-              <w:spacing w:before="0" w:beforeAutospacing="0" w:after="0" w:afterAutospacing="0"/>
-              <w:rPr>
-                <w:rFonts w:ascii="Roboto" w:eastAsia="Times New Roman" w:hAnsi="Roboto"/>
-                <w:b/>
-                <w:bCs/>
-                <w:color w:val="2D4239"/>
-                <w:sz w:val="32"/>
-                <w:szCs w:val="32"/>
-                <w:lang w:val="en-US"/>
-              </w:rPr>
-            </w:pPr>
-          </w:p>
-          <w:p>
-            <w:pPr>
-              <w:pStyle w:val="NormalWeb"/>
-              <w:spacing w:before="0" w:beforeAutospacing="0" w:after="0" w:afterAutospacing="0"/>
-              <w:rPr>
-                <w:rFonts w:ascii="Roboto" w:eastAsia="Times New Roman" w:hAnsi="Roboto"/>
-                <w:color w:val="2D4239"/>
-                <w:sz w:val="28"/>
-                <w:szCs w:val="28"/>
-                <w:lang w:val="en-US"/>
-              </w:rPr>
-            </w:pPr>
-            <w:r>
-              <w:rPr>
-                <w:rFonts w:ascii="Roboto" w:eastAsia="Times New Roman" w:hAnsi="Roboto"/>
-                <w:b/>
-                <w:bCs/>
-                <w:color w:val="2D4239"/>
-                <w:sz w:val="32"/>
-                <w:szCs w:val="32"/>
-                <w:lang w:val="en-US"/>
-              </w:rPr>
-              <w:t>Technical</w:t>
-            </w:r>
-            <w:r>
-              <w:rPr>
-                <w:rFonts w:ascii="Roboto" w:eastAsia="Times New Roman" w:hAnsi="Roboto"/>
-                <w:b/>
-                <w:bCs/>
-                <w:color w:val="2D4239"/>
-                <w:sz w:val="32"/>
-                <w:szCs w:val="32"/>
-                <w:lang w:val="en-US"/>
-              </w:rPr>
-              <w:t xml:space="preserve"> Skills</w:t>
-            </w:r>
+                <w:rFonts w:ascii="Lora" w:eastAsia="Times New Roman" w:hAnsi="Lora"/>
+                <w:sz w:val="22"/>
+                <w:szCs w:val="22"/>
+              </w:rPr>
+            </w:pPr>
           </w:p>
         </w:tc>
       </w:tr>
       <w:tr>
         <w:trPr>
           <w:gridAfter w:val="2"/>
-          <w:wAfter w:w="34" w:type="dxa"/>
+          <w:wAfter w:w="1474" w:type="dxa"/>
         </w:trPr>
         <w:tc>
           <w:tcPr>
-            <w:tcW w:w="11479" w:type="dxa"/>
-            <w:gridSpan w:val="4"/>
+            <w:tcW w:w="1276" w:type="dxa"/>
           </w:tcPr>
           <w:p>
             <w:pPr>
@@ -6380,250 +6881,224 @@
               <w:spacing w:before="0" w:beforeAutospacing="0" w:after="0" w:afterAutospacing="0"/>
               <w:rPr>
                 <w:rFonts w:ascii="Roboto" w:eastAsia="Times New Roman" w:hAnsi="Roboto"/>
-                <w:b/>
-                <w:bCs/>
                 <w:sz w:val="20"/>
                 <w:szCs w:val="20"/>
                 <w:lang w:val="en-US"/>
               </w:rPr>
             </w:pPr>
+            <w:r>
+              <w:rPr>
+                <w:rFonts w:ascii="Roboto" w:hAnsi="Roboto" w:cs="Times New Roman (Body CS)"/>
+                <w:sz w:val="20"/>
+                <w:szCs w:val="20"/>
+              </w:rPr>
+              <w:t>EACH SEMESTER</w:t>
+            </w:r>
+          </w:p>
+        </w:tc>
+        <w:tc>
+          <w:tcPr>
+            <w:tcW w:w="426" w:type="dxa"/>
+            <w:tcBorders>
+              <w:right w:val="single" w:sz="4" w:space="0" w:color="000000"/>
+            </w:tcBorders>
+          </w:tcPr>
+          <w:p>
+            <w:pPr>
+              <w:pStyle w:val="NormalWeb"/>
+              <w:spacing w:before="0" w:beforeAutospacing="0" w:after="0" w:afterAutospacing="0"/>
+              <w:rPr>
+                <w:rFonts w:ascii="Lora" w:eastAsia="Times New Roman" w:hAnsi="Lora"/>
+                <w:sz w:val="21"/>
+                <w:szCs w:val="21"/>
+                <w:lang w:val="en-US"/>
+              </w:rPr>
+            </w:pPr>
+          </w:p>
+        </w:tc>
+        <w:tc>
+          <w:tcPr>
+            <w:tcW w:w="9777" w:type="dxa"/>
+            <w:tcBorders>
+              <w:left w:val="single" w:sz="4" w:space="0" w:color="000000"/>
+            </w:tcBorders>
+          </w:tcPr>
+          <w:p>
+            <w:pPr>
+              <w:rPr>
+                <w:rFonts w:ascii="Roboto" w:hAnsi="Roboto"/>
+                <w:b/>
+                <w:bCs/>
+                <w:sz w:val="26"/>
+                <w:szCs w:val="26"/>
+              </w:rPr>
+            </w:pPr>
+            <w:r>
+              <w:rPr>
+                <w:rFonts w:ascii="Roboto" w:hAnsi="Roboto"/>
+                <w:b/>
+                <w:bCs/>
+                <w:sz w:val="26"/>
+                <w:szCs w:val="26"/>
+              </w:rPr>
+              <w:t>Provost’s Promise Scholarship</w:t>
+            </w:r>
+          </w:p>
+          <w:p>
+            <w:pPr>
+              <w:rPr>
+                <w:rFonts w:ascii="Lora" w:eastAsia="Times New Roman" w:hAnsi="Lora"/>
+                <w:b/>
+                <w:i/>
+                <w:iCs/>
+                <w:color w:val="2D4239"/>
+                <w:sz w:val="21"/>
+                <w:szCs w:val="21"/>
+                <w:lang w:eastAsia="zh-TW"/>
+              </w:rPr>
+            </w:pPr>
+            <w:r>
+              <w:rPr>
+                <w:rFonts w:ascii="Lora" w:eastAsia="Times New Roman" w:hAnsi="Lora"/>
+                <w:b/>
+                <w:i/>
+                <w:iCs/>
+                <w:color w:val="2D4239"/>
+                <w:sz w:val="21"/>
+                <w:szCs w:val="21"/>
+                <w:lang w:eastAsia="zh-TW"/>
+              </w:rPr>
+              <w:t>Binghamton University</w:t>
+            </w:r>
+          </w:p>
+          <w:p>
+            <w:pPr>
+              <w:rPr>
+                <w:rFonts w:ascii="Lora" w:eastAsia="Times New Roman" w:hAnsi="Lora"/>
+                <w:b/>
+                <w:color w:val="2D4239"/>
+                <w:sz w:val="21"/>
+                <w:szCs w:val="21"/>
+                <w:lang w:eastAsia="zh-TW"/>
+              </w:rPr>
+            </w:pPr>
+          </w:p>
+          <w:p>
+            <w:pPr>
+              <w:pStyle w:val="ListParagraph"/>
+              <w:numPr>
+                <w:ilvl w:val="0"/>
+                <w:numId w:val="1"/>
+              </w:numPr>
+              <w:spacing w:after="80"/>
+              <w:ind w:left="357" w:right="567" w:hanging="357"/>
+              <w:contextualSpacing w:val="0"/>
+              <w:rPr>
+                <w:rFonts w:ascii="Roboto" w:eastAsia="Times New Roman" w:hAnsi="Roboto"/>
+                <w:bCs/>
+                <w:sz w:val="20"/>
+                <w:szCs w:val="20"/>
+                <w:lang w:eastAsia="zh-TW"/>
+              </w:rPr>
+            </w:pPr>
+            <w:r>
+              <w:rPr>
+                <w:rFonts w:ascii="Roboto" w:eastAsia="Times New Roman" w:hAnsi="Roboto"/>
+                <w:bCs/>
+                <w:sz w:val="20"/>
+                <w:szCs w:val="20"/>
+                <w:lang w:eastAsia="zh-TW"/>
+              </w:rPr>
+              <w:t>Recipient of renewable financial support each semester throughout undergraduate study</w:t>
+            </w:r>
+            <w:r>
+              <w:rPr>
+                <w:rFonts w:ascii="Roboto" w:eastAsia="Times New Roman" w:hAnsi="Roboto"/>
+                <w:bCs/>
+                <w:sz w:val="20"/>
+                <w:szCs w:val="20"/>
+                <w:lang w:eastAsia="zh-TW"/>
+              </w:rPr>
+              <w:t>.</w:t>
+            </w:r>
           </w:p>
         </w:tc>
       </w:tr>
       <w:tr>
         <w:trPr>
           <w:gridAfter w:val="2"/>
-          <w:wAfter w:w="34" w:type="dxa"/>
+          <w:wAfter w:w="1474" w:type="dxa"/>
         </w:trPr>
         <w:tc>
           <w:tcPr>
             <w:tcW w:w="11479" w:type="dxa"/>
-            <w:gridSpan w:val="4"/>
+            <w:gridSpan w:val="3"/>
           </w:tcPr>
           <w:p>
             <w:pPr>
               <w:pStyle w:val="NormalWeb"/>
               <w:spacing w:before="0" w:beforeAutospacing="0" w:after="0" w:afterAutospacing="0"/>
-              <w:ind w:left="79"/>
-              <w:rPr>
-                <w:rFonts w:ascii="Roboto" w:eastAsia="Times New Roman" w:hAnsi="Roboto"/>
-                <w:sz w:val="20"/>
-                <w:szCs w:val="20"/>
-              </w:rPr>
-            </w:pPr>
-            <w:r>
-              <w:rPr>
-                <w:rFonts w:ascii="Roboto" w:eastAsia="Times New Roman" w:hAnsi="Roboto"/>
-                <w:b/>
-                <w:bCs/>
-                <w:sz w:val="20"/>
-                <w:szCs w:val="20"/>
-              </w:rPr>
-              <w:t>Programming</w:t>
-            </w:r>
-            <w:r>
-              <w:rPr>
-                <w:rFonts w:ascii="Roboto" w:eastAsia="Times New Roman" w:hAnsi="Roboto"/>
-                <w:sz w:val="20"/>
-                <w:szCs w:val="20"/>
-              </w:rPr>
-              <w:t>: R (</w:t>
-            </w:r>
-            <w:proofErr w:type="spellStart"/>
-            <w:r>
-              <w:rPr>
-                <w:rFonts w:ascii="Roboto" w:eastAsia="Times New Roman" w:hAnsi="Roboto"/>
-                <w:sz w:val="20"/>
-                <w:szCs w:val="20"/>
-              </w:rPr>
-              <w:t>tidyverse</w:t>
-            </w:r>
-            <w:proofErr w:type="spellEnd"/>
-            <w:r>
-              <w:rPr>
-                <w:rFonts w:ascii="Roboto" w:eastAsia="Times New Roman" w:hAnsi="Roboto"/>
-                <w:sz w:val="20"/>
-                <w:szCs w:val="20"/>
-              </w:rPr>
-              <w:t xml:space="preserve">, </w:t>
-            </w:r>
-            <w:proofErr w:type="spellStart"/>
-            <w:r>
-              <w:rPr>
-                <w:rFonts w:ascii="Roboto" w:eastAsia="Times New Roman" w:hAnsi="Roboto"/>
-                <w:sz w:val="20"/>
-                <w:szCs w:val="20"/>
-              </w:rPr>
-              <w:t>tidymodels</w:t>
-            </w:r>
-            <w:proofErr w:type="spellEnd"/>
-            <w:r>
-              <w:rPr>
-                <w:rFonts w:ascii="Roboto" w:eastAsia="Times New Roman" w:hAnsi="Roboto"/>
-                <w:sz w:val="20"/>
-                <w:szCs w:val="20"/>
-              </w:rPr>
-              <w:t>, caret</w:t>
-            </w:r>
-            <w:r>
-              <w:rPr>
-                <w:rFonts w:ascii="Roboto" w:eastAsia="Times New Roman" w:hAnsi="Roboto"/>
-                <w:sz w:val="20"/>
-                <w:szCs w:val="20"/>
-              </w:rPr>
-              <w:t xml:space="preserve">), </w:t>
-            </w:r>
-            <w:r>
-              <w:rPr>
-                <w:rFonts w:ascii="Roboto" w:eastAsia="Times New Roman" w:hAnsi="Roboto"/>
-                <w:sz w:val="20"/>
-                <w:szCs w:val="20"/>
-              </w:rPr>
-              <w:t xml:space="preserve">Python (Pandas, NumPy, scikit-learn, </w:t>
-            </w:r>
-            <w:proofErr w:type="spellStart"/>
-            <w:r>
-              <w:rPr>
-                <w:rFonts w:ascii="Roboto" w:eastAsia="Times New Roman" w:hAnsi="Roboto"/>
-                <w:sz w:val="20"/>
-                <w:szCs w:val="20"/>
-              </w:rPr>
-              <w:t>PyTorch</w:t>
-            </w:r>
-            <w:proofErr w:type="spellEnd"/>
-            <w:r>
-              <w:rPr>
-                <w:rFonts w:ascii="Roboto" w:eastAsia="Times New Roman" w:hAnsi="Roboto"/>
-                <w:sz w:val="20"/>
-                <w:szCs w:val="20"/>
-              </w:rPr>
-              <w:t>), SPSS</w:t>
-            </w:r>
-            <w:r>
-              <w:rPr>
-                <w:rFonts w:ascii="Roboto" w:eastAsia="Times New Roman" w:hAnsi="Roboto"/>
-                <w:sz w:val="20"/>
-                <w:szCs w:val="20"/>
-              </w:rPr>
-              <w:br/>
-            </w:r>
-            <w:r>
-              <w:rPr>
-                <w:rFonts w:ascii="Roboto" w:eastAsia="Times New Roman" w:hAnsi="Roboto"/>
-                <w:b/>
-                <w:bCs/>
-                <w:sz w:val="20"/>
-                <w:szCs w:val="20"/>
-              </w:rPr>
-              <w:t>Data Visualization &amp; Applications</w:t>
-            </w:r>
-            <w:r>
-              <w:rPr>
-                <w:rFonts w:ascii="Roboto" w:eastAsia="Times New Roman" w:hAnsi="Roboto"/>
-                <w:sz w:val="20"/>
-                <w:szCs w:val="20"/>
-              </w:rPr>
-              <w:t xml:space="preserve">: ggplot2, </w:t>
-            </w:r>
-            <w:proofErr w:type="spellStart"/>
-            <w:r>
-              <w:rPr>
-                <w:rFonts w:ascii="Roboto" w:eastAsia="Times New Roman" w:hAnsi="Roboto"/>
-                <w:sz w:val="20"/>
-                <w:szCs w:val="20"/>
-              </w:rPr>
-              <w:t>Plotly</w:t>
-            </w:r>
-            <w:proofErr w:type="spellEnd"/>
-            <w:r>
-              <w:rPr>
-                <w:rFonts w:ascii="Roboto" w:eastAsia="Times New Roman" w:hAnsi="Roboto"/>
-                <w:sz w:val="20"/>
-                <w:szCs w:val="20"/>
-              </w:rPr>
-              <w:t>, Matplotlib, Observable JS, R Shiny, Qualtrics</w:t>
-            </w:r>
-            <w:r>
-              <w:rPr>
-                <w:rFonts w:ascii="Roboto" w:eastAsia="Times New Roman" w:hAnsi="Roboto"/>
-                <w:sz w:val="20"/>
-                <w:szCs w:val="20"/>
-              </w:rPr>
-              <w:br/>
-            </w:r>
-            <w:r>
-              <w:rPr>
-                <w:rFonts w:ascii="Roboto" w:eastAsia="Times New Roman" w:hAnsi="Roboto"/>
-                <w:b/>
-                <w:bCs/>
-                <w:sz w:val="20"/>
-                <w:szCs w:val="20"/>
-              </w:rPr>
-              <w:t>Research &amp; Reproducibility</w:t>
-            </w:r>
-            <w:r>
-              <w:rPr>
-                <w:rFonts w:ascii="Roboto" w:eastAsia="Times New Roman" w:hAnsi="Roboto"/>
-                <w:sz w:val="20"/>
-                <w:szCs w:val="20"/>
-              </w:rPr>
-              <w:t>: Quarto, GitHub, LaTeX</w:t>
-            </w:r>
-            <w:r>
-              <w:rPr>
-                <w:rFonts w:ascii="Roboto" w:eastAsia="Times New Roman" w:hAnsi="Roboto"/>
-                <w:sz w:val="20"/>
-                <w:szCs w:val="20"/>
-              </w:rPr>
-              <w:br/>
-            </w:r>
-            <w:r>
-              <w:rPr>
-                <w:rFonts w:ascii="Roboto" w:eastAsia="Times New Roman" w:hAnsi="Roboto"/>
-                <w:b/>
-                <w:bCs/>
-                <w:sz w:val="20"/>
-                <w:szCs w:val="20"/>
-              </w:rPr>
-              <w:t>Methods</w:t>
-            </w:r>
-            <w:r>
-              <w:rPr>
-                <w:rFonts w:ascii="Roboto" w:eastAsia="Times New Roman" w:hAnsi="Roboto"/>
-                <w:sz w:val="20"/>
-                <w:szCs w:val="20"/>
-              </w:rPr>
-              <w:t>: Regression, random forests, decision trees, MARS, deep learning, differential expression, GSEA, mixed-methods analysis</w:t>
-            </w:r>
+              <w:rPr>
+                <w:rFonts w:ascii="Roboto" w:eastAsia="Times New Roman" w:hAnsi="Roboto"/>
+                <w:b/>
+                <w:bCs/>
+                <w:color w:val="2D4239"/>
+                <w:sz w:val="32"/>
+                <w:szCs w:val="32"/>
+                <w:lang w:val="en-US"/>
+              </w:rPr>
+            </w:pPr>
           </w:p>
           <w:p>
             <w:pPr>
               <w:pStyle w:val="NormalWeb"/>
               <w:spacing w:before="0" w:beforeAutospacing="0" w:after="0" w:afterAutospacing="0"/>
-              <w:ind w:left="79"/>
-              <w:rPr>
-                <w:rFonts w:ascii="Roboto" w:eastAsia="Times New Roman" w:hAnsi="Roboto"/>
-                <w:sz w:val="20"/>
-                <w:szCs w:val="20"/>
-              </w:rPr>
-            </w:pPr>
-            <w:r>
-              <w:rPr>
-                <w:rFonts w:ascii="Roboto" w:eastAsia="Times New Roman" w:hAnsi="Roboto"/>
-                <w:b/>
-                <w:bCs/>
-                <w:sz w:val="20"/>
-                <w:szCs w:val="20"/>
-              </w:rPr>
-              <w:t>Communication &amp; Collaboration</w:t>
-            </w:r>
-            <w:r>
-              <w:rPr>
-                <w:rFonts w:ascii="Roboto" w:eastAsia="Times New Roman" w:hAnsi="Roboto"/>
-                <w:sz w:val="20"/>
-                <w:szCs w:val="20"/>
-              </w:rPr>
-              <w:t>: Public speaking; Team-based research in academic and internship settings</w:t>
+              <w:rPr>
+                <w:rFonts w:ascii="Roboto" w:eastAsia="Times New Roman" w:hAnsi="Roboto"/>
+                <w:b/>
+                <w:bCs/>
+                <w:color w:val="2D4239"/>
+                <w:sz w:val="32"/>
+                <w:szCs w:val="32"/>
+                <w:lang w:val="en-US"/>
+              </w:rPr>
+            </w:pPr>
+          </w:p>
+          <w:p>
+            <w:pPr>
+              <w:pStyle w:val="NormalWeb"/>
+              <w:spacing w:before="0" w:beforeAutospacing="0" w:after="0" w:afterAutospacing="0"/>
+              <w:rPr>
+                <w:rFonts w:ascii="Roboto" w:eastAsia="Times New Roman" w:hAnsi="Roboto"/>
+                <w:color w:val="2D4239"/>
+                <w:sz w:val="28"/>
+                <w:szCs w:val="28"/>
+                <w:lang w:val="en-US"/>
+              </w:rPr>
+            </w:pPr>
+            <w:r>
+              <w:rPr>
+                <w:rFonts w:ascii="Roboto" w:eastAsia="Times New Roman" w:hAnsi="Roboto"/>
+                <w:b/>
+                <w:bCs/>
+                <w:color w:val="2D4239"/>
+                <w:sz w:val="32"/>
+                <w:szCs w:val="32"/>
+                <w:lang w:val="en-US"/>
+              </w:rPr>
+              <w:t>Technical</w:t>
+            </w:r>
+            <w:r>
+              <w:rPr>
+                <w:rFonts w:ascii="Roboto" w:eastAsia="Times New Roman" w:hAnsi="Roboto"/>
+                <w:b/>
+                <w:bCs/>
+                <w:color w:val="2D4239"/>
+                <w:sz w:val="32"/>
+                <w:szCs w:val="32"/>
+                <w:lang w:val="en-US"/>
+              </w:rPr>
+              <w:t xml:space="preserve"> Skills</w:t>
             </w:r>
           </w:p>
         </w:tc>
@@ -6631,12 +7106,12 @@
       <w:tr>
         <w:trPr>
           <w:gridAfter w:val="2"/>
-          <w:wAfter w:w="34" w:type="dxa"/>
+          <w:wAfter w:w="1474" w:type="dxa"/>
         </w:trPr>
         <w:tc>
           <w:tcPr>
             <w:tcW w:w="11479" w:type="dxa"/>
-            <w:gridSpan w:val="4"/>
+            <w:gridSpan w:val="3"/>
           </w:tcPr>
           <w:p>
             <w:pPr>
@@ -6644,8 +7119,10 @@
               <w:spacing w:before="0" w:beforeAutospacing="0" w:after="0" w:afterAutospacing="0"/>
               <w:rPr>
                 <w:rFonts w:ascii="Roboto" w:eastAsia="Times New Roman" w:hAnsi="Roboto"/>
-                <w:sz w:val="22"/>
-                <w:szCs w:val="22"/>
+                <w:b/>
+                <w:bCs/>
+                <w:sz w:val="20"/>
+                <w:szCs w:val="20"/>
                 <w:lang w:val="en-US"/>
               </w:rPr>
             </w:pPr>
@@ -6655,36 +7132,298 @@
       <w:tr>
         <w:trPr>
           <w:gridAfter w:val="2"/>
-          <w:wAfter w:w="34" w:type="dxa"/>
+          <w:wAfter w:w="1474" w:type="dxa"/>
         </w:trPr>
         <w:tc>
           <w:tcPr>
             <w:tcW w:w="11479" w:type="dxa"/>
-            <w:gridSpan w:val="4"/>
+            <w:gridSpan w:val="3"/>
           </w:tcPr>
           <w:p>
             <w:pPr>
               <w:pStyle w:val="NormalWeb"/>
-              <w:spacing w:before="0" w:beforeAutospacing="0" w:after="0" w:afterAutospacing="0" w:line="276" w:lineRule="auto"/>
-              <w:rPr>
-                <w:rFonts w:ascii="Roboto" w:eastAsia="Times New Roman" w:hAnsi="Roboto"/>
-                <w:sz w:val="20"/>
-                <w:szCs w:val="20"/>
-                <w:lang w:val="en-US"/>
-              </w:rPr>
-            </w:pPr>
+              <w:spacing w:before="0" w:beforeAutospacing="0" w:after="0" w:afterAutospacing="0"/>
+              <w:ind w:left="79"/>
+              <w:rPr>
+                <w:rFonts w:ascii="Roboto" w:eastAsia="Times New Roman" w:hAnsi="Roboto"/>
+                <w:sz w:val="20"/>
+                <w:szCs w:val="20"/>
+              </w:rPr>
+            </w:pPr>
+            <w:r>
+              <w:rPr>
+                <w:rFonts w:ascii="Roboto" w:eastAsia="Times New Roman" w:hAnsi="Roboto"/>
+                <w:b/>
+                <w:bCs/>
+                <w:sz w:val="20"/>
+                <w:szCs w:val="20"/>
+              </w:rPr>
+              <w:t>Programming</w:t>
+            </w:r>
+            <w:r>
+              <w:rPr>
+                <w:rFonts w:ascii="Roboto" w:eastAsia="Times New Roman" w:hAnsi="Roboto"/>
+                <w:sz w:val="20"/>
+                <w:szCs w:val="20"/>
+              </w:rPr>
+              <w:t>: R (</w:t>
+            </w:r>
+            <w:proofErr w:type="spellStart"/>
+            <w:r>
+              <w:rPr>
+                <w:rFonts w:ascii="Roboto" w:eastAsia="Times New Roman" w:hAnsi="Roboto"/>
+                <w:sz w:val="20"/>
+                <w:szCs w:val="20"/>
+              </w:rPr>
+              <w:t>tidyverse</w:t>
+            </w:r>
+            <w:proofErr w:type="spellEnd"/>
+            <w:r>
+              <w:rPr>
+                <w:rFonts w:ascii="Roboto" w:eastAsia="Times New Roman" w:hAnsi="Roboto"/>
+                <w:sz w:val="20"/>
+                <w:szCs w:val="20"/>
+              </w:rPr>
+              <w:t xml:space="preserve">, </w:t>
+            </w:r>
+            <w:proofErr w:type="spellStart"/>
+            <w:r>
+              <w:rPr>
+                <w:rFonts w:ascii="Roboto" w:eastAsia="Times New Roman" w:hAnsi="Roboto"/>
+                <w:sz w:val="20"/>
+                <w:szCs w:val="20"/>
+              </w:rPr>
+              <w:t>tidymodels</w:t>
+            </w:r>
+            <w:proofErr w:type="spellEnd"/>
+            <w:r>
+              <w:rPr>
+                <w:rFonts w:ascii="Roboto" w:eastAsia="Times New Roman" w:hAnsi="Roboto"/>
+                <w:sz w:val="20"/>
+                <w:szCs w:val="20"/>
+              </w:rPr>
+              <w:t>, caret</w:t>
+            </w:r>
+            <w:r>
+              <w:rPr>
+                <w:rFonts w:ascii="Roboto" w:eastAsia="Times New Roman" w:hAnsi="Roboto"/>
+                <w:sz w:val="20"/>
+                <w:szCs w:val="20"/>
+              </w:rPr>
+              <w:t xml:space="preserve">), </w:t>
+            </w:r>
+            <w:r>
+              <w:rPr>
+                <w:rFonts w:ascii="Roboto" w:eastAsia="Times New Roman" w:hAnsi="Roboto"/>
+                <w:sz w:val="20"/>
+                <w:szCs w:val="20"/>
+              </w:rPr>
+              <w:t xml:space="preserve">Python (Pandas, NumPy, scikit-learn, </w:t>
+            </w:r>
+            <w:proofErr w:type="spellStart"/>
+            <w:r>
+              <w:rPr>
+                <w:rFonts w:ascii="Roboto" w:eastAsia="Times New Roman" w:hAnsi="Roboto"/>
+                <w:sz w:val="20"/>
+                <w:szCs w:val="20"/>
+              </w:rPr>
+              <w:t>PyTorch</w:t>
+            </w:r>
+            <w:proofErr w:type="spellEnd"/>
+            <w:r>
+              <w:rPr>
+                <w:rFonts w:ascii="Roboto" w:eastAsia="Times New Roman" w:hAnsi="Roboto"/>
+                <w:sz w:val="20"/>
+                <w:szCs w:val="20"/>
+              </w:rPr>
+              <w:t>), SPSS</w:t>
+            </w:r>
+            <w:r>
+              <w:rPr>
+                <w:rFonts w:ascii="Roboto" w:eastAsia="Times New Roman" w:hAnsi="Roboto"/>
+                <w:sz w:val="20"/>
+                <w:szCs w:val="20"/>
+              </w:rPr>
+              <w:br/>
+            </w:r>
+            <w:r>
+              <w:rPr>
+                <w:rFonts w:ascii="Roboto" w:eastAsia="Times New Roman" w:hAnsi="Roboto"/>
+                <w:b/>
+                <w:bCs/>
+                <w:sz w:val="20"/>
+                <w:szCs w:val="20"/>
+              </w:rPr>
+              <w:t>Data Visualization &amp; Applications</w:t>
+            </w:r>
+            <w:r>
+              <w:rPr>
+                <w:rFonts w:ascii="Roboto" w:eastAsia="Times New Roman" w:hAnsi="Roboto"/>
+                <w:sz w:val="20"/>
+                <w:szCs w:val="20"/>
+              </w:rPr>
+              <w:t xml:space="preserve">: ggplot2, </w:t>
+            </w:r>
+            <w:proofErr w:type="spellStart"/>
+            <w:r>
+              <w:rPr>
+                <w:rFonts w:ascii="Roboto" w:eastAsia="Times New Roman" w:hAnsi="Roboto"/>
+                <w:sz w:val="20"/>
+                <w:szCs w:val="20"/>
+              </w:rPr>
+              <w:t>Plotly</w:t>
+            </w:r>
+            <w:proofErr w:type="spellEnd"/>
+            <w:r>
+              <w:rPr>
+                <w:rFonts w:ascii="Roboto" w:eastAsia="Times New Roman" w:hAnsi="Roboto"/>
+                <w:sz w:val="20"/>
+                <w:szCs w:val="20"/>
+              </w:rPr>
+              <w:t>, Matplotlib, Observable JS, R Shiny, Qualtrics</w:t>
+            </w:r>
+            <w:r>
+              <w:rPr>
+                <w:rFonts w:ascii="Roboto" w:eastAsia="Times New Roman" w:hAnsi="Roboto"/>
+                <w:sz w:val="20"/>
+                <w:szCs w:val="20"/>
+              </w:rPr>
+              <w:br/>
+            </w:r>
+            <w:r>
+              <w:rPr>
+                <w:rFonts w:ascii="Roboto" w:eastAsia="Times New Roman" w:hAnsi="Roboto"/>
+                <w:b/>
+                <w:bCs/>
+                <w:sz w:val="20"/>
+                <w:szCs w:val="20"/>
+              </w:rPr>
+              <w:t>Research &amp; Reproducibility</w:t>
+            </w:r>
+            <w:r>
+              <w:rPr>
+                <w:rFonts w:ascii="Roboto" w:eastAsia="Times New Roman" w:hAnsi="Roboto"/>
+                <w:sz w:val="20"/>
+                <w:szCs w:val="20"/>
+              </w:rPr>
+              <w:t>: Quarto, GitHub, LaTeX</w:t>
+            </w:r>
+            <w:r>
+              <w:rPr>
+                <w:rFonts w:ascii="Roboto" w:eastAsia="Times New Roman" w:hAnsi="Roboto"/>
+                <w:sz w:val="20"/>
+                <w:szCs w:val="20"/>
+              </w:rPr>
+              <w:br/>
+            </w:r>
+            <w:r>
+              <w:rPr>
+                <w:rFonts w:ascii="Roboto" w:eastAsia="Times New Roman" w:hAnsi="Roboto"/>
+                <w:b/>
+                <w:bCs/>
+                <w:sz w:val="20"/>
+                <w:szCs w:val="20"/>
+              </w:rPr>
+              <w:t>Methods</w:t>
+            </w:r>
+            <w:r>
+              <w:rPr>
+                <w:rFonts w:ascii="Roboto" w:eastAsia="Times New Roman" w:hAnsi="Roboto"/>
+                <w:sz w:val="20"/>
+                <w:szCs w:val="20"/>
+              </w:rPr>
+              <w:t>: Regression, random forests, decision trees, MARS, deep learning, differential expression, GSEA, mixed-methods analysis</w:t>
+            </w:r>
+          </w:p>
+          <w:p>
+            <w:pPr>
+              <w:pStyle w:val="NormalWeb"/>
+              <w:spacing w:before="0" w:beforeAutospacing="0" w:after="0" w:afterAutospacing="0"/>
+              <w:ind w:left="79"/>
+              <w:rPr>
+                <w:rFonts w:ascii="Roboto" w:eastAsia="Times New Roman" w:hAnsi="Roboto"/>
+                <w:sz w:val="20"/>
+                <w:szCs w:val="20"/>
+              </w:rPr>
+            </w:pPr>
+            <w:r>
+              <w:rPr>
+                <w:rFonts w:ascii="Roboto" w:eastAsia="Times New Roman" w:hAnsi="Roboto"/>
+                <w:b/>
+                <w:bCs/>
+                <w:sz w:val="20"/>
+                <w:szCs w:val="20"/>
+              </w:rPr>
+              <w:t>Communication &amp; Collaboration</w:t>
+            </w:r>
+            <w:r>
+              <w:rPr>
+                <w:rFonts w:ascii="Roboto" w:eastAsia="Times New Roman" w:hAnsi="Roboto"/>
+                <w:sz w:val="20"/>
+                <w:szCs w:val="20"/>
+              </w:rPr>
+              <w:t>: Public speaking; Team-based research in academic and internship settings</w:t>
+            </w:r>
           </w:p>
         </w:tc>
       </w:tr>
       <w:tr>
         <w:trPr>
           <w:gridAfter w:val="2"/>
-          <w:wAfter w:w="34" w:type="dxa"/>
+          <w:wAfter w:w="1474" w:type="dxa"/>
         </w:trPr>
         <w:tc>
           <w:tcPr>
             <w:tcW w:w="11479" w:type="dxa"/>
-            <w:gridSpan w:val="4"/>
+            <w:gridSpan w:val="3"/>
+          </w:tcPr>
+          <w:p>
+            <w:pPr>
+              <w:pStyle w:val="NormalWeb"/>
+              <w:spacing w:before="0" w:beforeAutospacing="0" w:after="0" w:afterAutospacing="0"/>
+              <w:rPr>
+                <w:rFonts w:ascii="Roboto" w:eastAsia="Times New Roman" w:hAnsi="Roboto"/>
+                <w:sz w:val="22"/>
+                <w:szCs w:val="22"/>
+                <w:lang w:val="en-US"/>
+              </w:rPr>
+            </w:pPr>
+          </w:p>
+        </w:tc>
+      </w:tr>
+      <w:tr>
+        <w:trPr>
+          <w:gridAfter w:val="2"/>
+          <w:wAfter w:w="1474" w:type="dxa"/>
+        </w:trPr>
+        <w:tc>
+          <w:tcPr>
+            <w:tcW w:w="11479" w:type="dxa"/>
+            <w:gridSpan w:val="3"/>
+          </w:tcPr>
+          <w:p>
+            <w:pPr>
+              <w:pStyle w:val="NormalWeb"/>
+              <w:spacing w:before="0" w:beforeAutospacing="0" w:after="0" w:afterAutospacing="0" w:line="276" w:lineRule="auto"/>
+              <w:rPr>
+                <w:rFonts w:ascii="Roboto" w:eastAsia="Times New Roman" w:hAnsi="Roboto"/>
+                <w:sz w:val="20"/>
+                <w:szCs w:val="20"/>
+                <w:lang w:val="en-US"/>
+              </w:rPr>
+            </w:pPr>
+          </w:p>
+        </w:tc>
+      </w:tr>
+      <w:tr>
+        <w:trPr>
+          <w:gridAfter w:val="2"/>
+          <w:wAfter w:w="1474" w:type="dxa"/>
+        </w:trPr>
+        <w:tc>
+          <w:tcPr>
+            <w:tcW w:w="11479" w:type="dxa"/>
+            <w:gridSpan w:val="3"/>
           </w:tcPr>
           <w:tbl>
             <w:tblPr>
@@ -6817,12 +7556,6 @@
       </w:pPr>
     </w:p>
     <w:sectPr>
-      <w:headerReference w:type="even" r:id="rId17"/>
-      <w:headerReference w:type="default" r:id="rId18"/>
-      <w:footerReference w:type="even" r:id="rId19"/>
-      <w:footerReference w:type="default" r:id="rId20"/>
-      <w:headerReference w:type="first" r:id="rId21"/>
-      <w:footerReference w:type="first" r:id="rId22"/>
       <w:pgSz w:w="12240" w:h="15840" w:code="1"/>
       <w:pgMar w:top="357" w:right="527" w:bottom="284" w:left="533" w:header="0" w:footer="0" w:gutter="0"/>
       <w:cols w:space="708"/>
@@ -6857,36 +7590,6 @@
 </w:endnotes>
 </file>
 
-<file path=word/footer1.xml><?xml version="1.0" encoding="utf-8"?>
-<w:ftr xmlns:wpc="http://schemas.microsoft.com/office/word/2010/wordprocessingCanvas" xmlns:cx="http://schemas.microsoft.com/office/drawing/2014/chartex" xmlns:cx1="http://schemas.microsoft.com/office/drawing/2015/9/8/chartex" xmlns:cx2="http://schemas.microsoft.com/office/drawing/2015/10/21/chartex" xmlns:cx3="http://schemas.microsoft.com/office/drawing/2016/5/9/chartex" xmlns:cx4="http://schemas.microsoft.com/office/drawing/2016/5/10/chartex" xmlns:cx5="http://schemas.microsoft.com/office/drawing/2016/5/11/chartex" xmlns:cx6="http://schemas.microsoft.com/office/drawing/2016/5/12/chartex" xmlns:cx7="http://schemas.microsoft.com/office/drawing/2016/5/13/chartex" xmlns:cx8="http://schemas.microsoft.com/office/drawing/2016/5/14/chartex" xmlns:mc="http://schemas.openxmlformats.org/markup-compatibility/2006" xmlns:aink="http://schemas.microsoft.com/office/drawing/2016/ink" xmlns:am3d="http://schemas.microsoft.com/office/drawing/2017/model3d" xmlns:o="urn:schemas-microsoft-com:office:office" xmlns:oel="http://schemas.microsoft.com/office/2019/extlst" xmlns:r="http://schemas.openxmlformats.org/officeDocument/2006/relationships" xmlns:m="http://schemas.openxmlformats.org/officeDocument/2006/math" xmlns:v="urn:schemas-microsoft-com:vml" xmlns:wp14="http://schemas.microsoft.com/office/word/2010/wordprocessingDrawing" xmlns:wp="http://schemas.openxmlformats.org/drawingml/2006/wordprocessingDrawing" xmlns:w10="urn:schemas-microsoft-com:office:word" xmlns:w="http://schemas.openxmlformats.org/wordprocessingml/2006/main" xmlns:w14="http://schemas.microsoft.com/office/word/2010/wordml" xmlns:w15="http://schemas.microsoft.com/office/word/2012/wordml" xmlns:w16cex="http://schemas.microsoft.com/office/word/2018/wordml/cex" xmlns:w16cid="http://schemas.microsoft.com/office/word/2016/wordml/cid" xmlns:w16="http://schemas.microsoft.com/office/word/2018/wordml" xmlns:w16du="http://schemas.microsoft.com/office/word/2023/wordml/word16du" xmlns:w16sdtdh="http://schemas.microsoft.com/office/word/2020/wordml/sdtdatahash" xmlns:w16sdtfl="http://schemas.microsoft.com/office/word/2024/wordml/sdtformatlock" xmlns:w16se="http://schemas.microsoft.com/office/word/2015/wordml/symex" xmlns:wpg="http://schemas.microsoft.com/office/word/2010/wordprocessingGroup" xmlns:wpi="http://schemas.microsoft.com/office/word/2010/wordprocessingInk" xmlns:wne="http://schemas.microsoft.com/office/word/2006/wordml" xmlns:wps="http://schemas.microsoft.com/office/word/2010/wordprocessingShape" mc:Ignorable="w14 w15 w16se w16cid w16 w16cex w16sdtdh w16sdtfl w16du wp14">
-  <w:p>
-    <w:pPr>
-      <w:pStyle w:val="Footer"/>
-    </w:pPr>
-  </w:p>
-</w:ftr>
-</file>
-
-<file path=word/footer2.xml><?xml version="1.0" encoding="utf-8"?>
-<w:ftr xmlns:wpc="http://schemas.microsoft.com/office/word/2010/wordprocessingCanvas" xmlns:cx="http://schemas.microsoft.com/office/drawing/2014/chartex" xmlns:cx1="http://schemas.microsoft.com/office/drawing/2015/9/8/chartex" xmlns:cx2="http://schemas.microsoft.com/office/drawing/2015/10/21/chartex" xmlns:cx3="http://schemas.microsoft.com/office/drawing/2016/5/9/chartex" xmlns:cx4="http://schemas.microsoft.com/office/drawing/2016/5/10/chartex" xmlns:cx5="http://schemas.microsoft.com/office/drawing/2016/5/11/chartex" xmlns:cx6="http://schemas.microsoft.com/office/drawing/2016/5/12/chartex" xmlns:cx7="http://schemas.microsoft.com/office/drawing/2016/5/13/chartex" xmlns:cx8="http://schemas.microsoft.com/office/drawing/2016/5/14/chartex" xmlns:mc="http://schemas.openxmlformats.org/markup-compatibility/2006" xmlns:aink="http://schemas.microsoft.com/office/drawing/2016/ink" xmlns:am3d="http://schemas.microsoft.com/office/drawing/2017/model3d" xmlns:o="urn:schemas-microsoft-com:office:office" xmlns:oel="http://schemas.microsoft.com/office/2019/extlst" xmlns:r="http://schemas.openxmlformats.org/officeDocument/2006/relationships" xmlns:m="http://schemas.openxmlformats.org/officeDocument/2006/math" xmlns:v="urn:schemas-microsoft-com:vml" xmlns:wp14="http://schemas.microsoft.com/office/word/2010/wordprocessingDrawing" xmlns:wp="http://schemas.openxmlformats.org/drawingml/2006/wordprocessingDrawing" xmlns:w10="urn:schemas-microsoft-com:office:word" xmlns:w="http://schemas.openxmlformats.org/wordprocessingml/2006/main" xmlns:w14="http://schemas.microsoft.com/office/word/2010/wordml" xmlns:w15="http://schemas.microsoft.com/office/word/2012/wordml" xmlns:w16cex="http://schemas.microsoft.com/office/word/2018/wordml/cex" xmlns:w16cid="http://schemas.microsoft.com/office/word/2016/wordml/cid" xmlns:w16="http://schemas.microsoft.com/office/word/2018/wordml" xmlns:w16du="http://schemas.microsoft.com/office/word/2023/wordml/word16du" xmlns:w16sdtdh="http://schemas.microsoft.com/office/word/2020/wordml/sdtdatahash" xmlns:w16sdtfl="http://schemas.microsoft.com/office/word/2024/wordml/sdtformatlock" xmlns:w16se="http://schemas.microsoft.com/office/word/2015/wordml/symex" xmlns:wpg="http://schemas.microsoft.com/office/word/2010/wordprocessingGroup" xmlns:wpi="http://schemas.microsoft.com/office/word/2010/wordprocessingInk" xmlns:wne="http://schemas.microsoft.com/office/word/2006/wordml" xmlns:wps="http://schemas.microsoft.com/office/word/2010/wordprocessingShape" mc:Ignorable="w14 w15 w16se w16cid w16 w16cex w16sdtdh w16sdtfl w16du wp14">
-  <w:p>
-    <w:pPr>
-      <w:pStyle w:val="Footer"/>
-    </w:pPr>
-  </w:p>
-</w:ftr>
-</file>
-
-<file path=word/footer3.xml><?xml version="1.0" encoding="utf-8"?>
-<w:ftr xmlns:wpc="http://schemas.microsoft.com/office/word/2010/wordprocessingCanvas" xmlns:cx="http://schemas.microsoft.com/office/drawing/2014/chartex" xmlns:cx1="http://schemas.microsoft.com/office/drawing/2015/9/8/chartex" xmlns:cx2="http://schemas.microsoft.com/office/drawing/2015/10/21/chartex" xmlns:cx3="http://schemas.microsoft.com/office/drawing/2016/5/9/chartex" xmlns:cx4="http://schemas.microsoft.com/office/drawing/2016/5/10/chartex" xmlns:cx5="http://schemas.microsoft.com/office/drawing/2016/5/11/chartex" xmlns:cx6="http://schemas.microsoft.com/office/drawing/2016/5/12/chartex" xmlns:cx7="http://schemas.microsoft.com/office/drawing/2016/5/13/chartex" xmlns:cx8="http://schemas.microsoft.com/office/drawing/2016/5/14/chartex" xmlns:mc="http://schemas.openxmlformats.org/markup-compatibility/2006" xmlns:aink="http://schemas.microsoft.com/office/drawing/2016/ink" xmlns:am3d="http://schemas.microsoft.com/office/drawing/2017/model3d" xmlns:o="urn:schemas-microsoft-com:office:office" xmlns:oel="http://schemas.microsoft.com/office/2019/extlst" xmlns:r="http://schemas.openxmlformats.org/officeDocument/2006/relationships" xmlns:m="http://schemas.openxmlformats.org/officeDocument/2006/math" xmlns:v="urn:schemas-microsoft-com:vml" xmlns:wp14="http://schemas.microsoft.com/office/word/2010/wordprocessingDrawing" xmlns:wp="http://schemas.openxmlformats.org/drawingml/2006/wordprocessingDrawing" xmlns:w10="urn:schemas-microsoft-com:office:word" xmlns:w="http://schemas.openxmlformats.org/wordprocessingml/2006/main" xmlns:w14="http://schemas.microsoft.com/office/word/2010/wordml" xmlns:w15="http://schemas.microsoft.com/office/word/2012/wordml" xmlns:w16cex="http://schemas.microsoft.com/office/word/2018/wordml/cex" xmlns:w16cid="http://schemas.microsoft.com/office/word/2016/wordml/cid" xmlns:w16="http://schemas.microsoft.com/office/word/2018/wordml" xmlns:w16du="http://schemas.microsoft.com/office/word/2023/wordml/word16du" xmlns:w16sdtdh="http://schemas.microsoft.com/office/word/2020/wordml/sdtdatahash" xmlns:w16sdtfl="http://schemas.microsoft.com/office/word/2024/wordml/sdtformatlock" xmlns:w16se="http://schemas.microsoft.com/office/word/2015/wordml/symex" xmlns:wpg="http://schemas.microsoft.com/office/word/2010/wordprocessingGroup" xmlns:wpi="http://schemas.microsoft.com/office/word/2010/wordprocessingInk" xmlns:wne="http://schemas.microsoft.com/office/word/2006/wordml" xmlns:wps="http://schemas.microsoft.com/office/word/2010/wordprocessingShape" mc:Ignorable="w14 w15 w16se w16cid w16 w16cex w16sdtdh w16sdtfl w16du wp14">
-  <w:p>
-    <w:pPr>
-      <w:pStyle w:val="Footer"/>
-    </w:pPr>
-  </w:p>
-</w:ftr>
-</file>
-
 <file path=word/footnotes.xml><?xml version="1.0" encoding="utf-8"?>
 <w:footnotes xmlns:wpc="http://schemas.microsoft.com/office/word/2010/wordprocessingCanvas" xmlns:cx="http://schemas.microsoft.com/office/drawing/2014/chartex" xmlns:cx1="http://schemas.microsoft.com/office/drawing/2015/9/8/chartex" xmlns:cx2="http://schemas.microsoft.com/office/drawing/2015/10/21/chartex" xmlns:cx3="http://schemas.microsoft.com/office/drawing/2016/5/9/chartex" xmlns:cx4="http://schemas.microsoft.com/office/drawing/2016/5/10/chartex" xmlns:cx5="http://schemas.microsoft.com/office/drawing/2016/5/11/chartex" xmlns:cx6="http://schemas.microsoft.com/office/drawing/2016/5/12/chartex" xmlns:cx7="http://schemas.microsoft.com/office/drawing/2016/5/13/chartex" xmlns:cx8="http://schemas.microsoft.com/office/drawing/2016/5/14/chartex" xmlns:mc="http://schemas.openxmlformats.org/markup-compatibility/2006" xmlns:aink="http://schemas.microsoft.com/office/drawing/2016/ink" xmlns:am3d="http://schemas.microsoft.com/office/drawing/2017/model3d" xmlns:o="urn:schemas-microsoft-com:office:office" xmlns:oel="http://schemas.microsoft.com/office/2019/extlst" xmlns:r="http://schemas.openxmlformats.org/officeDocument/2006/relationships" xmlns:m="http://schemas.openxmlformats.org/officeDocument/2006/math" xmlns:v="urn:schemas-microsoft-com:vml" xmlns:wp14="http://schemas.microsoft.com/office/word/2010/wordprocessingDrawing" xmlns:wp="http://schemas.openxmlformats.org/drawingml/2006/wordprocessingDrawing" xmlns:w10="urn:schemas-microsoft-com:office:word" xmlns:w="http://schemas.openxmlformats.org/wordprocessingml/2006/main" xmlns:w14="http://schemas.microsoft.com/office/word/2010/wordml" xmlns:w15="http://schemas.microsoft.com/office/word/2012/wordml" xmlns:w16cex="http://schemas.microsoft.com/office/word/2018/wordml/cex" xmlns:w16cid="http://schemas.microsoft.com/office/word/2016/wordml/cid" xmlns:w16="http://schemas.microsoft.com/office/word/2018/wordml" xmlns:w16du="http://schemas.microsoft.com/office/word/2023/wordml/word16du" xmlns:w16sdtdh="http://schemas.microsoft.com/office/word/2020/wordml/sdtdatahash" xmlns:w16sdtfl="http://schemas.microsoft.com/office/word/2024/wordml/sdtformatlock" xmlns:w16se="http://schemas.microsoft.com/office/word/2015/wordml/symex" xmlns:wpg="http://schemas.microsoft.com/office/word/2010/wordprocessingGroup" xmlns:wpi="http://schemas.microsoft.com/office/word/2010/wordprocessingInk" xmlns:wne="http://schemas.microsoft.com/office/word/2006/wordml" xmlns:wps="http://schemas.microsoft.com/office/word/2010/wordprocessingShape" mc:Ignorable="w14 w15 w16se w16cid w16 w16cex w16sdtdh w16sdtfl w16du wp14">
   <w:footnote w:type="separator" w:id="-1">
@@ -6910,36 +7613,6 @@
     </w:p>
   </w:footnote>
 </w:footnotes>
-</file>
-
-<file path=word/header1.xml><?xml version="1.0" encoding="utf-8"?>
-<w:hdr xmlns:wpc="http://schemas.microsoft.com/office/word/2010/wordprocessingCanvas" xmlns:cx="http://schemas.microsoft.com/office/drawing/2014/chartex" xmlns:cx1="http://schemas.microsoft.com/office/drawing/2015/9/8/chartex" xmlns:cx2="http://schemas.microsoft.com/office/drawing/2015/10/21/chartex" xmlns:cx3="http://schemas.microsoft.com/office/drawing/2016/5/9/chartex" xmlns:cx4="http://schemas.microsoft.com/office/drawing/2016/5/10/chartex" xmlns:cx5="http://schemas.microsoft.com/office/drawing/2016/5/11/chartex" xmlns:cx6="http://schemas.microsoft.com/office/drawing/2016/5/12/chartex" xmlns:cx7="http://schemas.microsoft.com/office/drawing/2016/5/13/chartex" xmlns:cx8="http://schemas.microsoft.com/office/drawing/2016/5/14/chartex" xmlns:mc="http://schemas.openxmlformats.org/markup-compatibility/2006" xmlns:aink="http://schemas.microsoft.com/office/drawing/2016/ink" xmlns:am3d="http://schemas.microsoft.com/office/drawing/2017/model3d" xmlns:o="urn:schemas-microsoft-com:office:office" xmlns:oel="http://schemas.microsoft.com/office/2019/extlst" xmlns:r="http://schemas.openxmlformats.org/officeDocument/2006/relationships" xmlns:m="http://schemas.openxmlformats.org/officeDocument/2006/math" xmlns:v="urn:schemas-microsoft-com:vml" xmlns:wp14="http://schemas.microsoft.com/office/word/2010/wordprocessingDrawing" xmlns:wp="http://schemas.openxmlformats.org/drawingml/2006/wordprocessingDrawing" xmlns:w10="urn:schemas-microsoft-com:office:word" xmlns:w="http://schemas.openxmlformats.org/wordprocessingml/2006/main" xmlns:w14="http://schemas.microsoft.com/office/word/2010/wordml" xmlns:w15="http://schemas.microsoft.com/office/word/2012/wordml" xmlns:w16cex="http://schemas.microsoft.com/office/word/2018/wordml/cex" xmlns:w16cid="http://schemas.microsoft.com/office/word/2016/wordml/cid" xmlns:w16="http://schemas.microsoft.com/office/word/2018/wordml" xmlns:w16du="http://schemas.microsoft.com/office/word/2023/wordml/word16du" xmlns:w16sdtdh="http://schemas.microsoft.com/office/word/2020/wordml/sdtdatahash" xmlns:w16sdtfl="http://schemas.microsoft.com/office/word/2024/wordml/sdtformatlock" xmlns:w16se="http://schemas.microsoft.com/office/word/2015/wordml/symex" xmlns:wpg="http://schemas.microsoft.com/office/word/2010/wordprocessingGroup" xmlns:wpi="http://schemas.microsoft.com/office/word/2010/wordprocessingInk" xmlns:wne="http://schemas.microsoft.com/office/word/2006/wordml" xmlns:wps="http://schemas.microsoft.com/office/word/2010/wordprocessingShape" mc:Ignorable="w14 w15 w16se w16cid w16 w16cex w16sdtdh w16sdtfl w16du wp14">
-  <w:p>
-    <w:pPr>
-      <w:pStyle w:val="Header"/>
-    </w:pPr>
-  </w:p>
-</w:hdr>
-</file>
-
-<file path=word/header2.xml><?xml version="1.0" encoding="utf-8"?>
-<w:hdr xmlns:wpc="http://schemas.microsoft.com/office/word/2010/wordprocessingCanvas" xmlns:cx="http://schemas.microsoft.com/office/drawing/2014/chartex" xmlns:cx1="http://schemas.microsoft.com/office/drawing/2015/9/8/chartex" xmlns:cx2="http://schemas.microsoft.com/office/drawing/2015/10/21/chartex" xmlns:cx3="http://schemas.microsoft.com/office/drawing/2016/5/9/chartex" xmlns:cx4="http://schemas.microsoft.com/office/drawing/2016/5/10/chartex" xmlns:cx5="http://schemas.microsoft.com/office/drawing/2016/5/11/chartex" xmlns:cx6="http://schemas.microsoft.com/office/drawing/2016/5/12/chartex" xmlns:cx7="http://schemas.microsoft.com/office/drawing/2016/5/13/chartex" xmlns:cx8="http://schemas.microsoft.com/office/drawing/2016/5/14/chartex" xmlns:mc="http://schemas.openxmlformats.org/markup-compatibility/2006" xmlns:aink="http://schemas.microsoft.com/office/drawing/2016/ink" xmlns:am3d="http://schemas.microsoft.com/office/drawing/2017/model3d" xmlns:o="urn:schemas-microsoft-com:office:office" xmlns:oel="http://schemas.microsoft.com/office/2019/extlst" xmlns:r="http://schemas.openxmlformats.org/officeDocument/2006/relationships" xmlns:m="http://schemas.openxmlformats.org/officeDocument/2006/math" xmlns:v="urn:schemas-microsoft-com:vml" xmlns:wp14="http://schemas.microsoft.com/office/word/2010/wordprocessingDrawing" xmlns:wp="http://schemas.openxmlformats.org/drawingml/2006/wordprocessingDrawing" xmlns:w10="urn:schemas-microsoft-com:office:word" xmlns:w="http://schemas.openxmlformats.org/wordprocessingml/2006/main" xmlns:w14="http://schemas.microsoft.com/office/word/2010/wordml" xmlns:w15="http://schemas.microsoft.com/office/word/2012/wordml" xmlns:w16cex="http://schemas.microsoft.com/office/word/2018/wordml/cex" xmlns:w16cid="http://schemas.microsoft.com/office/word/2016/wordml/cid" xmlns:w16="http://schemas.microsoft.com/office/word/2018/wordml" xmlns:w16du="http://schemas.microsoft.com/office/word/2023/wordml/word16du" xmlns:w16sdtdh="http://schemas.microsoft.com/office/word/2020/wordml/sdtdatahash" xmlns:w16sdtfl="http://schemas.microsoft.com/office/word/2024/wordml/sdtformatlock" xmlns:w16se="http://schemas.microsoft.com/office/word/2015/wordml/symex" xmlns:wpg="http://schemas.microsoft.com/office/word/2010/wordprocessingGroup" xmlns:wpi="http://schemas.microsoft.com/office/word/2010/wordprocessingInk" xmlns:wne="http://schemas.microsoft.com/office/word/2006/wordml" xmlns:wps="http://schemas.microsoft.com/office/word/2010/wordprocessingShape" mc:Ignorable="w14 w15 w16se w16cid w16 w16cex w16sdtdh w16sdtfl w16du wp14">
-  <w:p>
-    <w:pPr>
-      <w:pStyle w:val="Header"/>
-    </w:pPr>
-  </w:p>
-</w:hdr>
-</file>
-
-<file path=word/header3.xml><?xml version="1.0" encoding="utf-8"?>
-<w:hdr xmlns:wpc="http://schemas.microsoft.com/office/word/2010/wordprocessingCanvas" xmlns:cx="http://schemas.microsoft.com/office/drawing/2014/chartex" xmlns:cx1="http://schemas.microsoft.com/office/drawing/2015/9/8/chartex" xmlns:cx2="http://schemas.microsoft.com/office/drawing/2015/10/21/chartex" xmlns:cx3="http://schemas.microsoft.com/office/drawing/2016/5/9/chartex" xmlns:cx4="http://schemas.microsoft.com/office/drawing/2016/5/10/chartex" xmlns:cx5="http://schemas.microsoft.com/office/drawing/2016/5/11/chartex" xmlns:cx6="http://schemas.microsoft.com/office/drawing/2016/5/12/chartex" xmlns:cx7="http://schemas.microsoft.com/office/drawing/2016/5/13/chartex" xmlns:cx8="http://schemas.microsoft.com/office/drawing/2016/5/14/chartex" xmlns:mc="http://schemas.openxmlformats.org/markup-compatibility/2006" xmlns:aink="http://schemas.microsoft.com/office/drawing/2016/ink" xmlns:am3d="http://schemas.microsoft.com/office/drawing/2017/model3d" xmlns:o="urn:schemas-microsoft-com:office:office" xmlns:oel="http://schemas.microsoft.com/office/2019/extlst" xmlns:r="http://schemas.openxmlformats.org/officeDocument/2006/relationships" xmlns:m="http://schemas.openxmlformats.org/officeDocument/2006/math" xmlns:v="urn:schemas-microsoft-com:vml" xmlns:wp14="http://schemas.microsoft.com/office/word/2010/wordprocessingDrawing" xmlns:wp="http://schemas.openxmlformats.org/drawingml/2006/wordprocessingDrawing" xmlns:w10="urn:schemas-microsoft-com:office:word" xmlns:w="http://schemas.openxmlformats.org/wordprocessingml/2006/main" xmlns:w14="http://schemas.microsoft.com/office/word/2010/wordml" xmlns:w15="http://schemas.microsoft.com/office/word/2012/wordml" xmlns:w16cex="http://schemas.microsoft.com/office/word/2018/wordml/cex" xmlns:w16cid="http://schemas.microsoft.com/office/word/2016/wordml/cid" xmlns:w16="http://schemas.microsoft.com/office/word/2018/wordml" xmlns:w16du="http://schemas.microsoft.com/office/word/2023/wordml/word16du" xmlns:w16sdtdh="http://schemas.microsoft.com/office/word/2020/wordml/sdtdatahash" xmlns:w16sdtfl="http://schemas.microsoft.com/office/word/2024/wordml/sdtformatlock" xmlns:w16se="http://schemas.microsoft.com/office/word/2015/wordml/symex" xmlns:wpg="http://schemas.microsoft.com/office/word/2010/wordprocessingGroup" xmlns:wpi="http://schemas.microsoft.com/office/word/2010/wordprocessingInk" xmlns:wne="http://schemas.microsoft.com/office/word/2006/wordml" xmlns:wps="http://schemas.microsoft.com/office/word/2010/wordprocessingShape" mc:Ignorable="w14 w15 w16se w16cid w16 w16cex w16sdtdh w16sdtfl w16du wp14">
-  <w:p>
-    <w:pPr>
-      <w:pStyle w:val="Header"/>
-    </w:pPr>
-  </w:p>
-</w:hdr>
 </file>
 
 <file path=word/numbering.xml><?xml version="1.0" encoding="utf-8"?>
@@ -7058,6 +7731,672 @@
     </w:lvl>
   </w:abstractNum>
   <w:abstractNum w:abstractNumId="1" w15:restartNumberingAfterBreak="0">
+    <w:nsid w:val="12434D60"/>
+    <w:multiLevelType w:val="hybridMultilevel"/>
+    <w:tmpl w:val="5B8EDBB2"/>
+    <w:lvl w:ilvl="0" w:tplc="04090003">
+      <w:start w:val="1"/>
+      <w:numFmt w:val="bullet"/>
+      <w:lvlText w:val="o"/>
+      <w:lvlJc w:val="left"/>
+      <w:pPr>
+        <w:ind w:left="720" w:hanging="360"/>
+      </w:pPr>
+      <w:rPr>
+        <w:rFonts w:ascii="Courier New" w:hAnsi="Courier New" w:cs="Courier New" w:hint="default"/>
+      </w:rPr>
+    </w:lvl>
+    <w:lvl w:ilvl="1" w:tplc="04090003" w:tentative="1">
+      <w:start w:val="1"/>
+      <w:numFmt w:val="bullet"/>
+      <w:lvlText w:val="o"/>
+      <w:lvlJc w:val="left"/>
+      <w:pPr>
+        <w:ind w:left="1440" w:hanging="360"/>
+      </w:pPr>
+      <w:rPr>
+        <w:rFonts w:ascii="Courier New" w:hAnsi="Courier New" w:cs="Courier New" w:hint="default"/>
+      </w:rPr>
+    </w:lvl>
+    <w:lvl w:ilvl="2" w:tplc="04090005" w:tentative="1">
+      <w:start w:val="1"/>
+      <w:numFmt w:val="bullet"/>
+      <w:lvlText w:val=""/>
+      <w:lvlJc w:val="left"/>
+      <w:pPr>
+        <w:ind w:left="2160" w:hanging="360"/>
+      </w:pPr>
+      <w:rPr>
+        <w:rFonts w:ascii="Wingdings" w:hAnsi="Wingdings" w:hint="default"/>
+      </w:rPr>
+    </w:lvl>
+    <w:lvl w:ilvl="3" w:tplc="04090001" w:tentative="1">
+      <w:start w:val="1"/>
+      <w:numFmt w:val="bullet"/>
+      <w:lvlText w:val=""/>
+      <w:lvlJc w:val="left"/>
+      <w:pPr>
+        <w:ind w:left="2880" w:hanging="360"/>
+      </w:pPr>
+      <w:rPr>
+        <w:rFonts w:ascii="Symbol" w:hAnsi="Symbol" w:hint="default"/>
+      </w:rPr>
+    </w:lvl>
+    <w:lvl w:ilvl="4" w:tplc="04090003" w:tentative="1">
+      <w:start w:val="1"/>
+      <w:numFmt w:val="bullet"/>
+      <w:lvlText w:val="o"/>
+      <w:lvlJc w:val="left"/>
+      <w:pPr>
+        <w:ind w:left="3600" w:hanging="360"/>
+      </w:pPr>
+      <w:rPr>
+        <w:rFonts w:ascii="Courier New" w:hAnsi="Courier New" w:cs="Courier New" w:hint="default"/>
+      </w:rPr>
+    </w:lvl>
+    <w:lvl w:ilvl="5" w:tplc="04090005" w:tentative="1">
+      <w:start w:val="1"/>
+      <w:numFmt w:val="bullet"/>
+      <w:lvlText w:val=""/>
+      <w:lvlJc w:val="left"/>
+      <w:pPr>
+        <w:ind w:left="4320" w:hanging="360"/>
+      </w:pPr>
+      <w:rPr>
+        <w:rFonts w:ascii="Wingdings" w:hAnsi="Wingdings" w:hint="default"/>
+      </w:rPr>
+    </w:lvl>
+    <w:lvl w:ilvl="6" w:tplc="04090001" w:tentative="1">
+      <w:start w:val="1"/>
+      <w:numFmt w:val="bullet"/>
+      <w:lvlText w:val=""/>
+      <w:lvlJc w:val="left"/>
+      <w:pPr>
+        <w:ind w:left="5040" w:hanging="360"/>
+      </w:pPr>
+      <w:rPr>
+        <w:rFonts w:ascii="Symbol" w:hAnsi="Symbol" w:hint="default"/>
+      </w:rPr>
+    </w:lvl>
+    <w:lvl w:ilvl="7" w:tplc="04090003" w:tentative="1">
+      <w:start w:val="1"/>
+      <w:numFmt w:val="bullet"/>
+      <w:lvlText w:val="o"/>
+      <w:lvlJc w:val="left"/>
+      <w:pPr>
+        <w:ind w:left="5760" w:hanging="360"/>
+      </w:pPr>
+      <w:rPr>
+        <w:rFonts w:ascii="Courier New" w:hAnsi="Courier New" w:cs="Courier New" w:hint="default"/>
+      </w:rPr>
+    </w:lvl>
+    <w:lvl w:ilvl="8" w:tplc="04090005" w:tentative="1">
+      <w:start w:val="1"/>
+      <w:numFmt w:val="bullet"/>
+      <w:lvlText w:val=""/>
+      <w:lvlJc w:val="left"/>
+      <w:pPr>
+        <w:ind w:left="6480" w:hanging="360"/>
+      </w:pPr>
+      <w:rPr>
+        <w:rFonts w:ascii="Wingdings" w:hAnsi="Wingdings" w:hint="default"/>
+      </w:rPr>
+    </w:lvl>
+  </w:abstractNum>
+  <w:abstractNum w:abstractNumId="2" w15:restartNumberingAfterBreak="0">
+    <w:nsid w:val="1A352954"/>
+    <w:multiLevelType w:val="multilevel"/>
+    <w:tmpl w:val="47DC3E00"/>
+    <w:lvl w:ilvl="0">
+      <w:start w:val="1"/>
+      <w:numFmt w:val="bullet"/>
+      <w:lvlText w:val=""/>
+      <w:lvlJc w:val="left"/>
+      <w:pPr>
+        <w:tabs>
+          <w:tab w:val="num" w:pos="720"/>
+        </w:tabs>
+        <w:ind w:left="720" w:hanging="360"/>
+      </w:pPr>
+      <w:rPr>
+        <w:rFonts w:ascii="Symbol" w:hAnsi="Symbol" w:hint="default"/>
+        <w:sz w:val="20"/>
+      </w:rPr>
+    </w:lvl>
+    <w:lvl w:ilvl="1" w:tentative="1">
+      <w:start w:val="1"/>
+      <w:numFmt w:val="bullet"/>
+      <w:lvlText w:val="o"/>
+      <w:lvlJc w:val="left"/>
+      <w:pPr>
+        <w:tabs>
+          <w:tab w:val="num" w:pos="1440"/>
+        </w:tabs>
+        <w:ind w:left="1440" w:hanging="360"/>
+      </w:pPr>
+      <w:rPr>
+        <w:rFonts w:ascii="Courier New" w:hAnsi="Courier New" w:hint="default"/>
+        <w:sz w:val="20"/>
+      </w:rPr>
+    </w:lvl>
+    <w:lvl w:ilvl="2" w:tentative="1">
+      <w:start w:val="1"/>
+      <w:numFmt w:val="bullet"/>
+      <w:lvlText w:val=""/>
+      <w:lvlJc w:val="left"/>
+      <w:pPr>
+        <w:tabs>
+          <w:tab w:val="num" w:pos="2160"/>
+        </w:tabs>
+        <w:ind w:left="2160" w:hanging="360"/>
+      </w:pPr>
+      <w:rPr>
+        <w:rFonts w:ascii="Wingdings" w:hAnsi="Wingdings" w:hint="default"/>
+        <w:sz w:val="20"/>
+      </w:rPr>
+    </w:lvl>
+    <w:lvl w:ilvl="3" w:tentative="1">
+      <w:start w:val="1"/>
+      <w:numFmt w:val="bullet"/>
+      <w:lvlText w:val=""/>
+      <w:lvlJc w:val="left"/>
+      <w:pPr>
+        <w:tabs>
+          <w:tab w:val="num" w:pos="2880"/>
+        </w:tabs>
+        <w:ind w:left="2880" w:hanging="360"/>
+      </w:pPr>
+      <w:rPr>
+        <w:rFonts w:ascii="Wingdings" w:hAnsi="Wingdings" w:hint="default"/>
+        <w:sz w:val="20"/>
+      </w:rPr>
+    </w:lvl>
+    <w:lvl w:ilvl="4" w:tentative="1">
+      <w:start w:val="1"/>
+      <w:numFmt w:val="bullet"/>
+      <w:lvlText w:val=""/>
+      <w:lvlJc w:val="left"/>
+      <w:pPr>
+        <w:tabs>
+          <w:tab w:val="num" w:pos="3600"/>
+        </w:tabs>
+        <w:ind w:left="3600" w:hanging="360"/>
+      </w:pPr>
+      <w:rPr>
+        <w:rFonts w:ascii="Wingdings" w:hAnsi="Wingdings" w:hint="default"/>
+        <w:sz w:val="20"/>
+      </w:rPr>
+    </w:lvl>
+    <w:lvl w:ilvl="5" w:tentative="1">
+      <w:start w:val="1"/>
+      <w:numFmt w:val="bullet"/>
+      <w:lvlText w:val=""/>
+      <w:lvlJc w:val="left"/>
+      <w:pPr>
+        <w:tabs>
+          <w:tab w:val="num" w:pos="4320"/>
+        </w:tabs>
+        <w:ind w:left="4320" w:hanging="360"/>
+      </w:pPr>
+      <w:rPr>
+        <w:rFonts w:ascii="Wingdings" w:hAnsi="Wingdings" w:hint="default"/>
+        <w:sz w:val="20"/>
+      </w:rPr>
+    </w:lvl>
+    <w:lvl w:ilvl="6" w:tentative="1">
+      <w:start w:val="1"/>
+      <w:numFmt w:val="bullet"/>
+      <w:lvlText w:val=""/>
+      <w:lvlJc w:val="left"/>
+      <w:pPr>
+        <w:tabs>
+          <w:tab w:val="num" w:pos="5040"/>
+        </w:tabs>
+        <w:ind w:left="5040" w:hanging="360"/>
+      </w:pPr>
+      <w:rPr>
+        <w:rFonts w:ascii="Wingdings" w:hAnsi="Wingdings" w:hint="default"/>
+        <w:sz w:val="20"/>
+      </w:rPr>
+    </w:lvl>
+    <w:lvl w:ilvl="7" w:tentative="1">
+      <w:start w:val="1"/>
+      <w:numFmt w:val="bullet"/>
+      <w:lvlText w:val=""/>
+      <w:lvlJc w:val="left"/>
+      <w:pPr>
+        <w:tabs>
+          <w:tab w:val="num" w:pos="5760"/>
+        </w:tabs>
+        <w:ind w:left="5760" w:hanging="360"/>
+      </w:pPr>
+      <w:rPr>
+        <w:rFonts w:ascii="Wingdings" w:hAnsi="Wingdings" w:hint="default"/>
+        <w:sz w:val="20"/>
+      </w:rPr>
+    </w:lvl>
+    <w:lvl w:ilvl="8" w:tentative="1">
+      <w:start w:val="1"/>
+      <w:numFmt w:val="bullet"/>
+      <w:lvlText w:val=""/>
+      <w:lvlJc w:val="left"/>
+      <w:pPr>
+        <w:tabs>
+          <w:tab w:val="num" w:pos="6480"/>
+        </w:tabs>
+        <w:ind w:left="6480" w:hanging="360"/>
+      </w:pPr>
+      <w:rPr>
+        <w:rFonts w:ascii="Wingdings" w:hAnsi="Wingdings" w:hint="default"/>
+        <w:sz w:val="20"/>
+      </w:rPr>
+    </w:lvl>
+  </w:abstractNum>
+  <w:abstractNum w:abstractNumId="3" w15:restartNumberingAfterBreak="0">
+    <w:nsid w:val="1B0C5763"/>
+    <w:multiLevelType w:val="hybridMultilevel"/>
+    <w:tmpl w:val="5D285A1A"/>
+    <w:lvl w:ilvl="0" w:tplc="04090001">
+      <w:start w:val="1"/>
+      <w:numFmt w:val="bullet"/>
+      <w:lvlText w:val=""/>
+      <w:lvlJc w:val="left"/>
+      <w:pPr>
+        <w:ind w:left="720" w:hanging="360"/>
+      </w:pPr>
+      <w:rPr>
+        <w:rFonts w:ascii="Symbol" w:hAnsi="Symbol" w:hint="default"/>
+      </w:rPr>
+    </w:lvl>
+    <w:lvl w:ilvl="1" w:tplc="04090003" w:tentative="1">
+      <w:start w:val="1"/>
+      <w:numFmt w:val="bullet"/>
+      <w:lvlText w:val="o"/>
+      <w:lvlJc w:val="left"/>
+      <w:pPr>
+        <w:ind w:left="1440" w:hanging="360"/>
+      </w:pPr>
+      <w:rPr>
+        <w:rFonts w:ascii="Courier New" w:hAnsi="Courier New" w:cs="Courier New" w:hint="default"/>
+      </w:rPr>
+    </w:lvl>
+    <w:lvl w:ilvl="2" w:tplc="04090005" w:tentative="1">
+      <w:start w:val="1"/>
+      <w:numFmt w:val="bullet"/>
+      <w:lvlText w:val=""/>
+      <w:lvlJc w:val="left"/>
+      <w:pPr>
+        <w:ind w:left="2160" w:hanging="360"/>
+      </w:pPr>
+      <w:rPr>
+        <w:rFonts w:ascii="Wingdings" w:hAnsi="Wingdings" w:hint="default"/>
+      </w:rPr>
+    </w:lvl>
+    <w:lvl w:ilvl="3" w:tplc="04090001" w:tentative="1">
+      <w:start w:val="1"/>
+      <w:numFmt w:val="bullet"/>
+      <w:lvlText w:val=""/>
+      <w:lvlJc w:val="left"/>
+      <w:pPr>
+        <w:ind w:left="2880" w:hanging="360"/>
+      </w:pPr>
+      <w:rPr>
+        <w:rFonts w:ascii="Symbol" w:hAnsi="Symbol" w:hint="default"/>
+      </w:rPr>
+    </w:lvl>
+    <w:lvl w:ilvl="4" w:tplc="04090003" w:tentative="1">
+      <w:start w:val="1"/>
+      <w:numFmt w:val="bullet"/>
+      <w:lvlText w:val="o"/>
+      <w:lvlJc w:val="left"/>
+      <w:pPr>
+        <w:ind w:left="3600" w:hanging="360"/>
+      </w:pPr>
+      <w:rPr>
+        <w:rFonts w:ascii="Courier New" w:hAnsi="Courier New" w:cs="Courier New" w:hint="default"/>
+      </w:rPr>
+    </w:lvl>
+    <w:lvl w:ilvl="5" w:tplc="04090005" w:tentative="1">
+      <w:start w:val="1"/>
+      <w:numFmt w:val="bullet"/>
+      <w:lvlText w:val=""/>
+      <w:lvlJc w:val="left"/>
+      <w:pPr>
+        <w:ind w:left="4320" w:hanging="360"/>
+      </w:pPr>
+      <w:rPr>
+        <w:rFonts w:ascii="Wingdings" w:hAnsi="Wingdings" w:hint="default"/>
+      </w:rPr>
+    </w:lvl>
+    <w:lvl w:ilvl="6" w:tplc="04090001" w:tentative="1">
+      <w:start w:val="1"/>
+      <w:numFmt w:val="bullet"/>
+      <w:lvlText w:val=""/>
+      <w:lvlJc w:val="left"/>
+      <w:pPr>
+        <w:ind w:left="5040" w:hanging="360"/>
+      </w:pPr>
+      <w:rPr>
+        <w:rFonts w:ascii="Symbol" w:hAnsi="Symbol" w:hint="default"/>
+      </w:rPr>
+    </w:lvl>
+    <w:lvl w:ilvl="7" w:tplc="04090003" w:tentative="1">
+      <w:start w:val="1"/>
+      <w:numFmt w:val="bullet"/>
+      <w:lvlText w:val="o"/>
+      <w:lvlJc w:val="left"/>
+      <w:pPr>
+        <w:ind w:left="5760" w:hanging="360"/>
+      </w:pPr>
+      <w:rPr>
+        <w:rFonts w:ascii="Courier New" w:hAnsi="Courier New" w:cs="Courier New" w:hint="default"/>
+      </w:rPr>
+    </w:lvl>
+    <w:lvl w:ilvl="8" w:tplc="04090005" w:tentative="1">
+      <w:start w:val="1"/>
+      <w:numFmt w:val="bullet"/>
+      <w:lvlText w:val=""/>
+      <w:lvlJc w:val="left"/>
+      <w:pPr>
+        <w:ind w:left="6480" w:hanging="360"/>
+      </w:pPr>
+      <w:rPr>
+        <w:rFonts w:ascii="Wingdings" w:hAnsi="Wingdings" w:hint="default"/>
+      </w:rPr>
+    </w:lvl>
+  </w:abstractNum>
+  <w:abstractNum w:abstractNumId="4" w15:restartNumberingAfterBreak="0">
+    <w:nsid w:val="209F2DCC"/>
+    <w:multiLevelType w:val="hybridMultilevel"/>
+    <w:tmpl w:val="10C4A11E"/>
+    <w:lvl w:ilvl="0" w:tplc="04090003">
+      <w:start w:val="1"/>
+      <w:numFmt w:val="bullet"/>
+      <w:lvlText w:val="o"/>
+      <w:lvlJc w:val="left"/>
+      <w:pPr>
+        <w:ind w:left="1080" w:hanging="360"/>
+      </w:pPr>
+      <w:rPr>
+        <w:rFonts w:ascii="Courier New" w:hAnsi="Courier New" w:cs="Courier New" w:hint="default"/>
+      </w:rPr>
+    </w:lvl>
+    <w:lvl w:ilvl="1" w:tplc="04090003">
+      <w:start w:val="1"/>
+      <w:numFmt w:val="bullet"/>
+      <w:lvlText w:val="o"/>
+      <w:lvlJc w:val="left"/>
+      <w:pPr>
+        <w:ind w:left="1800" w:hanging="360"/>
+      </w:pPr>
+      <w:rPr>
+        <w:rFonts w:ascii="Courier New" w:hAnsi="Courier New" w:cs="Courier New" w:hint="default"/>
+      </w:rPr>
+    </w:lvl>
+    <w:lvl w:ilvl="2" w:tplc="04090005" w:tentative="1">
+      <w:start w:val="1"/>
+      <w:numFmt w:val="bullet"/>
+      <w:lvlText w:val=""/>
+      <w:lvlJc w:val="left"/>
+      <w:pPr>
+        <w:ind w:left="2520" w:hanging="360"/>
+      </w:pPr>
+      <w:rPr>
+        <w:rFonts w:ascii="Wingdings" w:hAnsi="Wingdings" w:hint="default"/>
+      </w:rPr>
+    </w:lvl>
+    <w:lvl w:ilvl="3" w:tplc="04090001" w:tentative="1">
+      <w:start w:val="1"/>
+      <w:numFmt w:val="bullet"/>
+      <w:lvlText w:val=""/>
+      <w:lvlJc w:val="left"/>
+      <w:pPr>
+        <w:ind w:left="3240" w:hanging="360"/>
+      </w:pPr>
+      <w:rPr>
+        <w:rFonts w:ascii="Symbol" w:hAnsi="Symbol" w:hint="default"/>
+      </w:rPr>
+    </w:lvl>
+    <w:lvl w:ilvl="4" w:tplc="04090003" w:tentative="1">
+      <w:start w:val="1"/>
+      <w:numFmt w:val="bullet"/>
+      <w:lvlText w:val="o"/>
+      <w:lvlJc w:val="left"/>
+      <w:pPr>
+        <w:ind w:left="3960" w:hanging="360"/>
+      </w:pPr>
+      <w:rPr>
+        <w:rFonts w:ascii="Courier New" w:hAnsi="Courier New" w:cs="Courier New" w:hint="default"/>
+      </w:rPr>
+    </w:lvl>
+    <w:lvl w:ilvl="5" w:tplc="04090005" w:tentative="1">
+      <w:start w:val="1"/>
+      <w:numFmt w:val="bullet"/>
+      <w:lvlText w:val=""/>
+      <w:lvlJc w:val="left"/>
+      <w:pPr>
+        <w:ind w:left="4680" w:hanging="360"/>
+      </w:pPr>
+      <w:rPr>
+        <w:rFonts w:ascii="Wingdings" w:hAnsi="Wingdings" w:hint="default"/>
+      </w:rPr>
+    </w:lvl>
+    <w:lvl w:ilvl="6" w:tplc="04090001" w:tentative="1">
+      <w:start w:val="1"/>
+      <w:numFmt w:val="bullet"/>
+      <w:lvlText w:val=""/>
+      <w:lvlJc w:val="left"/>
+      <w:pPr>
+        <w:ind w:left="5400" w:hanging="360"/>
+      </w:pPr>
+      <w:rPr>
+        <w:rFonts w:ascii="Symbol" w:hAnsi="Symbol" w:hint="default"/>
+      </w:rPr>
+    </w:lvl>
+    <w:lvl w:ilvl="7" w:tplc="04090003" w:tentative="1">
+      <w:start w:val="1"/>
+      <w:numFmt w:val="bullet"/>
+      <w:lvlText w:val="o"/>
+      <w:lvlJc w:val="left"/>
+      <w:pPr>
+        <w:ind w:left="6120" w:hanging="360"/>
+      </w:pPr>
+      <w:rPr>
+        <w:rFonts w:ascii="Courier New" w:hAnsi="Courier New" w:cs="Courier New" w:hint="default"/>
+      </w:rPr>
+    </w:lvl>
+    <w:lvl w:ilvl="8" w:tplc="04090005" w:tentative="1">
+      <w:start w:val="1"/>
+      <w:numFmt w:val="bullet"/>
+      <w:lvlText w:val=""/>
+      <w:lvlJc w:val="left"/>
+      <w:pPr>
+        <w:ind w:left="6840" w:hanging="360"/>
+      </w:pPr>
+      <w:rPr>
+        <w:rFonts w:ascii="Wingdings" w:hAnsi="Wingdings" w:hint="default"/>
+      </w:rPr>
+    </w:lvl>
+  </w:abstractNum>
+  <w:abstractNum w:abstractNumId="5" w15:restartNumberingAfterBreak="0">
+    <w:nsid w:val="45424936"/>
+    <w:multiLevelType w:val="hybridMultilevel"/>
+    <w:tmpl w:val="6ABA03B0"/>
+    <w:lvl w:ilvl="0" w:tplc="0409000F">
+      <w:start w:val="1"/>
+      <w:numFmt w:val="decimal"/>
+      <w:lvlText w:val="%1."/>
+      <w:lvlJc w:val="left"/>
+      <w:pPr>
+        <w:ind w:left="720" w:hanging="360"/>
+      </w:pPr>
+      <w:rPr>
+        <w:rFonts w:hint="default"/>
+      </w:rPr>
+    </w:lvl>
+    <w:lvl w:ilvl="1" w:tplc="04090019" w:tentative="1">
+      <w:start w:val="1"/>
+      <w:numFmt w:val="lowerLetter"/>
+      <w:lvlText w:val="%2."/>
+      <w:lvlJc w:val="left"/>
+      <w:pPr>
+        <w:ind w:left="1440" w:hanging="360"/>
+      </w:pPr>
+    </w:lvl>
+    <w:lvl w:ilvl="2" w:tplc="0409001B" w:tentative="1">
+      <w:start w:val="1"/>
+      <w:numFmt w:val="lowerRoman"/>
+      <w:lvlText w:val="%3."/>
+      <w:lvlJc w:val="right"/>
+      <w:pPr>
+        <w:ind w:left="2160" w:hanging="180"/>
+      </w:pPr>
+    </w:lvl>
+    <w:lvl w:ilvl="3" w:tplc="0409000F" w:tentative="1">
+      <w:start w:val="1"/>
+      <w:numFmt w:val="decimal"/>
+      <w:lvlText w:val="%4."/>
+      <w:lvlJc w:val="left"/>
+      <w:pPr>
+        <w:ind w:left="2880" w:hanging="360"/>
+      </w:pPr>
+    </w:lvl>
+    <w:lvl w:ilvl="4" w:tplc="04090019" w:tentative="1">
+      <w:start w:val="1"/>
+      <w:numFmt w:val="lowerLetter"/>
+      <w:lvlText w:val="%5."/>
+      <w:lvlJc w:val="left"/>
+      <w:pPr>
+        <w:ind w:left="3600" w:hanging="360"/>
+      </w:pPr>
+    </w:lvl>
+    <w:lvl w:ilvl="5" w:tplc="0409001B" w:tentative="1">
+      <w:start w:val="1"/>
+      <w:numFmt w:val="lowerRoman"/>
+      <w:lvlText w:val="%6."/>
+      <w:lvlJc w:val="right"/>
+      <w:pPr>
+        <w:ind w:left="4320" w:hanging="180"/>
+      </w:pPr>
+    </w:lvl>
+    <w:lvl w:ilvl="6" w:tplc="0409000F" w:tentative="1">
+      <w:start w:val="1"/>
+      <w:numFmt w:val="decimal"/>
+      <w:lvlText w:val="%7."/>
+      <w:lvlJc w:val="left"/>
+      <w:pPr>
+        <w:ind w:left="5040" w:hanging="360"/>
+      </w:pPr>
+    </w:lvl>
+    <w:lvl w:ilvl="7" w:tplc="04090019" w:tentative="1">
+      <w:start w:val="1"/>
+      <w:numFmt w:val="lowerLetter"/>
+      <w:lvlText w:val="%8."/>
+      <w:lvlJc w:val="left"/>
+      <w:pPr>
+        <w:ind w:left="5760" w:hanging="360"/>
+      </w:pPr>
+    </w:lvl>
+    <w:lvl w:ilvl="8" w:tplc="0409001B" w:tentative="1">
+      <w:start w:val="1"/>
+      <w:numFmt w:val="lowerRoman"/>
+      <w:lvlText w:val="%9."/>
+      <w:lvlJc w:val="right"/>
+      <w:pPr>
+        <w:ind w:left="6480" w:hanging="180"/>
+      </w:pPr>
+    </w:lvl>
+  </w:abstractNum>
+  <w:abstractNum w:abstractNumId="6" w15:restartNumberingAfterBreak="0">
+    <w:nsid w:val="581441BC"/>
+    <w:multiLevelType w:val="hybridMultilevel"/>
+    <w:tmpl w:val="6358AFE4"/>
+    <w:lvl w:ilvl="0" w:tplc="0409000F">
+      <w:start w:val="1"/>
+      <w:numFmt w:val="decimal"/>
+      <w:lvlText w:val="%1."/>
+      <w:lvlJc w:val="left"/>
+      <w:pPr>
+        <w:ind w:left="720" w:hanging="360"/>
+      </w:pPr>
+      <w:rPr>
+        <w:rFonts w:hint="default"/>
+      </w:rPr>
+    </w:lvl>
+    <w:lvl w:ilvl="1" w:tplc="04090019" w:tentative="1">
+      <w:start w:val="1"/>
+      <w:numFmt w:val="lowerLetter"/>
+      <w:lvlText w:val="%2."/>
+      <w:lvlJc w:val="left"/>
+      <w:pPr>
+        <w:ind w:left="1440" w:hanging="360"/>
+      </w:pPr>
+    </w:lvl>
+    <w:lvl w:ilvl="2" w:tplc="0409001B" w:tentative="1">
+      <w:start w:val="1"/>
+      <w:numFmt w:val="lowerRoman"/>
+      <w:lvlText w:val="%3."/>
+      <w:lvlJc w:val="right"/>
+      <w:pPr>
+        <w:ind w:left="2160" w:hanging="180"/>
+      </w:pPr>
+    </w:lvl>
+    <w:lvl w:ilvl="3" w:tplc="0409000F" w:tentative="1">
+      <w:start w:val="1"/>
+      <w:numFmt w:val="decimal"/>
+      <w:lvlText w:val="%4."/>
+      <w:lvlJc w:val="left"/>
+      <w:pPr>
+        <w:ind w:left="2880" w:hanging="360"/>
+      </w:pPr>
+    </w:lvl>
+    <w:lvl w:ilvl="4" w:tplc="04090019" w:tentative="1">
+      <w:start w:val="1"/>
+      <w:numFmt w:val="lowerLetter"/>
+      <w:lvlText w:val="%5."/>
+      <w:lvlJc w:val="left"/>
+      <w:pPr>
+        <w:ind w:left="3600" w:hanging="360"/>
+      </w:pPr>
+    </w:lvl>
+    <w:lvl w:ilvl="5" w:tplc="0409001B" w:tentative="1">
+      <w:start w:val="1"/>
+      <w:numFmt w:val="lowerRoman"/>
+      <w:lvlText w:val="%6."/>
+      <w:lvlJc w:val="right"/>
+      <w:pPr>
+        <w:ind w:left="4320" w:hanging="180"/>
+      </w:pPr>
+    </w:lvl>
+    <w:lvl w:ilvl="6" w:tplc="0409000F" w:tentative="1">
+      <w:start w:val="1"/>
+      <w:numFmt w:val="decimal"/>
+      <w:lvlText w:val="%7."/>
+      <w:lvlJc w:val="left"/>
+      <w:pPr>
+        <w:ind w:left="5040" w:hanging="360"/>
+      </w:pPr>
+    </w:lvl>
+    <w:lvl w:ilvl="7" w:tplc="04090019" w:tentative="1">
+      <w:start w:val="1"/>
+      <w:numFmt w:val="lowerLetter"/>
+      <w:lvlText w:val="%8."/>
+      <w:lvlJc w:val="left"/>
+      <w:pPr>
+        <w:ind w:left="5760" w:hanging="360"/>
+      </w:pPr>
+    </w:lvl>
+    <w:lvl w:ilvl="8" w:tplc="0409001B" w:tentative="1">
+      <w:start w:val="1"/>
+      <w:numFmt w:val="lowerRoman"/>
+      <w:lvlText w:val="%9."/>
+      <w:lvlJc w:val="right"/>
+      <w:pPr>
+        <w:ind w:left="6480" w:hanging="180"/>
+      </w:pPr>
+    </w:lvl>
+  </w:abstractNum>
+  <w:abstractNum w:abstractNumId="7" w15:restartNumberingAfterBreak="0">
     <w:nsid w:val="769D43D7"/>
     <w:multiLevelType w:val="hybridMultilevel"/>
     <w:tmpl w:val="7DB0324E"/>
@@ -7171,10 +8510,28 @@
     </w:lvl>
   </w:abstractNum>
   <w:num w:numId="1" w16cid:durableId="1428773155">
-    <w:abstractNumId w:val="1"/>
+    <w:abstractNumId w:val="7"/>
   </w:num>
   <w:num w:numId="2" w16cid:durableId="907882130">
     <w:abstractNumId w:val="0"/>
+  </w:num>
+  <w:num w:numId="3" w16cid:durableId="110131524">
+    <w:abstractNumId w:val="2"/>
+  </w:num>
+  <w:num w:numId="4" w16cid:durableId="1503624314">
+    <w:abstractNumId w:val="3"/>
+  </w:num>
+  <w:num w:numId="5" w16cid:durableId="109709526">
+    <w:abstractNumId w:val="4"/>
+  </w:num>
+  <w:num w:numId="6" w16cid:durableId="1762530085">
+    <w:abstractNumId w:val="6"/>
+  </w:num>
+  <w:num w:numId="7" w16cid:durableId="1738362479">
+    <w:abstractNumId w:val="5"/>
+  </w:num>
+  <w:num w:numId="8" w16cid:durableId="354506127">
+    <w:abstractNumId w:val="1"/>
   </w:num>
 </w:numbering>
 </file>

</xml_diff>

<commit_message>
add ai society in
</commit_message>
<xml_diff>
--- a/files/Zihan_Hei_CV.docx
+++ b/files/Zihan_Hei_CV.docx
@@ -3372,21 +3372,21 @@
         <w:tblLook w:val="04A0" w:firstRow="1" w:lastRow="0" w:firstColumn="1" w:lastColumn="0" w:noHBand="0" w:noVBand="1"/>
       </w:tblPr>
       <w:tblGrid>
-        <w:gridCol w:w="1276"/>
-        <w:gridCol w:w="426"/>
-        <w:gridCol w:w="9777"/>
-        <w:gridCol w:w="28"/>
         <w:gridCol w:w="1446"/>
+        <w:gridCol w:w="236"/>
+        <w:gridCol w:w="10059"/>
+        <w:gridCol w:w="24"/>
+        <w:gridCol w:w="1188"/>
       </w:tblGrid>
       <w:tr>
         <w:trPr>
           <w:gridAfter w:val="1"/>
-          <w:wAfter w:w="1446" w:type="dxa"/>
+          <w:wAfter w:w="1188" w:type="dxa"/>
           <w:trHeight w:val="153"/>
         </w:trPr>
         <w:tc>
           <w:tcPr>
-            <w:tcW w:w="11507" w:type="dxa"/>
+            <w:tcW w:w="11765" w:type="dxa"/>
             <w:gridSpan w:val="4"/>
           </w:tcPr>
           <w:p>
@@ -3452,12 +3452,12 @@
       <w:tr>
         <w:trPr>
           <w:gridAfter w:val="1"/>
-          <w:wAfter w:w="1446" w:type="dxa"/>
+          <w:wAfter w:w="1188" w:type="dxa"/>
           <w:trHeight w:val="144"/>
         </w:trPr>
         <w:tc>
           <w:tcPr>
-            <w:tcW w:w="1276" w:type="dxa"/>
+            <w:tcW w:w="1446" w:type="dxa"/>
             <w:tcMar>
               <w:left w:w="57" w:type="dxa"/>
             </w:tcMar>
@@ -3531,7 +3531,7 @@
         </w:tc>
         <w:tc>
           <w:tcPr>
-            <w:tcW w:w="426" w:type="dxa"/>
+            <w:tcW w:w="236" w:type="dxa"/>
             <w:tcBorders>
               <w:right w:val="single" w:sz="4" w:space="0" w:color="000000"/>
             </w:tcBorders>
@@ -3550,7 +3550,7 @@
         </w:tc>
         <w:tc>
           <w:tcPr>
-            <w:tcW w:w="9805" w:type="dxa"/>
+            <w:tcW w:w="10083" w:type="dxa"/>
             <w:gridSpan w:val="2"/>
             <w:tcBorders>
               <w:left w:val="single" w:sz="4" w:space="0" w:color="000000"/>
@@ -3744,12 +3744,12 @@
       <w:tr>
         <w:trPr>
           <w:gridAfter w:val="2"/>
-          <w:wAfter w:w="1474" w:type="dxa"/>
+          <w:wAfter w:w="1212" w:type="dxa"/>
           <w:trHeight w:val="242"/>
         </w:trPr>
         <w:tc>
           <w:tcPr>
-            <w:tcW w:w="11479" w:type="dxa"/>
+            <w:tcW w:w="11741" w:type="dxa"/>
             <w:gridSpan w:val="3"/>
           </w:tcPr>
           <w:p/>
@@ -3759,11 +3759,11 @@
       <w:tr>
         <w:trPr>
           <w:gridAfter w:val="2"/>
-          <w:wAfter w:w="1474" w:type="dxa"/>
+          <w:wAfter w:w="1212" w:type="dxa"/>
         </w:trPr>
         <w:tc>
           <w:tcPr>
-            <w:tcW w:w="11479" w:type="dxa"/>
+            <w:tcW w:w="11741" w:type="dxa"/>
             <w:gridSpan w:val="3"/>
           </w:tcPr>
           <w:p>
@@ -3794,11 +3794,11 @@
       <w:tr>
         <w:trPr>
           <w:gridBefore w:val="2"/>
-          <w:wBefore w:w="1702" w:type="dxa"/>
+          <w:wBefore w:w="1680" w:type="dxa"/>
         </w:trPr>
         <w:tc>
           <w:tcPr>
-            <w:tcW w:w="11251" w:type="dxa"/>
+            <w:tcW w:w="11273" w:type="dxa"/>
             <w:gridSpan w:val="3"/>
           </w:tcPr>
           <w:p>
@@ -3819,11 +3819,11 @@
       <w:tr>
         <w:trPr>
           <w:gridBefore w:val="2"/>
-          <w:wBefore w:w="1702" w:type="dxa"/>
+          <w:wBefore w:w="1680" w:type="dxa"/>
         </w:trPr>
         <w:tc>
           <w:tcPr>
-            <w:tcW w:w="11251" w:type="dxa"/>
+            <w:tcW w:w="11273" w:type="dxa"/>
             <w:gridSpan w:val="3"/>
             <w:tcBorders>
               <w:left w:val="single" w:sz="4" w:space="0" w:color="auto"/>
@@ -3904,11 +3904,6 @@
             <w:pPr>
               <w:pStyle w:val="NormalWeb"/>
               <w:spacing w:before="0" w:beforeAutospacing="0" w:after="0" w:afterAutospacing="0"/>
-              <w:rPr>
-                <w:rFonts w:ascii="Roboto" w:eastAsia="Times New Roman" w:hAnsi="Roboto"/>
-                <w:sz w:val="20"/>
-                <w:szCs w:val="20"/>
-              </w:rPr>
             </w:pPr>
             <w:r>
               <w:rPr>
@@ -3952,7 +3947,6 @@
             <w:pPr>
               <w:pStyle w:val="NormalWeb"/>
               <w:spacing w:before="0" w:beforeAutospacing="0" w:after="0" w:afterAutospacing="0"/>
-              <w:ind w:left="720"/>
               <w:rPr>
                 <w:rFonts w:ascii="Roboto" w:eastAsia="Times New Roman" w:hAnsi="Roboto"/>
                 <w:sz w:val="20"/>
@@ -3976,15 +3970,7 @@
                 <w:sz w:val="20"/>
                 <w:szCs w:val="20"/>
               </w:rPr>
-              <w:t>2.</w:t>
-            </w:r>
-            <w:r>
-              <w:rPr>
-                <w:rFonts w:ascii="Roboto" w:eastAsia="Times New Roman" w:hAnsi="Roboto"/>
-                <w:sz w:val="20"/>
-                <w:szCs w:val="20"/>
-              </w:rPr>
-              <w:t xml:space="preserve">    </w:t>
+              <w:t xml:space="preserve">2.    </w:t>
             </w:r>
             <w:r>
               <w:rPr>
@@ -4046,11 +4032,6 @@
             <w:pPr>
               <w:pStyle w:val="NormalWeb"/>
               <w:spacing w:before="0" w:beforeAutospacing="0" w:after="0" w:afterAutospacing="0"/>
-              <w:rPr>
-                <w:rFonts w:ascii="Roboto" w:eastAsia="Times New Roman" w:hAnsi="Roboto"/>
-                <w:sz w:val="20"/>
-                <w:szCs w:val="20"/>
-              </w:rPr>
             </w:pPr>
             <w:hyperlink r:id="rId15" w:history="1">
               <w:r>
@@ -4080,11 +4061,11 @@
       <w:tr>
         <w:trPr>
           <w:gridBefore w:val="2"/>
-          <w:wBefore w:w="1702" w:type="dxa"/>
+          <w:wBefore w:w="1680" w:type="dxa"/>
         </w:trPr>
         <w:tc>
           <w:tcPr>
-            <w:tcW w:w="11251" w:type="dxa"/>
+            <w:tcW w:w="11273" w:type="dxa"/>
             <w:gridSpan w:val="3"/>
             <w:tcBorders>
               <w:left w:val="single" w:sz="4" w:space="0" w:color="auto"/>
@@ -4094,45 +4075,19 @@
             <w:pPr>
               <w:pStyle w:val="NormalWeb"/>
               <w:spacing w:before="0" w:beforeAutospacing="0" w:after="0" w:afterAutospacing="0"/>
-              <w:ind w:left="79"/>
-              <w:rPr>
-                <w:rFonts w:ascii="Roboto" w:eastAsia="Times New Roman" w:hAnsi="Roboto"/>
-                <w:sz w:val="21"/>
-                <w:szCs w:val="21"/>
-              </w:rPr>
-            </w:pPr>
-          </w:p>
-        </w:tc>
-      </w:tr>
-      <w:tr>
-        <w:trPr>
-          <w:gridBefore w:val="2"/>
-          <w:wBefore w:w="1702" w:type="dxa"/>
-        </w:trPr>
-        <w:tc>
-          <w:tcPr>
-            <w:tcW w:w="11251" w:type="dxa"/>
-            <w:gridSpan w:val="3"/>
-            <w:tcBorders>
-              <w:left w:val="single" w:sz="4" w:space="0" w:color="auto"/>
-            </w:tcBorders>
-          </w:tcPr>
-          <w:p>
-            <w:pPr>
-              <w:pStyle w:val="NormalWeb"/>
-              <w:spacing w:before="0" w:beforeAutospacing="0" w:after="0" w:afterAutospacing="0"/>
-              <w:rPr>
-                <w:rFonts w:ascii="Roboto" w:eastAsia="Times New Roman" w:hAnsi="Roboto"/>
-                <w:sz w:val="20"/>
-                <w:szCs w:val="20"/>
-              </w:rPr>
-            </w:pPr>
-            <w:r>
-              <w:rPr>
-                <w:rFonts w:ascii="Roboto" w:eastAsia="Times New Roman" w:hAnsi="Roboto"/>
-                <w:sz w:val="20"/>
-                <w:szCs w:val="20"/>
-              </w:rPr>
+              <w:rPr>
+                <w:rFonts w:ascii="Roboto" w:eastAsia="Times New Roman" w:hAnsi="Roboto"/>
+                <w:sz w:val="20"/>
+                <w:szCs w:val="20"/>
+              </w:rPr>
+            </w:pPr>
+            <w:r>
+              <w:rPr>
+                <w:rFonts w:ascii="Roboto" w:eastAsia="Times New Roman" w:hAnsi="Roboto"/>
+                <w:sz w:val="20"/>
+                <w:szCs w:val="20"/>
+              </w:rPr>
+              <w:lastRenderedPageBreak/>
               <w:t>3.</w:t>
             </w:r>
             <w:r>
@@ -4517,11 +4472,11 @@
       <w:tr>
         <w:trPr>
           <w:gridAfter w:val="2"/>
-          <w:wAfter w:w="1474" w:type="dxa"/>
+          <w:wAfter w:w="1212" w:type="dxa"/>
         </w:trPr>
         <w:tc>
           <w:tcPr>
-            <w:tcW w:w="11479" w:type="dxa"/>
+            <w:tcW w:w="11741" w:type="dxa"/>
             <w:gridSpan w:val="3"/>
           </w:tcPr>
           <w:p>
@@ -4606,11 +4561,11 @@
       <w:tr>
         <w:trPr>
           <w:gridAfter w:val="2"/>
-          <w:wAfter w:w="1474" w:type="dxa"/>
+          <w:wAfter w:w="1212" w:type="dxa"/>
         </w:trPr>
         <w:tc>
           <w:tcPr>
-            <w:tcW w:w="11479" w:type="dxa"/>
+            <w:tcW w:w="11741" w:type="dxa"/>
             <w:gridSpan w:val="3"/>
           </w:tcPr>
           <w:p>
@@ -4630,11 +4585,11 @@
       <w:tr>
         <w:trPr>
           <w:gridAfter w:val="2"/>
-          <w:wAfter w:w="1474" w:type="dxa"/>
+          <w:wAfter w:w="1212" w:type="dxa"/>
         </w:trPr>
         <w:tc>
           <w:tcPr>
-            <w:tcW w:w="1276" w:type="dxa"/>
+            <w:tcW w:w="1446" w:type="dxa"/>
           </w:tcPr>
           <w:p>
             <w:pPr>
@@ -4660,7 +4615,7 @@
         </w:tc>
         <w:tc>
           <w:tcPr>
-            <w:tcW w:w="426" w:type="dxa"/>
+            <w:tcW w:w="236" w:type="dxa"/>
             <w:tcBorders>
               <w:right w:val="single" w:sz="4" w:space="0" w:color="000000"/>
             </w:tcBorders>
@@ -4680,7 +4635,7 @@
         </w:tc>
         <w:tc>
           <w:tcPr>
-            <w:tcW w:w="9777" w:type="dxa"/>
+            <w:tcW w:w="10059" w:type="dxa"/>
             <w:tcBorders>
               <w:left w:val="single" w:sz="4" w:space="0" w:color="000000"/>
             </w:tcBorders>
@@ -4838,11 +4793,11 @@
       <w:tr>
         <w:trPr>
           <w:gridAfter w:val="2"/>
-          <w:wAfter w:w="1474" w:type="dxa"/>
+          <w:wAfter w:w="1212" w:type="dxa"/>
         </w:trPr>
         <w:tc>
           <w:tcPr>
-            <w:tcW w:w="11479" w:type="dxa"/>
+            <w:tcW w:w="11741" w:type="dxa"/>
             <w:gridSpan w:val="3"/>
           </w:tcPr>
           <w:p>
@@ -4861,11 +4816,11 @@
       <w:tr>
         <w:trPr>
           <w:gridAfter w:val="2"/>
-          <w:wAfter w:w="1474" w:type="dxa"/>
+          <w:wAfter w:w="1212" w:type="dxa"/>
         </w:trPr>
         <w:tc>
           <w:tcPr>
-            <w:tcW w:w="1276" w:type="dxa"/>
+            <w:tcW w:w="1446" w:type="dxa"/>
           </w:tcPr>
           <w:p>
             <w:pPr>
@@ -4891,7 +4846,7 @@
         </w:tc>
         <w:tc>
           <w:tcPr>
-            <w:tcW w:w="426" w:type="dxa"/>
+            <w:tcW w:w="236" w:type="dxa"/>
             <w:tcBorders>
               <w:right w:val="single" w:sz="4" w:space="0" w:color="000000"/>
             </w:tcBorders>
@@ -4911,7 +4866,7 @@
         </w:tc>
         <w:tc>
           <w:tcPr>
-            <w:tcW w:w="9777" w:type="dxa"/>
+            <w:tcW w:w="10059" w:type="dxa"/>
             <w:tcBorders>
               <w:left w:val="single" w:sz="4" w:space="0" w:color="000000"/>
             </w:tcBorders>
@@ -5032,11 +4987,11 @@
       <w:tr>
         <w:trPr>
           <w:gridAfter w:val="2"/>
-          <w:wAfter w:w="1474" w:type="dxa"/>
+          <w:wAfter w:w="1212" w:type="dxa"/>
         </w:trPr>
         <w:tc>
           <w:tcPr>
-            <w:tcW w:w="11479" w:type="dxa"/>
+            <w:tcW w:w="11741" w:type="dxa"/>
             <w:gridSpan w:val="3"/>
           </w:tcPr>
           <w:p>
@@ -5055,11 +5010,11 @@
       <w:tr>
         <w:trPr>
           <w:gridAfter w:val="2"/>
-          <w:wAfter w:w="1474" w:type="dxa"/>
+          <w:wAfter w:w="1212" w:type="dxa"/>
         </w:trPr>
         <w:tc>
           <w:tcPr>
-            <w:tcW w:w="1276" w:type="dxa"/>
+            <w:tcW w:w="1446" w:type="dxa"/>
           </w:tcPr>
           <w:p>
             <w:pPr>
@@ -5085,7 +5040,7 @@
         </w:tc>
         <w:tc>
           <w:tcPr>
-            <w:tcW w:w="426" w:type="dxa"/>
+            <w:tcW w:w="236" w:type="dxa"/>
             <w:tcBorders>
               <w:right w:val="single" w:sz="4" w:space="0" w:color="000000"/>
             </w:tcBorders>
@@ -5105,7 +5060,7 @@
         </w:tc>
         <w:tc>
           <w:tcPr>
-            <w:tcW w:w="9777" w:type="dxa"/>
+            <w:tcW w:w="10059" w:type="dxa"/>
             <w:tcBorders>
               <w:left w:val="single" w:sz="4" w:space="0" w:color="000000"/>
             </w:tcBorders>
@@ -5176,11 +5131,11 @@
       <w:tr>
         <w:trPr>
           <w:gridAfter w:val="2"/>
-          <w:wAfter w:w="1474" w:type="dxa"/>
+          <w:wAfter w:w="1212" w:type="dxa"/>
         </w:trPr>
         <w:tc>
           <w:tcPr>
-            <w:tcW w:w="11479" w:type="dxa"/>
+            <w:tcW w:w="11741" w:type="dxa"/>
             <w:gridSpan w:val="3"/>
           </w:tcPr>
           <w:p>
@@ -5199,11 +5154,11 @@
       <w:tr>
         <w:trPr>
           <w:gridAfter w:val="2"/>
-          <w:wAfter w:w="1474" w:type="dxa"/>
+          <w:wAfter w:w="1212" w:type="dxa"/>
         </w:trPr>
         <w:tc>
           <w:tcPr>
-            <w:tcW w:w="1276" w:type="dxa"/>
+            <w:tcW w:w="1446" w:type="dxa"/>
           </w:tcPr>
           <w:p>
             <w:pPr>
@@ -5247,7 +5202,7 @@
         </w:tc>
         <w:tc>
           <w:tcPr>
-            <w:tcW w:w="426" w:type="dxa"/>
+            <w:tcW w:w="236" w:type="dxa"/>
             <w:tcBorders>
               <w:right w:val="single" w:sz="4" w:space="0" w:color="000000"/>
             </w:tcBorders>
@@ -5267,7 +5222,7 @@
         </w:tc>
         <w:tc>
           <w:tcPr>
-            <w:tcW w:w="9777" w:type="dxa"/>
+            <w:tcW w:w="10059" w:type="dxa"/>
             <w:tcBorders>
               <w:left w:val="single" w:sz="4" w:space="0" w:color="000000"/>
             </w:tcBorders>
@@ -5378,11 +5333,11 @@
       <w:tr>
         <w:trPr>
           <w:gridAfter w:val="2"/>
-          <w:wAfter w:w="1474" w:type="dxa"/>
+          <w:wAfter w:w="1212" w:type="dxa"/>
         </w:trPr>
         <w:tc>
           <w:tcPr>
-            <w:tcW w:w="11479" w:type="dxa"/>
+            <w:tcW w:w="11741" w:type="dxa"/>
             <w:gridSpan w:val="3"/>
           </w:tcPr>
           <w:p>
@@ -5467,11 +5422,11 @@
       <w:tr>
         <w:trPr>
           <w:gridAfter w:val="2"/>
-          <w:wAfter w:w="1474" w:type="dxa"/>
+          <w:wAfter w:w="1212" w:type="dxa"/>
         </w:trPr>
         <w:tc>
           <w:tcPr>
-            <w:tcW w:w="11479" w:type="dxa"/>
+            <w:tcW w:w="11741" w:type="dxa"/>
             <w:gridSpan w:val="3"/>
           </w:tcPr>
           <w:p>
@@ -5491,11 +5446,11 @@
       <w:tr>
         <w:trPr>
           <w:gridAfter w:val="2"/>
-          <w:wAfter w:w="1474" w:type="dxa"/>
+          <w:wAfter w:w="1212" w:type="dxa"/>
         </w:trPr>
         <w:tc>
           <w:tcPr>
-            <w:tcW w:w="1276" w:type="dxa"/>
+            <w:tcW w:w="1446" w:type="dxa"/>
           </w:tcPr>
           <w:p>
             <w:pPr>
@@ -5568,7 +5523,7 @@
         </w:tc>
         <w:tc>
           <w:tcPr>
-            <w:tcW w:w="426" w:type="dxa"/>
+            <w:tcW w:w="236" w:type="dxa"/>
             <w:tcBorders>
               <w:right w:val="single" w:sz="4" w:space="0" w:color="000000"/>
             </w:tcBorders>
@@ -5588,7 +5543,7 @@
         </w:tc>
         <w:tc>
           <w:tcPr>
-            <w:tcW w:w="9777" w:type="dxa"/>
+            <w:tcW w:w="10059" w:type="dxa"/>
             <w:tcBorders>
               <w:left w:val="single" w:sz="4" w:space="0" w:color="000000"/>
             </w:tcBorders>
@@ -5736,11 +5691,11 @@
       <w:tr>
         <w:trPr>
           <w:gridAfter w:val="2"/>
-          <w:wAfter w:w="1474" w:type="dxa"/>
+          <w:wAfter w:w="1212" w:type="dxa"/>
         </w:trPr>
         <w:tc>
           <w:tcPr>
-            <w:tcW w:w="11479" w:type="dxa"/>
+            <w:tcW w:w="11741" w:type="dxa"/>
             <w:gridSpan w:val="3"/>
           </w:tcPr>
           <w:p>
@@ -5759,11 +5714,11 @@
       <w:tr>
         <w:trPr>
           <w:gridAfter w:val="2"/>
-          <w:wAfter w:w="1474" w:type="dxa"/>
+          <w:wAfter w:w="1212" w:type="dxa"/>
         </w:trPr>
         <w:tc>
           <w:tcPr>
-            <w:tcW w:w="1276" w:type="dxa"/>
+            <w:tcW w:w="1446" w:type="dxa"/>
           </w:tcPr>
           <w:p>
             <w:pPr>
@@ -5828,7 +5783,7 @@
         </w:tc>
         <w:tc>
           <w:tcPr>
-            <w:tcW w:w="426" w:type="dxa"/>
+            <w:tcW w:w="236" w:type="dxa"/>
             <w:tcBorders>
               <w:right w:val="single" w:sz="4" w:space="0" w:color="000000"/>
             </w:tcBorders>
@@ -5848,7 +5803,7 @@
         </w:tc>
         <w:tc>
           <w:tcPr>
-            <w:tcW w:w="9777" w:type="dxa"/>
+            <w:tcW w:w="10059" w:type="dxa"/>
             <w:tcBorders>
               <w:left w:val="single" w:sz="4" w:space="0" w:color="000000"/>
             </w:tcBorders>
@@ -6005,11 +5960,11 @@
       <w:tr>
         <w:trPr>
           <w:gridAfter w:val="2"/>
-          <w:wAfter w:w="1474" w:type="dxa"/>
+          <w:wAfter w:w="1212" w:type="dxa"/>
         </w:trPr>
         <w:tc>
           <w:tcPr>
-            <w:tcW w:w="11479" w:type="dxa"/>
+            <w:tcW w:w="11741" w:type="dxa"/>
             <w:gridSpan w:val="3"/>
           </w:tcPr>
           <w:p>
@@ -6108,11 +6063,11 @@
       <w:tr>
         <w:trPr>
           <w:gridAfter w:val="2"/>
-          <w:wAfter w:w="1474" w:type="dxa"/>
+          <w:wAfter w:w="1212" w:type="dxa"/>
         </w:trPr>
         <w:tc>
           <w:tcPr>
-            <w:tcW w:w="11479" w:type="dxa"/>
+            <w:tcW w:w="11741" w:type="dxa"/>
             <w:gridSpan w:val="3"/>
           </w:tcPr>
           <w:p>
@@ -6132,11 +6087,11 @@
       <w:tr>
         <w:trPr>
           <w:gridAfter w:val="2"/>
-          <w:wAfter w:w="1474" w:type="dxa"/>
+          <w:wAfter w:w="1212" w:type="dxa"/>
         </w:trPr>
         <w:tc>
           <w:tcPr>
-            <w:tcW w:w="1276" w:type="dxa"/>
+            <w:tcW w:w="1446" w:type="dxa"/>
           </w:tcPr>
           <w:p>
             <w:pPr>
@@ -6209,7 +6164,7 @@
         </w:tc>
         <w:tc>
           <w:tcPr>
-            <w:tcW w:w="426" w:type="dxa"/>
+            <w:tcW w:w="236" w:type="dxa"/>
             <w:tcBorders>
               <w:right w:val="single" w:sz="4" w:space="0" w:color="000000"/>
             </w:tcBorders>
@@ -6229,7 +6184,7 @@
         </w:tc>
         <w:tc>
           <w:tcPr>
-            <w:tcW w:w="9777" w:type="dxa"/>
+            <w:tcW w:w="10059" w:type="dxa"/>
             <w:tcBorders>
               <w:left w:val="single" w:sz="4" w:space="0" w:color="000000"/>
             </w:tcBorders>
@@ -6329,11 +6284,11 @@
       <w:tr>
         <w:trPr>
           <w:gridAfter w:val="2"/>
-          <w:wAfter w:w="1474" w:type="dxa"/>
+          <w:wAfter w:w="1212" w:type="dxa"/>
         </w:trPr>
         <w:tc>
           <w:tcPr>
-            <w:tcW w:w="11479" w:type="dxa"/>
+            <w:tcW w:w="11741" w:type="dxa"/>
             <w:gridSpan w:val="3"/>
           </w:tcPr>
           <w:p>
@@ -6352,11 +6307,11 @@
       <w:tr>
         <w:trPr>
           <w:gridAfter w:val="2"/>
-          <w:wAfter w:w="1474" w:type="dxa"/>
+          <w:wAfter w:w="1212" w:type="dxa"/>
         </w:trPr>
         <w:tc>
           <w:tcPr>
-            <w:tcW w:w="1276" w:type="dxa"/>
+            <w:tcW w:w="1446" w:type="dxa"/>
           </w:tcPr>
           <w:p>
             <w:pPr>
@@ -6381,7 +6336,7 @@
         </w:tc>
         <w:tc>
           <w:tcPr>
-            <w:tcW w:w="426" w:type="dxa"/>
+            <w:tcW w:w="236" w:type="dxa"/>
             <w:tcBorders>
               <w:right w:val="single" w:sz="4" w:space="0" w:color="000000"/>
             </w:tcBorders>
@@ -6401,7 +6356,7 @@
         </w:tc>
         <w:tc>
           <w:tcPr>
-            <w:tcW w:w="9777" w:type="dxa"/>
+            <w:tcW w:w="10059" w:type="dxa"/>
             <w:tcBorders>
               <w:left w:val="single" w:sz="4" w:space="0" w:color="000000"/>
             </w:tcBorders>
@@ -6500,11 +6455,11 @@
       <w:tr>
         <w:trPr>
           <w:gridAfter w:val="2"/>
-          <w:wAfter w:w="1474" w:type="dxa"/>
+          <w:wAfter w:w="1212" w:type="dxa"/>
         </w:trPr>
         <w:tc>
           <w:tcPr>
-            <w:tcW w:w="11479" w:type="dxa"/>
+            <w:tcW w:w="11741" w:type="dxa"/>
             <w:gridSpan w:val="3"/>
           </w:tcPr>
           <w:p>
@@ -6523,11 +6478,11 @@
       <w:tr>
         <w:trPr>
           <w:gridAfter w:val="2"/>
-          <w:wAfter w:w="1474" w:type="dxa"/>
+          <w:wAfter w:w="1212" w:type="dxa"/>
         </w:trPr>
         <w:tc>
           <w:tcPr>
-            <w:tcW w:w="1276" w:type="dxa"/>
+            <w:tcW w:w="1446" w:type="dxa"/>
           </w:tcPr>
           <w:p>
             <w:pPr>
@@ -6552,7 +6507,7 @@
         </w:tc>
         <w:tc>
           <w:tcPr>
-            <w:tcW w:w="426" w:type="dxa"/>
+            <w:tcW w:w="236" w:type="dxa"/>
             <w:tcBorders>
               <w:right w:val="single" w:sz="4" w:space="0" w:color="000000"/>
             </w:tcBorders>
@@ -6572,7 +6527,7 @@
         </w:tc>
         <w:tc>
           <w:tcPr>
-            <w:tcW w:w="9777" w:type="dxa"/>
+            <w:tcW w:w="10059" w:type="dxa"/>
             <w:tcBorders>
               <w:left w:val="single" w:sz="4" w:space="0" w:color="000000"/>
             </w:tcBorders>
@@ -6630,11 +6585,11 @@
       <w:tr>
         <w:trPr>
           <w:gridAfter w:val="2"/>
-          <w:wAfter w:w="1474" w:type="dxa"/>
+          <w:wAfter w:w="1212" w:type="dxa"/>
         </w:trPr>
         <w:tc>
           <w:tcPr>
-            <w:tcW w:w="11479" w:type="dxa"/>
+            <w:tcW w:w="11741" w:type="dxa"/>
             <w:gridSpan w:val="3"/>
           </w:tcPr>
           <w:p>
@@ -6654,11 +6609,11 @@
       <w:tr>
         <w:trPr>
           <w:gridAfter w:val="2"/>
-          <w:wAfter w:w="1474" w:type="dxa"/>
+          <w:wAfter w:w="1212" w:type="dxa"/>
         </w:trPr>
         <w:tc>
           <w:tcPr>
-            <w:tcW w:w="1276" w:type="dxa"/>
+            <w:tcW w:w="1446" w:type="dxa"/>
           </w:tcPr>
           <w:p>
             <w:pPr>
@@ -6715,7 +6670,7 @@
         </w:tc>
         <w:tc>
           <w:tcPr>
-            <w:tcW w:w="426" w:type="dxa"/>
+            <w:tcW w:w="236" w:type="dxa"/>
             <w:tcBorders>
               <w:right w:val="single" w:sz="4" w:space="0" w:color="000000"/>
             </w:tcBorders>
@@ -6735,7 +6690,7 @@
         </w:tc>
         <w:tc>
           <w:tcPr>
-            <w:tcW w:w="9777" w:type="dxa"/>
+            <w:tcW w:w="10059" w:type="dxa"/>
             <w:tcBorders>
               <w:left w:val="single" w:sz="4" w:space="0" w:color="000000"/>
             </w:tcBorders>
@@ -6846,11 +6801,11 @@
       <w:tr>
         <w:trPr>
           <w:gridAfter w:val="2"/>
-          <w:wAfter w:w="1474" w:type="dxa"/>
+          <w:wAfter w:w="1212" w:type="dxa"/>
         </w:trPr>
         <w:tc>
           <w:tcPr>
-            <w:tcW w:w="11479" w:type="dxa"/>
+            <w:tcW w:w="11741" w:type="dxa"/>
             <w:gridSpan w:val="3"/>
           </w:tcPr>
           <w:p>
@@ -6869,11 +6824,11 @@
       <w:tr>
         <w:trPr>
           <w:gridAfter w:val="2"/>
-          <w:wAfter w:w="1474" w:type="dxa"/>
+          <w:wAfter w:w="1212" w:type="dxa"/>
         </w:trPr>
         <w:tc>
           <w:tcPr>
-            <w:tcW w:w="1276" w:type="dxa"/>
+            <w:tcW w:w="1446" w:type="dxa"/>
           </w:tcPr>
           <w:p>
             <w:pPr>
@@ -6898,7 +6853,7 @@
         </w:tc>
         <w:tc>
           <w:tcPr>
-            <w:tcW w:w="426" w:type="dxa"/>
+            <w:tcW w:w="236" w:type="dxa"/>
             <w:tcBorders>
               <w:right w:val="single" w:sz="4" w:space="0" w:color="000000"/>
             </w:tcBorders>
@@ -6918,7 +6873,7 @@
         </w:tc>
         <w:tc>
           <w:tcPr>
-            <w:tcW w:w="9777" w:type="dxa"/>
+            <w:tcW w:w="10059" w:type="dxa"/>
             <w:tcBorders>
               <w:left w:val="single" w:sz="4" w:space="0" w:color="000000"/>
             </w:tcBorders>
@@ -7027,11 +6982,11 @@
       <w:tr>
         <w:trPr>
           <w:gridAfter w:val="2"/>
-          <w:wAfter w:w="1474" w:type="dxa"/>
+          <w:wAfter w:w="1212" w:type="dxa"/>
         </w:trPr>
         <w:tc>
           <w:tcPr>
-            <w:tcW w:w="11479" w:type="dxa"/>
+            <w:tcW w:w="11741" w:type="dxa"/>
             <w:gridSpan w:val="3"/>
           </w:tcPr>
           <w:p>
@@ -7049,6 +7004,319 @@
               </w:rPr>
             </w:pPr>
           </w:p>
+          <w:p>
+            <w:pPr>
+              <w:pStyle w:val="NormalWeb"/>
+              <w:spacing w:before="0" w:beforeAutospacing="0" w:after="0" w:afterAutospacing="0"/>
+              <w:rPr>
+                <w:rFonts w:ascii="Roboto" w:eastAsia="Times New Roman" w:hAnsi="Roboto"/>
+                <w:b/>
+                <w:bCs/>
+                <w:color w:val="2D4239"/>
+                <w:sz w:val="32"/>
+                <w:szCs w:val="32"/>
+                <w:lang w:val="en-US"/>
+              </w:rPr>
+            </w:pPr>
+          </w:p>
+          <w:p>
+            <w:pPr>
+              <w:pStyle w:val="NormalWeb"/>
+              <w:spacing w:before="0" w:beforeAutospacing="0" w:after="0" w:afterAutospacing="0"/>
+              <w:rPr>
+                <w:rFonts w:ascii="Roboto" w:eastAsia="Times New Roman" w:hAnsi="Roboto"/>
+                <w:b/>
+                <w:bCs/>
+                <w:color w:val="2D4239"/>
+                <w:sz w:val="32"/>
+                <w:szCs w:val="32"/>
+                <w:lang w:val="en-US"/>
+              </w:rPr>
+            </w:pPr>
+            <w:r>
+              <w:rPr>
+                <w:rFonts w:ascii="Roboto" w:eastAsia="Times New Roman" w:hAnsi="Roboto"/>
+                <w:b/>
+                <w:bCs/>
+                <w:color w:val="2D4239"/>
+                <w:sz w:val="32"/>
+                <w:szCs w:val="32"/>
+              </w:rPr>
+              <w:t>Leadership &amp; Activities</w:t>
+            </w:r>
+            <w:r>
+              <w:rPr>
+                <w:rFonts w:ascii="Roboto" w:eastAsia="Times New Roman" w:hAnsi="Roboto"/>
+                <w:b/>
+                <w:bCs/>
+                <w:color w:val="2D4239"/>
+                <w:sz w:val="32"/>
+                <w:szCs w:val="32"/>
+                <w:lang w:val="en-US"/>
+              </w:rPr>
+              <w:t xml:space="preserve"> </w:t>
+            </w:r>
+          </w:p>
+          <w:p>
+            <w:pPr>
+              <w:pStyle w:val="NormalWeb"/>
+              <w:spacing w:before="0" w:beforeAutospacing="0" w:after="0" w:afterAutospacing="0"/>
+              <w:rPr>
+                <w:rFonts w:ascii="Roboto" w:eastAsia="Times New Roman" w:hAnsi="Roboto"/>
+                <w:b/>
+                <w:bCs/>
+                <w:color w:val="2D4239"/>
+                <w:sz w:val="32"/>
+                <w:szCs w:val="32"/>
+                <w:lang w:val="en-US"/>
+              </w:rPr>
+            </w:pPr>
+          </w:p>
+          <w:tbl>
+            <w:tblPr>
+              <w:tblStyle w:val="TableGrid"/>
+              <w:tblW w:w="11479" w:type="dxa"/>
+              <w:tblInd w:w="5" w:type="dxa"/>
+              <w:tblBorders>
+                <w:top w:val="none" w:sz="0" w:space="0" w:color="auto"/>
+                <w:left w:val="none" w:sz="0" w:space="0" w:color="auto"/>
+                <w:bottom w:val="none" w:sz="0" w:space="0" w:color="auto"/>
+                <w:right w:val="none" w:sz="0" w:space="0" w:color="auto"/>
+                <w:insideH w:val="none" w:sz="0" w:space="0" w:color="auto"/>
+                <w:insideV w:val="none" w:sz="0" w:space="0" w:color="auto"/>
+              </w:tblBorders>
+              <w:tblLook w:val="04A0" w:firstRow="1" w:lastRow="0" w:firstColumn="1" w:lastColumn="0" w:noHBand="0" w:noVBand="1"/>
+            </w:tblPr>
+            <w:tblGrid>
+              <w:gridCol w:w="1276"/>
+              <w:gridCol w:w="286"/>
+              <w:gridCol w:w="9917"/>
+            </w:tblGrid>
+            <w:tr>
+              <w:tc>
+                <w:tcPr>
+                  <w:tcW w:w="1276" w:type="dxa"/>
+                </w:tcPr>
+                <w:p>
+                  <w:pPr>
+                    <w:pStyle w:val="NormalWeb"/>
+                    <w:spacing w:before="0" w:beforeAutospacing="0" w:after="0" w:afterAutospacing="0"/>
+                    <w:rPr>
+                      <w:rFonts w:ascii="Roboto" w:eastAsia="Times New Roman" w:hAnsi="Roboto"/>
+                      <w:sz w:val="20"/>
+                      <w:szCs w:val="20"/>
+                      <w:lang w:val="en-US"/>
+                    </w:rPr>
+                  </w:pPr>
+                  <w:r>
+                    <w:rPr>
+                      <w:rFonts w:ascii="Roboto" w:hAnsi="Roboto" w:cs="Times New Roman (Body CS)"/>
+                      <w:sz w:val="20"/>
+                      <w:szCs w:val="20"/>
+                    </w:rPr>
+                    <w:t>SEP</w:t>
+                  </w:r>
+                  <w:r>
+                    <w:rPr>
+                      <w:rFonts w:ascii="Roboto" w:hAnsi="Roboto" w:cs="Times New Roman (Body CS)"/>
+                      <w:sz w:val="20"/>
+                      <w:szCs w:val="20"/>
+                    </w:rPr>
+                    <w:t xml:space="preserve"> 20</w:t>
+                  </w:r>
+                  <w:r>
+                    <w:rPr>
+                      <w:rFonts w:ascii="Roboto" w:hAnsi="Roboto" w:cs="Times New Roman (Body CS)"/>
+                      <w:sz w:val="20"/>
+                      <w:szCs w:val="20"/>
+                    </w:rPr>
+                    <w:t>26</w:t>
+                  </w:r>
+                  <w:r>
+                    <w:rPr>
+                      <w:rFonts w:ascii="Roboto" w:hAnsi="Roboto" w:cs="Times New Roman (Body CS)"/>
+                      <w:sz w:val="20"/>
+                      <w:szCs w:val="20"/>
+                    </w:rPr>
+                    <w:t xml:space="preserve"> - </w:t>
+                  </w:r>
+                  <w:r>
+                    <w:rPr>
+                      <w:rFonts w:ascii="Roboto" w:hAnsi="Roboto" w:cs="Times New Roman (Body CS)"/>
+                      <w:sz w:val="20"/>
+                      <w:szCs w:val="20"/>
+                    </w:rPr>
+                    <w:t>PRESENT</w:t>
+                  </w:r>
+                </w:p>
+              </w:tc>
+              <w:tc>
+                <w:tcPr>
+                  <w:tcW w:w="286" w:type="dxa"/>
+                  <w:tcBorders>
+                    <w:right w:val="single" w:sz="4" w:space="0" w:color="000000"/>
+                  </w:tcBorders>
+                </w:tcPr>
+                <w:p>
+                  <w:pPr>
+                    <w:pStyle w:val="NormalWeb"/>
+                    <w:spacing w:before="0" w:beforeAutospacing="0" w:after="0" w:afterAutospacing="0"/>
+                    <w:rPr>
+                      <w:rFonts w:ascii="Lora" w:eastAsia="Times New Roman" w:hAnsi="Lora"/>
+                      <w:sz w:val="21"/>
+                      <w:szCs w:val="21"/>
+                      <w:lang w:val="en-US"/>
+                    </w:rPr>
+                  </w:pPr>
+                </w:p>
+              </w:tc>
+              <w:tc>
+                <w:tcPr>
+                  <w:tcW w:w="9917" w:type="dxa"/>
+                  <w:tcBorders>
+                    <w:left w:val="single" w:sz="4" w:space="0" w:color="000000"/>
+                  </w:tcBorders>
+                </w:tcPr>
+                <w:p>
+                  <w:pPr>
+                    <w:rPr>
+                      <w:rFonts w:ascii="Roboto" w:hAnsi="Roboto"/>
+                      <w:b/>
+                      <w:bCs/>
+                      <w:sz w:val="26"/>
+                      <w:szCs w:val="26"/>
+                    </w:rPr>
+                  </w:pPr>
+                  <w:r>
+                    <w:rPr>
+                      <w:rFonts w:ascii="Roboto" w:hAnsi="Roboto"/>
+                      <w:b/>
+                      <w:bCs/>
+                      <w:sz w:val="26"/>
+                      <w:szCs w:val="26"/>
+                    </w:rPr>
+                    <w:t>Graphic Designer</w:t>
+                  </w:r>
+                </w:p>
+                <w:p>
+                  <w:pPr>
+                    <w:rPr>
+                      <w:rFonts w:ascii="Lora" w:eastAsia="Times New Roman" w:hAnsi="Lora"/>
+                      <w:b/>
+                      <w:i/>
+                      <w:iCs/>
+                      <w:color w:val="2D4239"/>
+                      <w:sz w:val="21"/>
+                      <w:szCs w:val="21"/>
+                      <w:lang w:val="en-US" w:eastAsia="zh-TW"/>
+                    </w:rPr>
+                  </w:pPr>
+                  <w:r>
+                    <w:rPr>
+                      <w:rFonts w:ascii="Lora" w:eastAsia="Times New Roman" w:hAnsi="Lora"/>
+                      <w:b/>
+                      <w:i/>
+                      <w:iCs/>
+                      <w:color w:val="2D4239"/>
+                      <w:sz w:val="21"/>
+                      <w:szCs w:val="21"/>
+                      <w:lang w:val="en-US" w:eastAsia="zh-TW"/>
+                    </w:rPr>
+                    <w:t>Binghamton AI Society, Binghamton University</w:t>
+                  </w:r>
+                </w:p>
+                <w:p>
+                  <w:pPr>
+                    <w:rPr>
+                      <w:rFonts w:ascii="Lora" w:eastAsia="Times New Roman" w:hAnsi="Lora"/>
+                      <w:b/>
+                      <w:color w:val="2D4239"/>
+                      <w:sz w:val="21"/>
+                      <w:szCs w:val="21"/>
+                      <w:lang w:eastAsia="zh-TW"/>
+                    </w:rPr>
+                  </w:pPr>
+                </w:p>
+                <w:p>
+                  <w:pPr>
+                    <w:pStyle w:val="ListParagraph"/>
+                    <w:numPr>
+                      <w:ilvl w:val="0"/>
+                      <w:numId w:val="1"/>
+                    </w:numPr>
+                    <w:spacing w:after="80"/>
+                    <w:ind w:left="357" w:right="567" w:hanging="357"/>
+                    <w:contextualSpacing w:val="0"/>
+                    <w:rPr>
+                      <w:rFonts w:ascii="Roboto" w:eastAsia="Times New Roman" w:hAnsi="Roboto"/>
+                      <w:bCs/>
+                      <w:sz w:val="20"/>
+                      <w:szCs w:val="20"/>
+                      <w:lang w:eastAsia="zh-TW"/>
+                    </w:rPr>
+                  </w:pPr>
+                  <w:r>
+                    <w:rPr>
+                      <w:rFonts w:ascii="Roboto" w:eastAsia="Times New Roman" w:hAnsi="Roboto"/>
+                      <w:bCs/>
+                      <w:sz w:val="20"/>
+                      <w:szCs w:val="20"/>
+                      <w:lang w:eastAsia="zh-TW"/>
+                    </w:rPr>
+                    <w:t>Design promotional graphics and event materials, including posters, to support club events, outreach, and student engagement.</w:t>
+                  </w:r>
+                </w:p>
+                <w:p>
+                  <w:pPr>
+                    <w:pStyle w:val="ListParagraph"/>
+                    <w:numPr>
+                      <w:ilvl w:val="0"/>
+                      <w:numId w:val="1"/>
+                    </w:numPr>
+                    <w:spacing w:after="80"/>
+                    <w:ind w:left="357" w:right="567" w:hanging="357"/>
+                    <w:contextualSpacing w:val="0"/>
+                    <w:rPr>
+                      <w:rFonts w:ascii="Roboto" w:eastAsia="Times New Roman" w:hAnsi="Roboto"/>
+                      <w:bCs/>
+                      <w:sz w:val="20"/>
+                      <w:szCs w:val="20"/>
+                      <w:lang w:eastAsia="zh-TW"/>
+                    </w:rPr>
+                  </w:pPr>
+                  <w:r>
+                    <w:rPr>
+                      <w:rFonts w:ascii="Roboto" w:eastAsia="Times New Roman" w:hAnsi="Roboto"/>
+                      <w:bCs/>
+                      <w:sz w:val="20"/>
+                      <w:szCs w:val="20"/>
+                      <w:lang w:eastAsia="zh-TW"/>
+                    </w:rPr>
+                    <w:t>Develop logo and branding concepts in collaboration with the executive board.</w:t>
+                  </w:r>
+                </w:p>
+              </w:tc>
+            </w:tr>
+            <w:tr>
+              <w:tc>
+                <w:tcPr>
+                  <w:tcW w:w="11479" w:type="dxa"/>
+                  <w:gridSpan w:val="3"/>
+                </w:tcPr>
+                <w:p>
+                  <w:pPr>
+                    <w:pStyle w:val="NormalWeb"/>
+                    <w:spacing w:before="0" w:beforeAutospacing="0" w:after="0" w:afterAutospacing="0"/>
+                    <w:rPr>
+                      <w:rFonts w:ascii="Lora" w:eastAsia="Times New Roman" w:hAnsi="Lora"/>
+                      <w:sz w:val="22"/>
+                      <w:szCs w:val="22"/>
+                    </w:rPr>
+                  </w:pPr>
+                </w:p>
+              </w:tc>
+            </w:tr>
+          </w:tbl>
           <w:p>
             <w:pPr>
               <w:pStyle w:val="NormalWeb"/>
@@ -7106,11 +7374,11 @@
       <w:tr>
         <w:trPr>
           <w:gridAfter w:val="2"/>
-          <w:wAfter w:w="1474" w:type="dxa"/>
+          <w:wAfter w:w="1212" w:type="dxa"/>
         </w:trPr>
         <w:tc>
           <w:tcPr>
-            <w:tcW w:w="11479" w:type="dxa"/>
+            <w:tcW w:w="11741" w:type="dxa"/>
             <w:gridSpan w:val="3"/>
           </w:tcPr>
           <w:p>
@@ -7132,11 +7400,11 @@
       <w:tr>
         <w:trPr>
           <w:gridAfter w:val="2"/>
-          <w:wAfter w:w="1474" w:type="dxa"/>
+          <w:wAfter w:w="1212" w:type="dxa"/>
         </w:trPr>
         <w:tc>
           <w:tcPr>
-            <w:tcW w:w="11479" w:type="dxa"/>
+            <w:tcW w:w="11741" w:type="dxa"/>
             <w:gridSpan w:val="3"/>
           </w:tcPr>
           <w:p>
@@ -7370,11 +7638,11 @@
       <w:tr>
         <w:trPr>
           <w:gridAfter w:val="2"/>
-          <w:wAfter w:w="1474" w:type="dxa"/>
+          <w:wAfter w:w="1212" w:type="dxa"/>
         </w:trPr>
         <w:tc>
           <w:tcPr>
-            <w:tcW w:w="11479" w:type="dxa"/>
+            <w:tcW w:w="11741" w:type="dxa"/>
             <w:gridSpan w:val="3"/>
           </w:tcPr>
           <w:p>
@@ -7394,11 +7662,11 @@
       <w:tr>
         <w:trPr>
           <w:gridAfter w:val="2"/>
-          <w:wAfter w:w="1474" w:type="dxa"/>
+          <w:wAfter w:w="1212" w:type="dxa"/>
         </w:trPr>
         <w:tc>
           <w:tcPr>
-            <w:tcW w:w="11479" w:type="dxa"/>
+            <w:tcW w:w="11741" w:type="dxa"/>
             <w:gridSpan w:val="3"/>
           </w:tcPr>
           <w:p>
@@ -7418,11 +7686,11 @@
       <w:tr>
         <w:trPr>
           <w:gridAfter w:val="2"/>
-          <w:wAfter w:w="1474" w:type="dxa"/>
+          <w:wAfter w:w="1212" w:type="dxa"/>
         </w:trPr>
         <w:tc>
           <w:tcPr>
-            <w:tcW w:w="11479" w:type="dxa"/>
+            <w:tcW w:w="11741" w:type="dxa"/>
             <w:gridSpan w:val="3"/>
           </w:tcPr>
           <w:tbl>
@@ -7440,11 +7708,11 @@
               <w:tblLook w:val="04A0" w:firstRow="1" w:lastRow="0" w:firstColumn="1" w:lastColumn="0" w:noHBand="0" w:noVBand="1"/>
             </w:tblPr>
             <w:tblGrid>
-              <w:gridCol w:w="2253"/>
-              <w:gridCol w:w="2253"/>
-              <w:gridCol w:w="2252"/>
-              <w:gridCol w:w="2252"/>
-              <w:gridCol w:w="2253"/>
+              <w:gridCol w:w="2256"/>
+              <w:gridCol w:w="2256"/>
+              <w:gridCol w:w="2256"/>
+              <w:gridCol w:w="2256"/>
+              <w:gridCol w:w="2257"/>
             </w:tblGrid>
             <w:tr>
               <w:trPr>
@@ -8219,6 +8487,155 @@
     </w:lvl>
   </w:abstractNum>
   <w:abstractNum w:abstractNumId="5" w15:restartNumberingAfterBreak="0">
+    <w:nsid w:val="24F20D17"/>
+    <w:multiLevelType w:val="multilevel"/>
+    <w:tmpl w:val="DD468A26"/>
+    <w:lvl w:ilvl="0">
+      <w:start w:val="1"/>
+      <w:numFmt w:val="bullet"/>
+      <w:lvlText w:val=""/>
+      <w:lvlJc w:val="left"/>
+      <w:pPr>
+        <w:tabs>
+          <w:tab w:val="num" w:pos="720"/>
+        </w:tabs>
+        <w:ind w:left="720" w:hanging="360"/>
+      </w:pPr>
+      <w:rPr>
+        <w:rFonts w:ascii="Symbol" w:hAnsi="Symbol" w:hint="default"/>
+        <w:sz w:val="20"/>
+      </w:rPr>
+    </w:lvl>
+    <w:lvl w:ilvl="1" w:tentative="1">
+      <w:start w:val="1"/>
+      <w:numFmt w:val="bullet"/>
+      <w:lvlText w:val="o"/>
+      <w:lvlJc w:val="left"/>
+      <w:pPr>
+        <w:tabs>
+          <w:tab w:val="num" w:pos="1440"/>
+        </w:tabs>
+        <w:ind w:left="1440" w:hanging="360"/>
+      </w:pPr>
+      <w:rPr>
+        <w:rFonts w:ascii="Courier New" w:hAnsi="Courier New" w:hint="default"/>
+        <w:sz w:val="20"/>
+      </w:rPr>
+    </w:lvl>
+    <w:lvl w:ilvl="2" w:tentative="1">
+      <w:start w:val="1"/>
+      <w:numFmt w:val="bullet"/>
+      <w:lvlText w:val=""/>
+      <w:lvlJc w:val="left"/>
+      <w:pPr>
+        <w:tabs>
+          <w:tab w:val="num" w:pos="2160"/>
+        </w:tabs>
+        <w:ind w:left="2160" w:hanging="360"/>
+      </w:pPr>
+      <w:rPr>
+        <w:rFonts w:ascii="Wingdings" w:hAnsi="Wingdings" w:hint="default"/>
+        <w:sz w:val="20"/>
+      </w:rPr>
+    </w:lvl>
+    <w:lvl w:ilvl="3" w:tentative="1">
+      <w:start w:val="1"/>
+      <w:numFmt w:val="bullet"/>
+      <w:lvlText w:val=""/>
+      <w:lvlJc w:val="left"/>
+      <w:pPr>
+        <w:tabs>
+          <w:tab w:val="num" w:pos="2880"/>
+        </w:tabs>
+        <w:ind w:left="2880" w:hanging="360"/>
+      </w:pPr>
+      <w:rPr>
+        <w:rFonts w:ascii="Wingdings" w:hAnsi="Wingdings" w:hint="default"/>
+        <w:sz w:val="20"/>
+      </w:rPr>
+    </w:lvl>
+    <w:lvl w:ilvl="4" w:tentative="1">
+      <w:start w:val="1"/>
+      <w:numFmt w:val="bullet"/>
+      <w:lvlText w:val=""/>
+      <w:lvlJc w:val="left"/>
+      <w:pPr>
+        <w:tabs>
+          <w:tab w:val="num" w:pos="3600"/>
+        </w:tabs>
+        <w:ind w:left="3600" w:hanging="360"/>
+      </w:pPr>
+      <w:rPr>
+        <w:rFonts w:ascii="Wingdings" w:hAnsi="Wingdings" w:hint="default"/>
+        <w:sz w:val="20"/>
+      </w:rPr>
+    </w:lvl>
+    <w:lvl w:ilvl="5" w:tentative="1">
+      <w:start w:val="1"/>
+      <w:numFmt w:val="bullet"/>
+      <w:lvlText w:val=""/>
+      <w:lvlJc w:val="left"/>
+      <w:pPr>
+        <w:tabs>
+          <w:tab w:val="num" w:pos="4320"/>
+        </w:tabs>
+        <w:ind w:left="4320" w:hanging="360"/>
+      </w:pPr>
+      <w:rPr>
+        <w:rFonts w:ascii="Wingdings" w:hAnsi="Wingdings" w:hint="default"/>
+        <w:sz w:val="20"/>
+      </w:rPr>
+    </w:lvl>
+    <w:lvl w:ilvl="6" w:tentative="1">
+      <w:start w:val="1"/>
+      <w:numFmt w:val="bullet"/>
+      <w:lvlText w:val=""/>
+      <w:lvlJc w:val="left"/>
+      <w:pPr>
+        <w:tabs>
+          <w:tab w:val="num" w:pos="5040"/>
+        </w:tabs>
+        <w:ind w:left="5040" w:hanging="360"/>
+      </w:pPr>
+      <w:rPr>
+        <w:rFonts w:ascii="Wingdings" w:hAnsi="Wingdings" w:hint="default"/>
+        <w:sz w:val="20"/>
+      </w:rPr>
+    </w:lvl>
+    <w:lvl w:ilvl="7" w:tentative="1">
+      <w:start w:val="1"/>
+      <w:numFmt w:val="bullet"/>
+      <w:lvlText w:val=""/>
+      <w:lvlJc w:val="left"/>
+      <w:pPr>
+        <w:tabs>
+          <w:tab w:val="num" w:pos="5760"/>
+        </w:tabs>
+        <w:ind w:left="5760" w:hanging="360"/>
+      </w:pPr>
+      <w:rPr>
+        <w:rFonts w:ascii="Wingdings" w:hAnsi="Wingdings" w:hint="default"/>
+        <w:sz w:val="20"/>
+      </w:rPr>
+    </w:lvl>
+    <w:lvl w:ilvl="8" w:tentative="1">
+      <w:start w:val="1"/>
+      <w:numFmt w:val="bullet"/>
+      <w:lvlText w:val=""/>
+      <w:lvlJc w:val="left"/>
+      <w:pPr>
+        <w:tabs>
+          <w:tab w:val="num" w:pos="6480"/>
+        </w:tabs>
+        <w:ind w:left="6480" w:hanging="360"/>
+      </w:pPr>
+      <w:rPr>
+        <w:rFonts w:ascii="Wingdings" w:hAnsi="Wingdings" w:hint="default"/>
+        <w:sz w:val="20"/>
+      </w:rPr>
+    </w:lvl>
+  </w:abstractNum>
+  <w:abstractNum w:abstractNumId="6" w15:restartNumberingAfterBreak="0">
     <w:nsid w:val="45424936"/>
     <w:multiLevelType w:val="hybridMultilevel"/>
     <w:tmpl w:val="6ABA03B0"/>
@@ -8307,7 +8724,7 @@
       </w:pPr>
     </w:lvl>
   </w:abstractNum>
-  <w:abstractNum w:abstractNumId="6" w15:restartNumberingAfterBreak="0">
+  <w:abstractNum w:abstractNumId="7" w15:restartNumberingAfterBreak="0">
     <w:nsid w:val="581441BC"/>
     <w:multiLevelType w:val="hybridMultilevel"/>
     <w:tmpl w:val="6358AFE4"/>
@@ -8396,7 +8813,7 @@
       </w:pPr>
     </w:lvl>
   </w:abstractNum>
-  <w:abstractNum w:abstractNumId="7" w15:restartNumberingAfterBreak="0">
+  <w:abstractNum w:abstractNumId="8" w15:restartNumberingAfterBreak="0">
     <w:nsid w:val="769D43D7"/>
     <w:multiLevelType w:val="hybridMultilevel"/>
     <w:tmpl w:val="7DB0324E"/>
@@ -8510,7 +8927,7 @@
     </w:lvl>
   </w:abstractNum>
   <w:num w:numId="1" w16cid:durableId="1428773155">
-    <w:abstractNumId w:val="7"/>
+    <w:abstractNumId w:val="8"/>
   </w:num>
   <w:num w:numId="2" w16cid:durableId="907882130">
     <w:abstractNumId w:val="0"/>
@@ -8525,13 +8942,16 @@
     <w:abstractNumId w:val="4"/>
   </w:num>
   <w:num w:numId="6" w16cid:durableId="1762530085">
-    <w:abstractNumId w:val="6"/>
+    <w:abstractNumId w:val="7"/>
   </w:num>
   <w:num w:numId="7" w16cid:durableId="1738362479">
-    <w:abstractNumId w:val="5"/>
+    <w:abstractNumId w:val="6"/>
   </w:num>
   <w:num w:numId="8" w16cid:durableId="354506127">
     <w:abstractNumId w:val="1"/>
+  </w:num>
+  <w:num w:numId="9" w16cid:durableId="1065300184">
+    <w:abstractNumId w:val="5"/>
   </w:num>
 </w:numbering>
 </file>
@@ -8939,7 +9359,6 @@
   <w:style w:type="character" w:default="1" w:styleId="DefaultParagraphFont">
     <w:name w:val="Default Paragraph Font"/>
     <w:uiPriority w:val="1"/>
-    <w:semiHidden/>
     <w:unhideWhenUsed/>
   </w:style>
   <w:style w:type="table" w:default="1" w:styleId="TableNormal">

</xml_diff>

<commit_message>
add ai society to cv.qmd
</commit_message>
<xml_diff>
--- a/files/Zihan_Hei_CV.docx
+++ b/files/Zihan_Hei_CV.docx
@@ -21,8 +21,8 @@
       <w:tblGrid>
         <w:gridCol w:w="568"/>
         <w:gridCol w:w="706"/>
-        <w:gridCol w:w="425"/>
-        <w:gridCol w:w="984"/>
+        <w:gridCol w:w="578"/>
+        <w:gridCol w:w="831"/>
         <w:gridCol w:w="564"/>
         <w:gridCol w:w="3817"/>
         <w:gridCol w:w="607"/>
@@ -843,7 +843,7 @@
         </w:tc>
         <w:tc>
           <w:tcPr>
-            <w:tcW w:w="425" w:type="dxa"/>
+            <w:tcW w:w="578" w:type="dxa"/>
             <w:tcBorders>
               <w:right w:val="single" w:sz="4" w:space="0" w:color="000000"/>
             </w:tcBorders>
@@ -861,7 +861,7 @@
         </w:tc>
         <w:tc>
           <w:tcPr>
-            <w:tcW w:w="9808" w:type="dxa"/>
+            <w:tcW w:w="9655" w:type="dxa"/>
             <w:gridSpan w:val="6"/>
             <w:tcBorders>
               <w:left w:val="single" w:sz="4" w:space="0" w:color="000000"/>
@@ -1135,7 +1135,7 @@
         </w:tc>
         <w:tc>
           <w:tcPr>
-            <w:tcW w:w="425" w:type="dxa"/>
+            <w:tcW w:w="578" w:type="dxa"/>
             <w:tcBorders>
               <w:right w:val="single" w:sz="4" w:space="0" w:color="000000"/>
             </w:tcBorders>
@@ -1154,7 +1154,7 @@
         </w:tc>
         <w:tc>
           <w:tcPr>
-            <w:tcW w:w="9808" w:type="dxa"/>
+            <w:tcW w:w="9655" w:type="dxa"/>
             <w:gridSpan w:val="6"/>
             <w:tcBorders>
               <w:left w:val="single" w:sz="4" w:space="0" w:color="000000"/>
@@ -1269,51 +1269,7 @@
                 <w:szCs w:val="20"/>
                 <w:lang w:eastAsia="zh-TW"/>
               </w:rPr>
-              <w:t>Reproduce and validate RNA-</w:t>
-            </w:r>
-            <w:proofErr w:type="spellStart"/>
-            <w:r>
-              <w:rPr>
-                <w:rFonts w:ascii="Roboto" w:eastAsia="Times New Roman" w:hAnsi="Roboto"/>
-                <w:bCs/>
-                <w:sz w:val="20"/>
-                <w:szCs w:val="20"/>
-                <w:lang w:eastAsia="zh-TW"/>
-              </w:rPr>
-              <w:t>seq</w:t>
-            </w:r>
-            <w:proofErr w:type="spellEnd"/>
-            <w:r>
-              <w:rPr>
-                <w:rFonts w:ascii="Roboto" w:eastAsia="Times New Roman" w:hAnsi="Roboto"/>
-                <w:bCs/>
-                <w:sz w:val="20"/>
-                <w:szCs w:val="20"/>
-                <w:lang w:eastAsia="zh-TW"/>
-              </w:rPr>
-              <w:t xml:space="preserve"> and single-cell RNA-</w:t>
-            </w:r>
-            <w:proofErr w:type="spellStart"/>
-            <w:r>
-              <w:rPr>
-                <w:rFonts w:ascii="Roboto" w:eastAsia="Times New Roman" w:hAnsi="Roboto"/>
-                <w:bCs/>
-                <w:sz w:val="20"/>
-                <w:szCs w:val="20"/>
-                <w:lang w:eastAsia="zh-TW"/>
-              </w:rPr>
-              <w:t>seq</w:t>
-            </w:r>
-            <w:proofErr w:type="spellEnd"/>
-            <w:r>
-              <w:rPr>
-                <w:rFonts w:ascii="Roboto" w:eastAsia="Times New Roman" w:hAnsi="Roboto"/>
-                <w:bCs/>
-                <w:sz w:val="20"/>
-                <w:szCs w:val="20"/>
-                <w:lang w:eastAsia="zh-TW"/>
-              </w:rPr>
-              <w:t xml:space="preserve"> preprocessing workflows, including quality control, normalization, gene filtering, and highly variable gene selection. </w:t>
+              <w:t xml:space="preserve">Reproduce and validate RNA-seq and single-cell RNA-seq preprocessing workflows, including quality control, normalization, gene filtering, and highly variable gene selection. </w:t>
             </w:r>
           </w:p>
           <w:p>
@@ -1373,23 +1329,23 @@
         </w:tc>
         <w:tc>
           <w:tcPr>
-            <w:tcW w:w="425" w:type="dxa"/>
-          </w:tcPr>
-          <w:p>
-            <w:pPr>
-              <w:rPr>
-                <w:rFonts w:ascii="Lora" w:eastAsia="Times New Roman" w:hAnsi="Lora"/>
-                <w:b/>
-                <w:sz w:val="21"/>
-                <w:szCs w:val="21"/>
-                <w:lang w:eastAsia="zh-TW"/>
-              </w:rPr>
-            </w:pPr>
-          </w:p>
-        </w:tc>
-        <w:tc>
-          <w:tcPr>
-            <w:tcW w:w="9808" w:type="dxa"/>
+            <w:tcW w:w="578" w:type="dxa"/>
+          </w:tcPr>
+          <w:p>
+            <w:pPr>
+              <w:rPr>
+                <w:rFonts w:ascii="Lora" w:eastAsia="Times New Roman" w:hAnsi="Lora"/>
+                <w:b/>
+                <w:sz w:val="21"/>
+                <w:szCs w:val="21"/>
+                <w:lang w:eastAsia="zh-TW"/>
+              </w:rPr>
+            </w:pPr>
+          </w:p>
+        </w:tc>
+        <w:tc>
+          <w:tcPr>
+            <w:tcW w:w="9655" w:type="dxa"/>
             <w:gridSpan w:val="6"/>
           </w:tcPr>
           <w:p>
@@ -1470,7 +1426,7 @@
         </w:tc>
         <w:tc>
           <w:tcPr>
-            <w:tcW w:w="425" w:type="dxa"/>
+            <w:tcW w:w="578" w:type="dxa"/>
             <w:tcBorders>
               <w:right w:val="single" w:sz="4" w:space="0" w:color="000000"/>
             </w:tcBorders>
@@ -1489,7 +1445,7 @@
         </w:tc>
         <w:tc>
           <w:tcPr>
-            <w:tcW w:w="9808" w:type="dxa"/>
+            <w:tcW w:w="9655" w:type="dxa"/>
             <w:gridSpan w:val="6"/>
             <w:tcBorders>
               <w:left w:val="single" w:sz="4" w:space="0" w:color="000000"/>
@@ -1538,23 +1494,8 @@
                 <w:szCs w:val="21"/>
                 <w:lang w:eastAsia="zh-TW"/>
               </w:rPr>
-              <w:t xml:space="preserve">Independent Study with Dr. Heather </w:t>
-            </w:r>
-            <w:proofErr w:type="spellStart"/>
-            <w:r>
-              <w:rPr>
-                <w:rFonts w:ascii="Lora" w:eastAsia="Times New Roman" w:hAnsi="Lora"/>
-                <w:b/>
-                <w:i/>
-                <w:iCs/>
-                <w:color w:val="2D4239"/>
-                <w:sz w:val="21"/>
-                <w:szCs w:val="21"/>
-                <w:lang w:eastAsia="zh-TW"/>
-              </w:rPr>
-              <w:t>Orom</w:t>
-            </w:r>
-            <w:proofErr w:type="spellEnd"/>
+              <w:t>Independent Study with Dr. Heather Orom</w:t>
+            </w:r>
             <w:r>
               <w:rPr>
                 <w:rFonts w:ascii="Lora" w:eastAsia="Times New Roman" w:hAnsi="Lora"/>
@@ -1709,29 +1650,7 @@
                 <w:szCs w:val="20"/>
                 <w:lang w:eastAsia="zh-TW"/>
               </w:rPr>
-              <w:t xml:space="preserve">Clean, recode, and score sociodemographic, psychological, health </w:t>
-            </w:r>
-            <w:proofErr w:type="spellStart"/>
-            <w:r>
-              <w:rPr>
-                <w:rFonts w:ascii="Roboto" w:eastAsia="Times New Roman" w:hAnsi="Roboto"/>
-                <w:bCs/>
-                <w:sz w:val="20"/>
-                <w:szCs w:val="20"/>
-                <w:lang w:eastAsia="zh-TW"/>
-              </w:rPr>
-              <w:t>behavior</w:t>
-            </w:r>
-            <w:proofErr w:type="spellEnd"/>
-            <w:r>
-              <w:rPr>
-                <w:rFonts w:ascii="Roboto" w:eastAsia="Times New Roman" w:hAnsi="Roboto"/>
-                <w:bCs/>
-                <w:sz w:val="20"/>
-                <w:szCs w:val="20"/>
-                <w:lang w:eastAsia="zh-TW"/>
-              </w:rPr>
-              <w:t>, and media-use variables in R</w:t>
+              <w:t>Clean, recode, and score sociodemographic, psychological, health behavior, and media-use variables in R</w:t>
             </w:r>
             <w:r>
               <w:rPr>
@@ -1868,7 +1787,7 @@
         </w:tc>
         <w:tc>
           <w:tcPr>
-            <w:tcW w:w="425" w:type="dxa"/>
+            <w:tcW w:w="578" w:type="dxa"/>
             <w:tcBorders>
               <w:right w:val="single" w:sz="4" w:space="0" w:color="000000"/>
             </w:tcBorders>
@@ -1887,7 +1806,7 @@
         </w:tc>
         <w:tc>
           <w:tcPr>
-            <w:tcW w:w="9808" w:type="dxa"/>
+            <w:tcW w:w="9655" w:type="dxa"/>
             <w:gridSpan w:val="6"/>
             <w:tcBorders>
               <w:left w:val="single" w:sz="4" w:space="0" w:color="000000"/>
@@ -2190,7 +2109,7 @@
         </w:tc>
         <w:tc>
           <w:tcPr>
-            <w:tcW w:w="425" w:type="dxa"/>
+            <w:tcW w:w="578" w:type="dxa"/>
             <w:tcBorders>
               <w:right w:val="single" w:sz="4" w:space="0" w:color="000000"/>
             </w:tcBorders>
@@ -2209,7 +2128,7 @@
         </w:tc>
         <w:tc>
           <w:tcPr>
-            <w:tcW w:w="9808" w:type="dxa"/>
+            <w:tcW w:w="9655" w:type="dxa"/>
             <w:gridSpan w:val="6"/>
             <w:tcBorders>
               <w:left w:val="single" w:sz="4" w:space="0" w:color="000000"/>
@@ -2466,7 +2385,7 @@
         </w:tc>
         <w:tc>
           <w:tcPr>
-            <w:tcW w:w="425" w:type="dxa"/>
+            <w:tcW w:w="578" w:type="dxa"/>
             <w:tcBorders>
               <w:right w:val="single" w:sz="4" w:space="0" w:color="000000"/>
             </w:tcBorders>
@@ -2485,7 +2404,7 @@
         </w:tc>
         <w:tc>
           <w:tcPr>
-            <w:tcW w:w="9808" w:type="dxa"/>
+            <w:tcW w:w="9655" w:type="dxa"/>
             <w:gridSpan w:val="6"/>
             <w:tcBorders>
               <w:left w:val="single" w:sz="4" w:space="0" w:color="000000"/>
@@ -2833,7 +2752,7 @@
         </w:tc>
         <w:tc>
           <w:tcPr>
-            <w:tcW w:w="425" w:type="dxa"/>
+            <w:tcW w:w="578" w:type="dxa"/>
             <w:tcBorders>
               <w:right w:val="single" w:sz="4" w:space="0" w:color="000000"/>
             </w:tcBorders>
@@ -2852,7 +2771,7 @@
         </w:tc>
         <w:tc>
           <w:tcPr>
-            <w:tcW w:w="9808" w:type="dxa"/>
+            <w:tcW w:w="9655" w:type="dxa"/>
             <w:gridSpan w:val="6"/>
             <w:tcBorders>
               <w:left w:val="single" w:sz="4" w:space="0" w:color="000000"/>
@@ -3115,7 +3034,7 @@
         </w:tc>
         <w:tc>
           <w:tcPr>
-            <w:tcW w:w="425" w:type="dxa"/>
+            <w:tcW w:w="578" w:type="dxa"/>
             <w:tcBorders>
               <w:right w:val="single" w:sz="4" w:space="0" w:color="000000"/>
             </w:tcBorders>
@@ -3134,7 +3053,7 @@
         </w:tc>
         <w:tc>
           <w:tcPr>
-            <w:tcW w:w="9808" w:type="dxa"/>
+            <w:tcW w:w="9655" w:type="dxa"/>
             <w:gridSpan w:val="6"/>
             <w:tcBorders>
               <w:left w:val="single" w:sz="4" w:space="0" w:color="000000"/>
@@ -3372,22 +3291,23 @@
         <w:tblLook w:val="04A0" w:firstRow="1" w:lastRow="0" w:firstColumn="1" w:lastColumn="0" w:noHBand="0" w:noVBand="1"/>
       </w:tblPr>
       <w:tblGrid>
-        <w:gridCol w:w="1446"/>
-        <w:gridCol w:w="236"/>
-        <w:gridCol w:w="10059"/>
-        <w:gridCol w:w="24"/>
-        <w:gridCol w:w="1188"/>
+        <w:gridCol w:w="1558"/>
+        <w:gridCol w:w="114"/>
+        <w:gridCol w:w="122"/>
+        <w:gridCol w:w="10163"/>
+        <w:gridCol w:w="21"/>
+        <w:gridCol w:w="975"/>
       </w:tblGrid>
       <w:tr>
         <w:trPr>
           <w:gridAfter w:val="1"/>
-          <w:wAfter w:w="1188" w:type="dxa"/>
+          <w:wAfter w:w="975" w:type="dxa"/>
           <w:trHeight w:val="153"/>
         </w:trPr>
         <w:tc>
           <w:tcPr>
-            <w:tcW w:w="11765" w:type="dxa"/>
-            <w:gridSpan w:val="4"/>
+            <w:tcW w:w="11978" w:type="dxa"/>
+            <w:gridSpan w:val="5"/>
           </w:tcPr>
           <w:p>
             <w:pPr>
@@ -3452,12 +3372,12 @@
       <w:tr>
         <w:trPr>
           <w:gridAfter w:val="1"/>
-          <w:wAfter w:w="1188" w:type="dxa"/>
+          <w:wAfter w:w="975" w:type="dxa"/>
           <w:trHeight w:val="144"/>
         </w:trPr>
         <w:tc>
           <w:tcPr>
-            <w:tcW w:w="1446" w:type="dxa"/>
+            <w:tcW w:w="1558" w:type="dxa"/>
             <w:tcMar>
               <w:left w:w="57" w:type="dxa"/>
             </w:tcMar>
@@ -3532,6 +3452,7 @@
         <w:tc>
           <w:tcPr>
             <w:tcW w:w="236" w:type="dxa"/>
+            <w:gridSpan w:val="2"/>
             <w:tcBorders>
               <w:right w:val="single" w:sz="4" w:space="0" w:color="000000"/>
             </w:tcBorders>
@@ -3550,7 +3471,7 @@
         </w:tc>
         <w:tc>
           <w:tcPr>
-            <w:tcW w:w="10083" w:type="dxa"/>
+            <w:tcW w:w="10184" w:type="dxa"/>
             <w:gridSpan w:val="2"/>
             <w:tcBorders>
               <w:left w:val="single" w:sz="4" w:space="0" w:color="000000"/>
@@ -3744,13 +3665,13 @@
       <w:tr>
         <w:trPr>
           <w:gridAfter w:val="2"/>
-          <w:wAfter w:w="1212" w:type="dxa"/>
+          <w:wAfter w:w="996" w:type="dxa"/>
           <w:trHeight w:val="242"/>
         </w:trPr>
         <w:tc>
           <w:tcPr>
-            <w:tcW w:w="11741" w:type="dxa"/>
-            <w:gridSpan w:val="3"/>
+            <w:tcW w:w="11957" w:type="dxa"/>
+            <w:gridSpan w:val="4"/>
           </w:tcPr>
           <w:p/>
           <w:p/>
@@ -3759,12 +3680,12 @@
       <w:tr>
         <w:trPr>
           <w:gridAfter w:val="2"/>
-          <w:wAfter w:w="1212" w:type="dxa"/>
+          <w:wAfter w:w="996" w:type="dxa"/>
         </w:trPr>
         <w:tc>
           <w:tcPr>
-            <w:tcW w:w="11741" w:type="dxa"/>
-            <w:gridSpan w:val="3"/>
+            <w:tcW w:w="11957" w:type="dxa"/>
+            <w:gridSpan w:val="4"/>
           </w:tcPr>
           <w:p>
             <w:pPr>
@@ -3794,12 +3715,12 @@
       <w:tr>
         <w:trPr>
           <w:gridBefore w:val="2"/>
-          <w:wBefore w:w="1680" w:type="dxa"/>
+          <w:wBefore w:w="1672" w:type="dxa"/>
         </w:trPr>
         <w:tc>
           <w:tcPr>
-            <w:tcW w:w="11273" w:type="dxa"/>
-            <w:gridSpan w:val="3"/>
+            <w:tcW w:w="11281" w:type="dxa"/>
+            <w:gridSpan w:val="4"/>
           </w:tcPr>
           <w:p>
             <w:pPr>
@@ -3818,12 +3739,12 @@
       </w:tr>
       <w:tr>
         <w:trPr>
-          <w:gridBefore w:val="2"/>
-          <w:wBefore w:w="1680" w:type="dxa"/>
+          <w:gridBefore w:val="3"/>
+          <w:wBefore w:w="1794" w:type="dxa"/>
         </w:trPr>
         <w:tc>
           <w:tcPr>
-            <w:tcW w:w="11273" w:type="dxa"/>
+            <w:tcW w:w="11159" w:type="dxa"/>
             <w:gridSpan w:val="3"/>
             <w:tcBorders>
               <w:left w:val="single" w:sz="4" w:space="0" w:color="auto"/>
@@ -3879,25 +3800,7 @@
                 <w:sz w:val="20"/>
                 <w:szCs w:val="20"/>
               </w:rPr>
-              <w:t xml:space="preserve">, </w:t>
-            </w:r>
-            <w:proofErr w:type="spellStart"/>
-            <w:r>
-              <w:rPr>
-                <w:rFonts w:ascii="Roboto" w:eastAsia="Times New Roman" w:hAnsi="Roboto"/>
-                <w:sz w:val="20"/>
-                <w:szCs w:val="20"/>
-              </w:rPr>
-              <w:t>Panzik</w:t>
-            </w:r>
-            <w:proofErr w:type="spellEnd"/>
-            <w:r>
-              <w:rPr>
-                <w:rFonts w:ascii="Roboto" w:eastAsia="Times New Roman" w:hAnsi="Roboto"/>
-                <w:sz w:val="20"/>
-                <w:szCs w:val="20"/>
-              </w:rPr>
-              <w:t>, J., Wolfe, P., &amp; Fegley, M. (2026).</w:t>
+              <w:t>, Panzik, J., Wolfe, P., &amp; Fegley, M. (2026).</w:t>
             </w:r>
           </w:p>
           <w:p>
@@ -4041,31 +3944,20 @@
                   <w:sz w:val="20"/>
                   <w:szCs w:val="20"/>
                 </w:rPr>
-                <w:t>shanemccarty.github.io/</w:t>
+                <w:t>shanemccarty.github.io/FRImindsets</w:t>
               </w:r>
-              <w:proofErr w:type="spellStart"/>
-              <w:r>
-                <w:rPr>
-                  <w:rStyle w:val="Hyperlink"/>
-                  <w:rFonts w:ascii="Roboto" w:eastAsia="Times New Roman" w:hAnsi="Roboto"/>
-                  <w:sz w:val="20"/>
-                  <w:szCs w:val="20"/>
-                </w:rPr>
-                <w:t>FRImindsets</w:t>
-              </w:r>
-              <w:proofErr w:type="spellEnd"/>
             </w:hyperlink>
           </w:p>
         </w:tc>
       </w:tr>
       <w:tr>
         <w:trPr>
-          <w:gridBefore w:val="2"/>
-          <w:wBefore w:w="1680" w:type="dxa"/>
+          <w:gridBefore w:val="3"/>
+          <w:wBefore w:w="1794" w:type="dxa"/>
         </w:trPr>
         <w:tc>
           <w:tcPr>
-            <w:tcW w:w="11273" w:type="dxa"/>
+            <w:tcW w:w="11159" w:type="dxa"/>
             <w:gridSpan w:val="3"/>
             <w:tcBorders>
               <w:left w:val="single" w:sz="4" w:space="0" w:color="auto"/>
@@ -4441,29 +4333,7 @@
                   <w:szCs w:val="20"/>
                   <w:lang w:val="en-US"/>
                 </w:rPr>
-                <w:t>shanemccarty.github.io/</w:t>
-              </w:r>
-              <w:proofErr w:type="spellStart"/>
-              <w:r>
-                <w:rPr>
-                  <w:rStyle w:val="Hyperlink"/>
-                  <w:rFonts w:ascii="Roboto" w:eastAsia="Times New Roman" w:hAnsi="Roboto"/>
-                  <w:sz w:val="20"/>
-                  <w:szCs w:val="20"/>
-                  <w:lang w:val="en-US"/>
-                </w:rPr>
-                <w:t>FRIplaybook</w:t>
-              </w:r>
-              <w:proofErr w:type="spellEnd"/>
-              <w:r>
-                <w:rPr>
-                  <w:rStyle w:val="Hyperlink"/>
-                  <w:rFonts w:ascii="Roboto" w:eastAsia="Times New Roman" w:hAnsi="Roboto"/>
-                  <w:sz w:val="20"/>
-                  <w:szCs w:val="20"/>
-                  <w:lang w:val="en-US"/>
-                </w:rPr>
-                <w:t>/</w:t>
+                <w:t>shanemccarty.github.io/FRIplaybook/</w:t>
               </w:r>
             </w:hyperlink>
           </w:p>
@@ -4472,12 +4342,12 @@
       <w:tr>
         <w:trPr>
           <w:gridAfter w:val="2"/>
-          <w:wAfter w:w="1212" w:type="dxa"/>
+          <w:wAfter w:w="996" w:type="dxa"/>
         </w:trPr>
         <w:tc>
           <w:tcPr>
-            <w:tcW w:w="11741" w:type="dxa"/>
-            <w:gridSpan w:val="3"/>
+            <w:tcW w:w="11957" w:type="dxa"/>
+            <w:gridSpan w:val="4"/>
           </w:tcPr>
           <w:p>
             <w:pPr>
@@ -4561,12 +4431,12 @@
       <w:tr>
         <w:trPr>
           <w:gridAfter w:val="2"/>
-          <w:wAfter w:w="1212" w:type="dxa"/>
+          <w:wAfter w:w="996" w:type="dxa"/>
         </w:trPr>
         <w:tc>
           <w:tcPr>
-            <w:tcW w:w="11741" w:type="dxa"/>
-            <w:gridSpan w:val="3"/>
+            <w:tcW w:w="11957" w:type="dxa"/>
+            <w:gridSpan w:val="4"/>
           </w:tcPr>
           <w:p>
             <w:pPr>
@@ -4585,11 +4455,11 @@
       <w:tr>
         <w:trPr>
           <w:gridAfter w:val="2"/>
-          <w:wAfter w:w="1212" w:type="dxa"/>
+          <w:wAfter w:w="996" w:type="dxa"/>
         </w:trPr>
         <w:tc>
           <w:tcPr>
-            <w:tcW w:w="1446" w:type="dxa"/>
+            <w:tcW w:w="1558" w:type="dxa"/>
           </w:tcPr>
           <w:p>
             <w:pPr>
@@ -4616,6 +4486,7 @@
         <w:tc>
           <w:tcPr>
             <w:tcW w:w="236" w:type="dxa"/>
+            <w:gridSpan w:val="2"/>
             <w:tcBorders>
               <w:right w:val="single" w:sz="4" w:space="0" w:color="000000"/>
             </w:tcBorders>
@@ -4635,7 +4506,7 @@
         </w:tc>
         <w:tc>
           <w:tcPr>
-            <w:tcW w:w="10059" w:type="dxa"/>
+            <w:tcW w:w="10163" w:type="dxa"/>
             <w:tcBorders>
               <w:left w:val="single" w:sz="4" w:space="0" w:color="000000"/>
             </w:tcBorders>
@@ -4793,12 +4664,12 @@
       <w:tr>
         <w:trPr>
           <w:gridAfter w:val="2"/>
-          <w:wAfter w:w="1212" w:type="dxa"/>
+          <w:wAfter w:w="996" w:type="dxa"/>
         </w:trPr>
         <w:tc>
           <w:tcPr>
-            <w:tcW w:w="11741" w:type="dxa"/>
-            <w:gridSpan w:val="3"/>
+            <w:tcW w:w="11957" w:type="dxa"/>
+            <w:gridSpan w:val="4"/>
           </w:tcPr>
           <w:p>
             <w:pPr>
@@ -4816,11 +4687,11 @@
       <w:tr>
         <w:trPr>
           <w:gridAfter w:val="2"/>
-          <w:wAfter w:w="1212" w:type="dxa"/>
+          <w:wAfter w:w="996" w:type="dxa"/>
         </w:trPr>
         <w:tc>
           <w:tcPr>
-            <w:tcW w:w="1446" w:type="dxa"/>
+            <w:tcW w:w="1558" w:type="dxa"/>
           </w:tcPr>
           <w:p>
             <w:pPr>
@@ -4847,6 +4718,7 @@
         <w:tc>
           <w:tcPr>
             <w:tcW w:w="236" w:type="dxa"/>
+            <w:gridSpan w:val="2"/>
             <w:tcBorders>
               <w:right w:val="single" w:sz="4" w:space="0" w:color="000000"/>
             </w:tcBorders>
@@ -4866,7 +4738,7 @@
         </w:tc>
         <w:tc>
           <w:tcPr>
-            <w:tcW w:w="10059" w:type="dxa"/>
+            <w:tcW w:w="10163" w:type="dxa"/>
             <w:tcBorders>
               <w:left w:val="single" w:sz="4" w:space="0" w:color="000000"/>
             </w:tcBorders>
@@ -4957,29 +4829,7 @@
                 <w:szCs w:val="20"/>
                 <w:lang w:eastAsia="zh-TW"/>
               </w:rPr>
-              <w:t xml:space="preserve">Invited presentation; McCarty, S., Hei, Z., Rualo, G., </w:t>
-            </w:r>
-            <w:proofErr w:type="spellStart"/>
-            <w:r>
-              <w:rPr>
-                <w:rFonts w:ascii="Roboto" w:eastAsia="Times New Roman" w:hAnsi="Roboto"/>
-                <w:bCs/>
-                <w:sz w:val="20"/>
-                <w:szCs w:val="20"/>
-                <w:lang w:eastAsia="zh-TW"/>
-              </w:rPr>
-              <w:t>Khalap</w:t>
-            </w:r>
-            <w:proofErr w:type="spellEnd"/>
-            <w:r>
-              <w:rPr>
-                <w:rFonts w:ascii="Roboto" w:eastAsia="Times New Roman" w:hAnsi="Roboto"/>
-                <w:bCs/>
-                <w:sz w:val="20"/>
-                <w:szCs w:val="20"/>
-                <w:lang w:eastAsia="zh-TW"/>
-              </w:rPr>
-              <w:t>, I., &amp; Giallella, J.</w:t>
+              <w:t>Invited presentation; McCarty, S., Hei, Z., Rualo, G., Khalap, I., &amp; Giallella, J.</w:t>
             </w:r>
           </w:p>
         </w:tc>
@@ -4987,12 +4837,12 @@
       <w:tr>
         <w:trPr>
           <w:gridAfter w:val="2"/>
-          <w:wAfter w:w="1212" w:type="dxa"/>
+          <w:wAfter w:w="996" w:type="dxa"/>
         </w:trPr>
         <w:tc>
           <w:tcPr>
-            <w:tcW w:w="11741" w:type="dxa"/>
-            <w:gridSpan w:val="3"/>
+            <w:tcW w:w="11957" w:type="dxa"/>
+            <w:gridSpan w:val="4"/>
           </w:tcPr>
           <w:p>
             <w:pPr>
@@ -5010,11 +4860,11 @@
       <w:tr>
         <w:trPr>
           <w:gridAfter w:val="2"/>
-          <w:wAfter w:w="1212" w:type="dxa"/>
+          <w:wAfter w:w="996" w:type="dxa"/>
         </w:trPr>
         <w:tc>
           <w:tcPr>
-            <w:tcW w:w="1446" w:type="dxa"/>
+            <w:tcW w:w="1558" w:type="dxa"/>
           </w:tcPr>
           <w:p>
             <w:pPr>
@@ -5041,6 +4891,7 @@
         <w:tc>
           <w:tcPr>
             <w:tcW w:w="236" w:type="dxa"/>
+            <w:gridSpan w:val="2"/>
             <w:tcBorders>
               <w:right w:val="single" w:sz="4" w:space="0" w:color="000000"/>
             </w:tcBorders>
@@ -5060,7 +4911,7 @@
         </w:tc>
         <w:tc>
           <w:tcPr>
-            <w:tcW w:w="10059" w:type="dxa"/>
+            <w:tcW w:w="10163" w:type="dxa"/>
             <w:tcBorders>
               <w:left w:val="single" w:sz="4" w:space="0" w:color="000000"/>
             </w:tcBorders>
@@ -5131,12 +4982,12 @@
       <w:tr>
         <w:trPr>
           <w:gridAfter w:val="2"/>
-          <w:wAfter w:w="1212" w:type="dxa"/>
+          <w:wAfter w:w="996" w:type="dxa"/>
         </w:trPr>
         <w:tc>
           <w:tcPr>
-            <w:tcW w:w="11741" w:type="dxa"/>
-            <w:gridSpan w:val="3"/>
+            <w:tcW w:w="11957" w:type="dxa"/>
+            <w:gridSpan w:val="4"/>
           </w:tcPr>
           <w:p>
             <w:pPr>
@@ -5154,11 +5005,11 @@
       <w:tr>
         <w:trPr>
           <w:gridAfter w:val="2"/>
-          <w:wAfter w:w="1212" w:type="dxa"/>
+          <w:wAfter w:w="996" w:type="dxa"/>
         </w:trPr>
         <w:tc>
           <w:tcPr>
-            <w:tcW w:w="1446" w:type="dxa"/>
+            <w:tcW w:w="1558" w:type="dxa"/>
           </w:tcPr>
           <w:p>
             <w:pPr>
@@ -5203,6 +5054,7 @@
         <w:tc>
           <w:tcPr>
             <w:tcW w:w="236" w:type="dxa"/>
+            <w:gridSpan w:val="2"/>
             <w:tcBorders>
               <w:right w:val="single" w:sz="4" w:space="0" w:color="000000"/>
             </w:tcBorders>
@@ -5222,7 +5074,7 @@
         </w:tc>
         <w:tc>
           <w:tcPr>
-            <w:tcW w:w="10059" w:type="dxa"/>
+            <w:tcW w:w="10163" w:type="dxa"/>
             <w:tcBorders>
               <w:left w:val="single" w:sz="4" w:space="0" w:color="000000"/>
             </w:tcBorders>
@@ -5333,12 +5185,12 @@
       <w:tr>
         <w:trPr>
           <w:gridAfter w:val="2"/>
-          <w:wAfter w:w="1212" w:type="dxa"/>
+          <w:wAfter w:w="996" w:type="dxa"/>
         </w:trPr>
         <w:tc>
           <w:tcPr>
-            <w:tcW w:w="11741" w:type="dxa"/>
-            <w:gridSpan w:val="3"/>
+            <w:tcW w:w="11957" w:type="dxa"/>
+            <w:gridSpan w:val="4"/>
           </w:tcPr>
           <w:p>
             <w:pPr>
@@ -5422,12 +5274,12 @@
       <w:tr>
         <w:trPr>
           <w:gridAfter w:val="2"/>
-          <w:wAfter w:w="1212" w:type="dxa"/>
+          <w:wAfter w:w="996" w:type="dxa"/>
         </w:trPr>
         <w:tc>
           <w:tcPr>
-            <w:tcW w:w="11741" w:type="dxa"/>
-            <w:gridSpan w:val="3"/>
+            <w:tcW w:w="11957" w:type="dxa"/>
+            <w:gridSpan w:val="4"/>
           </w:tcPr>
           <w:p>
             <w:pPr>
@@ -5446,11 +5298,11 @@
       <w:tr>
         <w:trPr>
           <w:gridAfter w:val="2"/>
-          <w:wAfter w:w="1212" w:type="dxa"/>
+          <w:wAfter w:w="996" w:type="dxa"/>
         </w:trPr>
         <w:tc>
           <w:tcPr>
-            <w:tcW w:w="1446" w:type="dxa"/>
+            <w:tcW w:w="1558" w:type="dxa"/>
           </w:tcPr>
           <w:p>
             <w:pPr>
@@ -5524,6 +5376,7 @@
         <w:tc>
           <w:tcPr>
             <w:tcW w:w="236" w:type="dxa"/>
+            <w:gridSpan w:val="2"/>
             <w:tcBorders>
               <w:right w:val="single" w:sz="4" w:space="0" w:color="000000"/>
             </w:tcBorders>
@@ -5543,7 +5396,7 @@
         </w:tc>
         <w:tc>
           <w:tcPr>
-            <w:tcW w:w="10059" w:type="dxa"/>
+            <w:tcW w:w="10163" w:type="dxa"/>
             <w:tcBorders>
               <w:left w:val="single" w:sz="4" w:space="0" w:color="000000"/>
             </w:tcBorders>
@@ -5691,12 +5544,12 @@
       <w:tr>
         <w:trPr>
           <w:gridAfter w:val="2"/>
-          <w:wAfter w:w="1212" w:type="dxa"/>
+          <w:wAfter w:w="996" w:type="dxa"/>
         </w:trPr>
         <w:tc>
           <w:tcPr>
-            <w:tcW w:w="11741" w:type="dxa"/>
-            <w:gridSpan w:val="3"/>
+            <w:tcW w:w="11957" w:type="dxa"/>
+            <w:gridSpan w:val="4"/>
           </w:tcPr>
           <w:p>
             <w:pPr>
@@ -5714,11 +5567,11 @@
       <w:tr>
         <w:trPr>
           <w:gridAfter w:val="2"/>
-          <w:wAfter w:w="1212" w:type="dxa"/>
+          <w:wAfter w:w="996" w:type="dxa"/>
         </w:trPr>
         <w:tc>
           <w:tcPr>
-            <w:tcW w:w="1446" w:type="dxa"/>
+            <w:tcW w:w="1558" w:type="dxa"/>
           </w:tcPr>
           <w:p>
             <w:pPr>
@@ -5784,6 +5637,7 @@
         <w:tc>
           <w:tcPr>
             <w:tcW w:w="236" w:type="dxa"/>
+            <w:gridSpan w:val="2"/>
             <w:tcBorders>
               <w:right w:val="single" w:sz="4" w:space="0" w:color="000000"/>
             </w:tcBorders>
@@ -5803,7 +5657,7 @@
         </w:tc>
         <w:tc>
           <w:tcPr>
-            <w:tcW w:w="10059" w:type="dxa"/>
+            <w:tcW w:w="10163" w:type="dxa"/>
             <w:tcBorders>
               <w:left w:val="single" w:sz="4" w:space="0" w:color="000000"/>
             </w:tcBorders>
@@ -5930,29 +5784,7 @@
                 <w:szCs w:val="20"/>
                 <w:lang w:eastAsia="zh-TW"/>
               </w:rPr>
-              <w:t xml:space="preserve">Implemented </w:t>
-            </w:r>
-            <w:proofErr w:type="spellStart"/>
-            <w:r>
-              <w:rPr>
-                <w:rFonts w:ascii="Roboto" w:eastAsia="Times New Roman" w:hAnsi="Roboto"/>
-                <w:bCs/>
-                <w:sz w:val="20"/>
-                <w:szCs w:val="20"/>
-                <w:lang w:eastAsia="zh-TW"/>
-              </w:rPr>
-              <w:t>PyTorch</w:t>
-            </w:r>
-            <w:proofErr w:type="spellEnd"/>
-            <w:r>
-              <w:rPr>
-                <w:rFonts w:ascii="Roboto" w:eastAsia="Times New Roman" w:hAnsi="Roboto"/>
-                <w:bCs/>
-                <w:sz w:val="20"/>
-                <w:szCs w:val="20"/>
-                <w:lang w:eastAsia="zh-TW"/>
-              </w:rPr>
-              <w:t xml:space="preserve"> reinforcement-learning agents for Tic-Tac-Toe and Connect Four through self-play and visualized training performance.</w:t>
+              <w:t>Implemented PyTorch reinforcement-learning agents for Tic-Tac-Toe and Connect Four through self-play and visualized training performance.</w:t>
             </w:r>
           </w:p>
         </w:tc>
@@ -5960,12 +5792,12 @@
       <w:tr>
         <w:trPr>
           <w:gridAfter w:val="2"/>
-          <w:wAfter w:w="1212" w:type="dxa"/>
+          <w:wAfter w:w="996" w:type="dxa"/>
         </w:trPr>
         <w:tc>
           <w:tcPr>
-            <w:tcW w:w="11741" w:type="dxa"/>
-            <w:gridSpan w:val="3"/>
+            <w:tcW w:w="11957" w:type="dxa"/>
+            <w:gridSpan w:val="4"/>
           </w:tcPr>
           <w:p>
             <w:pPr>
@@ -5985,7 +5817,21 @@
           <w:p>
             <w:pPr>
               <w:pStyle w:val="NormalWeb"/>
-              <w:spacing w:before="0" w:beforeAutospacing="0" w:after="0" w:afterAutospacing="0" w:line="276" w:lineRule="auto"/>
+              <w:spacing w:before="0" w:beforeAutospacing="0" w:after="0" w:afterAutospacing="0"/>
+              <w:rPr>
+                <w:rFonts w:ascii="Roboto" w:eastAsia="Times New Roman" w:hAnsi="Roboto"/>
+                <w:b/>
+                <w:bCs/>
+                <w:color w:val="2D4239"/>
+                <w:sz w:val="32"/>
+                <w:szCs w:val="32"/>
+              </w:rPr>
+            </w:pPr>
+          </w:p>
+          <w:p>
+            <w:pPr>
+              <w:pStyle w:val="NormalWeb"/>
+              <w:spacing w:before="0" w:beforeAutospacing="0" w:after="0" w:afterAutospacing="0"/>
               <w:rPr>
                 <w:rFonts w:ascii="Roboto" w:eastAsia="Times New Roman" w:hAnsi="Roboto"/>
                 <w:b/>
@@ -5996,19 +5842,17 @@
                 <w:lang w:val="en-US"/>
               </w:rPr>
             </w:pPr>
-          </w:p>
-          <w:p>
-            <w:pPr>
-              <w:pStyle w:val="NormalWeb"/>
-              <w:spacing w:before="0" w:beforeAutospacing="0" w:after="0" w:afterAutospacing="0" w:line="276" w:lineRule="auto"/>
-              <w:rPr>
-                <w:rFonts w:ascii="Roboto" w:eastAsia="Times New Roman" w:hAnsi="Roboto"/>
-                <w:color w:val="2D4239"/>
-                <w:sz w:val="28"/>
-                <w:szCs w:val="28"/>
-                <w:lang w:val="en-US"/>
-              </w:rPr>
-            </w:pPr>
+            <w:r>
+              <w:rPr>
+                <w:rFonts w:ascii="Roboto" w:eastAsia="Times New Roman" w:hAnsi="Roboto"/>
+                <w:b/>
+                <w:bCs/>
+                <w:color w:val="2D4239"/>
+                <w:sz w:val="32"/>
+                <w:szCs w:val="32"/>
+              </w:rPr>
+              <w:t>Leadership &amp; Activities</w:t>
+            </w:r>
             <w:r>
               <w:rPr>
                 <w:rFonts w:ascii="Roboto" w:eastAsia="Times New Roman" w:hAnsi="Roboto"/>
@@ -6019,9 +5863,13 @@
                 <w:szCs w:val="32"/>
                 <w:lang w:val="en-US"/>
               </w:rPr>
-              <w:t>Awards</w:t>
-            </w:r>
-            <w:r>
+              <w:t xml:space="preserve"> </w:t>
+            </w:r>
+          </w:p>
+          <w:p>
+            <w:pPr>
+              <w:pStyle w:val="NormalWeb"/>
+              <w:spacing w:before="0" w:beforeAutospacing="0" w:after="0" w:afterAutospacing="0"/>
               <w:rPr>
                 <w:rFonts w:ascii="Roboto" w:eastAsia="Times New Roman" w:hAnsi="Roboto"/>
                 <w:b/>
@@ -6031,1052 +5879,12 @@
                 <w:szCs w:val="32"/>
                 <w:lang w:val="en-US"/>
               </w:rPr>
-              <w:t xml:space="preserve">, </w:t>
-            </w:r>
-            <w:r>
-              <w:rPr>
-                <w:rFonts w:ascii="Roboto" w:eastAsia="Times New Roman" w:hAnsi="Roboto"/>
-                <w:b/>
-                <w:bCs/>
-                <w:color w:val="2D4239"/>
-                <w:sz w:val="32"/>
-                <w:szCs w:val="32"/>
-                <w:lang w:val="en-US"/>
-              </w:rPr>
-              <w:t>Honors</w:t>
-            </w:r>
-            <w:r>
-              <w:rPr>
-                <w:rFonts w:ascii="Roboto" w:eastAsia="Times New Roman" w:hAnsi="Roboto"/>
-                <w:b/>
-                <w:bCs/>
-                <w:color w:val="2D4239"/>
-                <w:sz w:val="32"/>
-                <w:szCs w:val="32"/>
-                <w:lang w:val="en-US"/>
-              </w:rPr>
-              <w:t xml:space="preserve"> &amp; Scholarships</w:t>
-            </w:r>
-          </w:p>
-        </w:tc>
-      </w:tr>
-      <w:tr>
-        <w:trPr>
-          <w:gridAfter w:val="2"/>
-          <w:wAfter w:w="1212" w:type="dxa"/>
-        </w:trPr>
-        <w:tc>
-          <w:tcPr>
-            <w:tcW w:w="11741" w:type="dxa"/>
-            <w:gridSpan w:val="3"/>
-          </w:tcPr>
-          <w:p>
-            <w:pPr>
-              <w:pStyle w:val="NormalWeb"/>
-              <w:spacing w:before="0" w:beforeAutospacing="0" w:after="0" w:afterAutospacing="0" w:line="276" w:lineRule="auto"/>
-              <w:rPr>
-                <w:rFonts w:ascii="Roboto" w:eastAsia="Times New Roman" w:hAnsi="Roboto"/>
-                <w:sz w:val="20"/>
-                <w:szCs w:val="20"/>
-                <w:lang w:val="en-US"/>
-              </w:rPr>
-            </w:pPr>
-          </w:p>
-        </w:tc>
-      </w:tr>
-      <w:tr>
-        <w:trPr>
-          <w:gridAfter w:val="2"/>
-          <w:wAfter w:w="1212" w:type="dxa"/>
-        </w:trPr>
-        <w:tc>
-          <w:tcPr>
-            <w:tcW w:w="1446" w:type="dxa"/>
-          </w:tcPr>
-          <w:p>
-            <w:pPr>
-              <w:pStyle w:val="NormalWeb"/>
-              <w:spacing w:before="0" w:beforeAutospacing="0" w:after="0" w:afterAutospacing="0"/>
-              <w:rPr>
-                <w:rFonts w:ascii="Roboto" w:eastAsia="Times New Roman" w:hAnsi="Roboto"/>
-                <w:sz w:val="20"/>
-                <w:szCs w:val="20"/>
-                <w:lang w:val="en-US"/>
-              </w:rPr>
-            </w:pPr>
-            <w:r>
-              <w:rPr>
-                <w:rFonts w:ascii="Roboto" w:hAnsi="Roboto" w:cs="Times New Roman (Body CS)"/>
-                <w:sz w:val="20"/>
-                <w:szCs w:val="20"/>
-              </w:rPr>
-              <w:t>FEB</w:t>
-            </w:r>
-            <w:r>
-              <w:rPr>
-                <w:rFonts w:ascii="Roboto" w:hAnsi="Roboto" w:cs="Times New Roman (Body CS)"/>
-                <w:sz w:val="20"/>
-                <w:szCs w:val="20"/>
-              </w:rPr>
-              <w:t xml:space="preserve"> 20</w:t>
-            </w:r>
-            <w:r>
-              <w:rPr>
-                <w:rFonts w:ascii="Roboto" w:hAnsi="Roboto" w:cs="Times New Roman (Body CS)"/>
-                <w:sz w:val="20"/>
-                <w:szCs w:val="20"/>
-              </w:rPr>
-              <w:t>26</w:t>
-            </w:r>
-            <w:r>
-              <w:rPr>
-                <w:rFonts w:ascii="Roboto" w:hAnsi="Roboto" w:cs="Times New Roman (Body CS)"/>
-                <w:sz w:val="20"/>
-                <w:szCs w:val="20"/>
-              </w:rPr>
-              <w:t xml:space="preserve"> - </w:t>
-            </w:r>
-            <w:r>
-              <w:rPr>
-                <w:rFonts w:ascii="Roboto" w:hAnsi="Roboto" w:cs="Times New Roman (Body CS)"/>
-                <w:sz w:val="20"/>
-                <w:szCs w:val="20"/>
-              </w:rPr>
-              <w:t>FEB</w:t>
-            </w:r>
-            <w:r>
-              <w:rPr>
-                <w:rFonts w:ascii="Roboto" w:hAnsi="Roboto" w:cs="Times New Roman (Body CS)"/>
-                <w:sz w:val="20"/>
-                <w:szCs w:val="20"/>
-              </w:rPr>
-              <w:t xml:space="preserve"> 202</w:t>
-            </w:r>
-            <w:r>
-              <w:rPr>
-                <w:rFonts w:ascii="Roboto" w:hAnsi="Roboto" w:cs="Times New Roman (Body CS)"/>
-                <w:sz w:val="20"/>
-                <w:szCs w:val="20"/>
-              </w:rPr>
-              <w:t>7</w:t>
-            </w:r>
-          </w:p>
-        </w:tc>
-        <w:tc>
-          <w:tcPr>
-            <w:tcW w:w="236" w:type="dxa"/>
-            <w:tcBorders>
-              <w:right w:val="single" w:sz="4" w:space="0" w:color="000000"/>
-            </w:tcBorders>
-          </w:tcPr>
-          <w:p>
-            <w:pPr>
-              <w:pStyle w:val="NormalWeb"/>
-              <w:spacing w:before="0" w:beforeAutospacing="0" w:after="0" w:afterAutospacing="0"/>
-              <w:rPr>
-                <w:rFonts w:ascii="Lora" w:eastAsia="Times New Roman" w:hAnsi="Lora"/>
-                <w:sz w:val="21"/>
-                <w:szCs w:val="21"/>
-                <w:lang w:val="en-US"/>
-              </w:rPr>
-            </w:pPr>
-          </w:p>
-        </w:tc>
-        <w:tc>
-          <w:tcPr>
-            <w:tcW w:w="10059" w:type="dxa"/>
-            <w:tcBorders>
-              <w:left w:val="single" w:sz="4" w:space="0" w:color="000000"/>
-            </w:tcBorders>
-          </w:tcPr>
-          <w:p>
-            <w:pPr>
-              <w:rPr>
-                <w:rFonts w:ascii="Roboto" w:hAnsi="Roboto"/>
-                <w:b/>
-                <w:bCs/>
-                <w:sz w:val="26"/>
-                <w:szCs w:val="26"/>
-              </w:rPr>
-            </w:pPr>
-            <w:r>
-              <w:rPr>
-                <w:rFonts w:ascii="Roboto" w:hAnsi="Roboto"/>
-                <w:b/>
-                <w:bCs/>
-                <w:sz w:val="26"/>
-                <w:szCs w:val="26"/>
-              </w:rPr>
-              <w:t>NSF Research Experiences for Undergraduates (REU) Research Stipend Recipient</w:t>
-            </w:r>
-          </w:p>
-          <w:p>
-            <w:pPr>
-              <w:rPr>
-                <w:rFonts w:ascii="Lora" w:eastAsia="Times New Roman" w:hAnsi="Lora"/>
-                <w:b/>
-                <w:i/>
-                <w:iCs/>
-                <w:color w:val="2D4239"/>
-                <w:sz w:val="21"/>
-                <w:szCs w:val="21"/>
-                <w:lang w:eastAsia="zh-TW"/>
-              </w:rPr>
-            </w:pPr>
-            <w:r>
-              <w:rPr>
-                <w:rFonts w:ascii="Lora" w:eastAsia="Times New Roman" w:hAnsi="Lora"/>
-                <w:b/>
-                <w:i/>
-                <w:iCs/>
-                <w:color w:val="2D4239"/>
-                <w:sz w:val="21"/>
-                <w:szCs w:val="21"/>
-                <w:lang w:eastAsia="zh-TW"/>
-              </w:rPr>
-              <w:t>Binghamton University</w:t>
-            </w:r>
-          </w:p>
-          <w:p>
-            <w:pPr>
-              <w:rPr>
-                <w:rFonts w:ascii="Lora" w:eastAsia="Times New Roman" w:hAnsi="Lora"/>
-                <w:b/>
-                <w:color w:val="2D4239"/>
-                <w:sz w:val="21"/>
-                <w:szCs w:val="21"/>
-                <w:lang w:eastAsia="zh-TW"/>
-              </w:rPr>
-            </w:pPr>
-          </w:p>
-          <w:p>
-            <w:pPr>
-              <w:pStyle w:val="ListParagraph"/>
-              <w:numPr>
-                <w:ilvl w:val="0"/>
-                <w:numId w:val="1"/>
-              </w:numPr>
-              <w:spacing w:after="80"/>
-              <w:ind w:left="357" w:right="567" w:hanging="357"/>
-              <w:contextualSpacing w:val="0"/>
-              <w:rPr>
-                <w:rFonts w:ascii="Roboto" w:eastAsia="Times New Roman" w:hAnsi="Roboto"/>
-                <w:bCs/>
-                <w:sz w:val="20"/>
-                <w:szCs w:val="20"/>
-                <w:lang w:eastAsia="zh-TW"/>
-              </w:rPr>
-            </w:pPr>
-            <w:r>
-              <w:rPr>
-                <w:rFonts w:ascii="Roboto" w:eastAsia="Times New Roman" w:hAnsi="Roboto"/>
-                <w:bCs/>
-                <w:sz w:val="20"/>
-                <w:szCs w:val="20"/>
-                <w:lang w:eastAsia="zh-TW"/>
-              </w:rPr>
-              <w:lastRenderedPageBreak/>
-              <w:t>Year-long research stipend supporting transcriptomic biomarker discovery and validation in chemo-immunotherapy with Dr. Nancy Guo.</w:t>
-            </w:r>
-          </w:p>
-        </w:tc>
-      </w:tr>
-      <w:tr>
-        <w:trPr>
-          <w:gridAfter w:val="2"/>
-          <w:wAfter w:w="1212" w:type="dxa"/>
-        </w:trPr>
-        <w:tc>
-          <w:tcPr>
-            <w:tcW w:w="11741" w:type="dxa"/>
-            <w:gridSpan w:val="3"/>
-          </w:tcPr>
-          <w:p>
-            <w:pPr>
-              <w:pStyle w:val="NormalWeb"/>
-              <w:spacing w:before="0" w:beforeAutospacing="0" w:after="0" w:afterAutospacing="0"/>
-              <w:rPr>
-                <w:rFonts w:ascii="Lora" w:eastAsia="Times New Roman" w:hAnsi="Lora"/>
-                <w:sz w:val="22"/>
-                <w:szCs w:val="22"/>
-              </w:rPr>
-            </w:pPr>
-          </w:p>
-        </w:tc>
-      </w:tr>
-      <w:tr>
-        <w:trPr>
-          <w:gridAfter w:val="2"/>
-          <w:wAfter w:w="1212" w:type="dxa"/>
-        </w:trPr>
-        <w:tc>
-          <w:tcPr>
-            <w:tcW w:w="1446" w:type="dxa"/>
-          </w:tcPr>
-          <w:p>
-            <w:pPr>
-              <w:pStyle w:val="NormalWeb"/>
-              <w:spacing w:before="0" w:beforeAutospacing="0" w:after="0" w:afterAutospacing="0"/>
-              <w:rPr>
-                <w:rFonts w:ascii="Roboto" w:eastAsia="Times New Roman" w:hAnsi="Roboto"/>
-                <w:sz w:val="20"/>
-                <w:szCs w:val="20"/>
-                <w:lang w:val="en-US"/>
-              </w:rPr>
-            </w:pPr>
-            <w:r>
-              <w:rPr>
-                <w:rFonts w:ascii="Roboto" w:hAnsi="Roboto" w:cs="Times New Roman (Body CS)"/>
-                <w:sz w:val="20"/>
-                <w:szCs w:val="20"/>
-              </w:rPr>
-              <w:t>SUMMER 2026</w:t>
-            </w:r>
-          </w:p>
-        </w:tc>
-        <w:tc>
-          <w:tcPr>
-            <w:tcW w:w="236" w:type="dxa"/>
-            <w:tcBorders>
-              <w:right w:val="single" w:sz="4" w:space="0" w:color="000000"/>
-            </w:tcBorders>
-          </w:tcPr>
-          <w:p>
-            <w:pPr>
-              <w:pStyle w:val="NormalWeb"/>
-              <w:spacing w:before="0" w:beforeAutospacing="0" w:after="0" w:afterAutospacing="0"/>
-              <w:rPr>
-                <w:rFonts w:ascii="Lora" w:eastAsia="Times New Roman" w:hAnsi="Lora"/>
-                <w:sz w:val="21"/>
-                <w:szCs w:val="21"/>
-                <w:lang w:val="en-US"/>
-              </w:rPr>
-            </w:pPr>
-          </w:p>
-        </w:tc>
-        <w:tc>
-          <w:tcPr>
-            <w:tcW w:w="10059" w:type="dxa"/>
-            <w:tcBorders>
-              <w:left w:val="single" w:sz="4" w:space="0" w:color="000000"/>
-            </w:tcBorders>
-          </w:tcPr>
-          <w:p>
-            <w:pPr>
-              <w:rPr>
-                <w:rFonts w:ascii="Roboto" w:hAnsi="Roboto"/>
-                <w:b/>
-                <w:bCs/>
-                <w:sz w:val="26"/>
-                <w:szCs w:val="26"/>
-              </w:rPr>
-            </w:pPr>
-            <w:r>
-              <w:rPr>
-                <w:rFonts w:ascii="Roboto" w:hAnsi="Roboto"/>
-                <w:b/>
-                <w:bCs/>
-                <w:sz w:val="26"/>
-                <w:szCs w:val="26"/>
-              </w:rPr>
-              <w:t>Fleishman Internship Funding Award</w:t>
-            </w:r>
-          </w:p>
-          <w:p>
-            <w:pPr>
-              <w:rPr>
-                <w:rFonts w:ascii="Lora" w:eastAsia="Times New Roman" w:hAnsi="Lora"/>
-                <w:b/>
-                <w:i/>
-                <w:iCs/>
-                <w:color w:val="2D4239"/>
-                <w:sz w:val="21"/>
-                <w:szCs w:val="21"/>
-                <w:lang w:eastAsia="zh-TW"/>
-              </w:rPr>
-            </w:pPr>
-            <w:r>
-              <w:rPr>
-                <w:rFonts w:ascii="Lora" w:eastAsia="Times New Roman" w:hAnsi="Lora"/>
-                <w:b/>
-                <w:i/>
-                <w:iCs/>
-                <w:color w:val="2D4239"/>
-                <w:sz w:val="21"/>
-                <w:szCs w:val="21"/>
-                <w:lang w:eastAsia="zh-TW"/>
-              </w:rPr>
-              <w:t>Binghamton University</w:t>
-            </w:r>
-          </w:p>
-          <w:p>
-            <w:pPr>
-              <w:rPr>
-                <w:rFonts w:ascii="Lora" w:eastAsia="Times New Roman" w:hAnsi="Lora"/>
-                <w:b/>
-                <w:color w:val="2D4239"/>
-                <w:sz w:val="21"/>
-                <w:szCs w:val="21"/>
-                <w:lang w:eastAsia="zh-TW"/>
-              </w:rPr>
-            </w:pPr>
-          </w:p>
-          <w:p>
-            <w:pPr>
-              <w:pStyle w:val="ListParagraph"/>
-              <w:numPr>
-                <w:ilvl w:val="0"/>
-                <w:numId w:val="1"/>
-              </w:numPr>
-              <w:spacing w:after="80"/>
-              <w:ind w:left="357" w:right="567" w:hanging="357"/>
-              <w:contextualSpacing w:val="0"/>
-              <w:rPr>
-                <w:rFonts w:ascii="Roboto" w:eastAsia="Times New Roman" w:hAnsi="Roboto"/>
-                <w:bCs/>
-                <w:sz w:val="20"/>
-                <w:szCs w:val="20"/>
-                <w:lang w:eastAsia="zh-TW"/>
-              </w:rPr>
-            </w:pPr>
-            <w:r>
-              <w:rPr>
-                <w:rFonts w:ascii="Roboto" w:eastAsia="Times New Roman" w:hAnsi="Roboto"/>
-                <w:bCs/>
-                <w:sz w:val="20"/>
-                <w:szCs w:val="20"/>
-                <w:lang w:eastAsia="zh-TW"/>
-              </w:rPr>
-              <w:t>Awarded summer internship funding to support a quantitative research internship with the First-year Research Immersion (FRI) program.</w:t>
-            </w:r>
-          </w:p>
-        </w:tc>
-      </w:tr>
-      <w:tr>
-        <w:trPr>
-          <w:gridAfter w:val="2"/>
-          <w:wAfter w:w="1212" w:type="dxa"/>
-        </w:trPr>
-        <w:tc>
-          <w:tcPr>
-            <w:tcW w:w="11741" w:type="dxa"/>
-            <w:gridSpan w:val="3"/>
-          </w:tcPr>
-          <w:p>
-            <w:pPr>
-              <w:pStyle w:val="NormalWeb"/>
-              <w:spacing w:before="0" w:beforeAutospacing="0" w:after="0" w:afterAutospacing="0"/>
-              <w:rPr>
-                <w:rFonts w:ascii="Lora" w:eastAsia="Times New Roman" w:hAnsi="Lora"/>
-                <w:sz w:val="22"/>
-                <w:szCs w:val="22"/>
-              </w:rPr>
-            </w:pPr>
-          </w:p>
-        </w:tc>
-      </w:tr>
-      <w:tr>
-        <w:trPr>
-          <w:gridAfter w:val="2"/>
-          <w:wAfter w:w="1212" w:type="dxa"/>
-        </w:trPr>
-        <w:tc>
-          <w:tcPr>
-            <w:tcW w:w="1446" w:type="dxa"/>
-          </w:tcPr>
-          <w:p>
-            <w:pPr>
-              <w:pStyle w:val="NormalWeb"/>
-              <w:spacing w:before="0" w:beforeAutospacing="0" w:after="0" w:afterAutospacing="0"/>
-              <w:rPr>
-                <w:rFonts w:ascii="Roboto" w:eastAsia="Times New Roman" w:hAnsi="Roboto"/>
-                <w:sz w:val="20"/>
-                <w:szCs w:val="20"/>
-                <w:lang w:val="en-US"/>
-              </w:rPr>
-            </w:pPr>
-            <w:r>
-              <w:rPr>
-                <w:rFonts w:ascii="Roboto" w:hAnsi="Roboto" w:cs="Times New Roman (Body CS)"/>
-                <w:sz w:val="20"/>
-                <w:szCs w:val="20"/>
-              </w:rPr>
-              <w:t>FEB 2026</w:t>
-            </w:r>
-          </w:p>
-        </w:tc>
-        <w:tc>
-          <w:tcPr>
-            <w:tcW w:w="236" w:type="dxa"/>
-            <w:tcBorders>
-              <w:right w:val="single" w:sz="4" w:space="0" w:color="000000"/>
-            </w:tcBorders>
-          </w:tcPr>
-          <w:p>
-            <w:pPr>
-              <w:pStyle w:val="NormalWeb"/>
-              <w:spacing w:before="0" w:beforeAutospacing="0" w:after="0" w:afterAutospacing="0"/>
-              <w:rPr>
-                <w:rFonts w:ascii="Lora" w:eastAsia="Times New Roman" w:hAnsi="Lora"/>
-                <w:sz w:val="21"/>
-                <w:szCs w:val="21"/>
-                <w:lang w:val="en-US"/>
-              </w:rPr>
-            </w:pPr>
-          </w:p>
-        </w:tc>
-        <w:tc>
-          <w:tcPr>
-            <w:tcW w:w="10059" w:type="dxa"/>
-            <w:tcBorders>
-              <w:left w:val="single" w:sz="4" w:space="0" w:color="000000"/>
-            </w:tcBorders>
-          </w:tcPr>
-          <w:p>
-            <w:pPr>
-              <w:rPr>
-                <w:rFonts w:ascii="Roboto" w:hAnsi="Roboto"/>
-                <w:b/>
-                <w:bCs/>
-                <w:sz w:val="26"/>
-                <w:szCs w:val="26"/>
-              </w:rPr>
-            </w:pPr>
-            <w:r>
-              <w:rPr>
-                <w:rFonts w:ascii="Roboto" w:hAnsi="Roboto"/>
-                <w:b/>
-                <w:bCs/>
-                <w:sz w:val="26"/>
-                <w:szCs w:val="26"/>
-              </w:rPr>
-              <w:t>Pi Mu Epsilon</w:t>
-            </w:r>
-          </w:p>
-          <w:p>
-            <w:pPr>
-              <w:rPr>
-                <w:rFonts w:ascii="Lora" w:eastAsia="Times New Roman" w:hAnsi="Lora"/>
-                <w:b/>
-                <w:i/>
-                <w:iCs/>
-                <w:color w:val="2D4239"/>
-                <w:sz w:val="21"/>
-                <w:szCs w:val="21"/>
-                <w:lang w:eastAsia="zh-TW"/>
-              </w:rPr>
-            </w:pPr>
-            <w:r>
-              <w:rPr>
-                <w:rFonts w:ascii="Lora" w:eastAsia="Times New Roman" w:hAnsi="Lora"/>
-                <w:b/>
-                <w:i/>
-                <w:iCs/>
-                <w:color w:val="2D4239"/>
-                <w:sz w:val="21"/>
-                <w:szCs w:val="21"/>
-                <w:lang w:eastAsia="zh-TW"/>
-              </w:rPr>
-              <w:t>National Mathematics Honor Society</w:t>
-            </w:r>
-          </w:p>
-        </w:tc>
-      </w:tr>
-      <w:tr>
-        <w:trPr>
-          <w:gridAfter w:val="2"/>
-          <w:wAfter w:w="1212" w:type="dxa"/>
-        </w:trPr>
-        <w:tc>
-          <w:tcPr>
-            <w:tcW w:w="11741" w:type="dxa"/>
-            <w:gridSpan w:val="3"/>
-          </w:tcPr>
-          <w:p>
-            <w:pPr>
-              <w:pStyle w:val="NormalWeb"/>
-              <w:spacing w:before="0" w:beforeAutospacing="0" w:after="0" w:afterAutospacing="0"/>
-              <w:rPr>
-                <w:rFonts w:ascii="Roboto" w:eastAsia="Times New Roman" w:hAnsi="Roboto"/>
-                <w:sz w:val="22"/>
-                <w:szCs w:val="22"/>
-                <w:lang w:val="en-US"/>
-              </w:rPr>
-            </w:pPr>
-          </w:p>
-        </w:tc>
-      </w:tr>
-      <w:tr>
-        <w:trPr>
-          <w:gridAfter w:val="2"/>
-          <w:wAfter w:w="1212" w:type="dxa"/>
-        </w:trPr>
-        <w:tc>
-          <w:tcPr>
-            <w:tcW w:w="1446" w:type="dxa"/>
-          </w:tcPr>
-          <w:p>
-            <w:pPr>
-              <w:pStyle w:val="NormalWeb"/>
-              <w:spacing w:before="0" w:beforeAutospacing="0" w:after="0" w:afterAutospacing="0"/>
-              <w:rPr>
-                <w:rFonts w:ascii="Roboto" w:eastAsia="Times New Roman" w:hAnsi="Roboto"/>
-                <w:sz w:val="20"/>
-                <w:szCs w:val="20"/>
-                <w:lang w:val="en-US"/>
-              </w:rPr>
-            </w:pPr>
-            <w:r>
-              <w:rPr>
-                <w:rFonts w:ascii="Roboto" w:hAnsi="Roboto" w:cs="Times New Roman (Body CS)"/>
-                <w:sz w:val="20"/>
-                <w:szCs w:val="20"/>
-              </w:rPr>
-              <w:t>FALL</w:t>
-            </w:r>
-            <w:r>
-              <w:rPr>
-                <w:rFonts w:ascii="Roboto" w:hAnsi="Roboto" w:cs="Times New Roman (Body CS)"/>
-                <w:sz w:val="20"/>
-                <w:szCs w:val="20"/>
-              </w:rPr>
-              <w:t xml:space="preserve"> 20</w:t>
-            </w:r>
-            <w:r>
-              <w:rPr>
-                <w:rFonts w:ascii="Roboto" w:hAnsi="Roboto" w:cs="Times New Roman (Body CS)"/>
-                <w:sz w:val="20"/>
-                <w:szCs w:val="20"/>
-              </w:rPr>
-              <w:t>23</w:t>
-            </w:r>
-            <w:r>
-              <w:rPr>
-                <w:rFonts w:ascii="Roboto" w:hAnsi="Roboto" w:cs="Times New Roman (Body CS)"/>
-                <w:sz w:val="20"/>
-                <w:szCs w:val="20"/>
-              </w:rPr>
-              <w:t xml:space="preserve"> - </w:t>
-            </w:r>
-            <w:r>
-              <w:rPr>
-                <w:rFonts w:ascii="Roboto" w:hAnsi="Roboto" w:cs="Times New Roman (Body CS)"/>
-                <w:sz w:val="20"/>
-                <w:szCs w:val="20"/>
-              </w:rPr>
-              <w:t>PRESENT</w:t>
-            </w:r>
-          </w:p>
-        </w:tc>
-        <w:tc>
-          <w:tcPr>
-            <w:tcW w:w="236" w:type="dxa"/>
-            <w:tcBorders>
-              <w:right w:val="single" w:sz="4" w:space="0" w:color="000000"/>
-            </w:tcBorders>
-          </w:tcPr>
-          <w:p>
-            <w:pPr>
-              <w:pStyle w:val="NormalWeb"/>
-              <w:spacing w:before="0" w:beforeAutospacing="0" w:after="0" w:afterAutospacing="0"/>
-              <w:rPr>
-                <w:rFonts w:ascii="Lora" w:eastAsia="Times New Roman" w:hAnsi="Lora"/>
-                <w:sz w:val="21"/>
-                <w:szCs w:val="21"/>
-                <w:lang w:val="en-US"/>
-              </w:rPr>
-            </w:pPr>
-          </w:p>
-        </w:tc>
-        <w:tc>
-          <w:tcPr>
-            <w:tcW w:w="10059" w:type="dxa"/>
-            <w:tcBorders>
-              <w:left w:val="single" w:sz="4" w:space="0" w:color="000000"/>
-            </w:tcBorders>
-          </w:tcPr>
-          <w:p>
-            <w:pPr>
-              <w:rPr>
-                <w:rFonts w:ascii="Roboto" w:hAnsi="Roboto"/>
-                <w:b/>
-                <w:bCs/>
-                <w:sz w:val="26"/>
-                <w:szCs w:val="26"/>
-              </w:rPr>
-            </w:pPr>
-            <w:r>
-              <w:rPr>
-                <w:rFonts w:ascii="Roboto" w:hAnsi="Roboto"/>
-                <w:b/>
-                <w:bCs/>
-                <w:sz w:val="26"/>
-                <w:szCs w:val="26"/>
-              </w:rPr>
-              <w:t>Harpur College Dean’s List</w:t>
-            </w:r>
-          </w:p>
-          <w:p>
-            <w:pPr>
-              <w:rPr>
-                <w:rFonts w:ascii="Lora" w:eastAsia="Times New Roman" w:hAnsi="Lora"/>
-                <w:b/>
-                <w:i/>
-                <w:iCs/>
-                <w:color w:val="2D4239"/>
-                <w:sz w:val="21"/>
-                <w:szCs w:val="21"/>
-                <w:lang w:eastAsia="zh-TW"/>
-              </w:rPr>
-            </w:pPr>
-            <w:r>
-              <w:rPr>
-                <w:rFonts w:ascii="Lora" w:eastAsia="Times New Roman" w:hAnsi="Lora"/>
-                <w:b/>
-                <w:i/>
-                <w:iCs/>
-                <w:color w:val="2D4239"/>
-                <w:sz w:val="21"/>
-                <w:szCs w:val="21"/>
-                <w:lang w:eastAsia="zh-TW"/>
-              </w:rPr>
-              <w:t>Binghamton University</w:t>
-            </w:r>
-          </w:p>
-          <w:p>
-            <w:pPr>
-              <w:rPr>
-                <w:rFonts w:ascii="Lora" w:eastAsia="Times New Roman" w:hAnsi="Lora"/>
-                <w:b/>
-                <w:i/>
-                <w:iCs/>
-                <w:color w:val="2D4239"/>
-                <w:sz w:val="21"/>
-                <w:szCs w:val="21"/>
-                <w:lang w:eastAsia="zh-TW"/>
-              </w:rPr>
-            </w:pPr>
-          </w:p>
-          <w:p>
-            <w:pPr>
-              <w:pStyle w:val="ListParagraph"/>
-              <w:numPr>
-                <w:ilvl w:val="0"/>
-                <w:numId w:val="1"/>
-              </w:numPr>
-              <w:spacing w:after="80"/>
-              <w:ind w:left="357" w:right="567" w:hanging="357"/>
-              <w:contextualSpacing w:val="0"/>
-              <w:rPr>
-                <w:rFonts w:ascii="Roboto" w:eastAsia="Times New Roman" w:hAnsi="Roboto"/>
-                <w:bCs/>
-                <w:sz w:val="20"/>
-                <w:szCs w:val="20"/>
-                <w:lang w:eastAsia="zh-TW"/>
-              </w:rPr>
-            </w:pPr>
-            <w:r>
-              <w:rPr>
-                <w:rFonts w:ascii="Roboto" w:eastAsia="Times New Roman" w:hAnsi="Roboto"/>
-                <w:bCs/>
-                <w:sz w:val="20"/>
-                <w:szCs w:val="20"/>
-                <w:lang w:eastAsia="zh-TW"/>
-              </w:rPr>
-              <w:t>Named to the Dean’s List every semester attended</w:t>
-            </w:r>
-            <w:r>
-              <w:rPr>
-                <w:rFonts w:ascii="Roboto" w:eastAsia="Times New Roman" w:hAnsi="Roboto"/>
-                <w:bCs/>
-                <w:sz w:val="20"/>
-                <w:szCs w:val="20"/>
-                <w:lang w:eastAsia="zh-TW"/>
-              </w:rPr>
-              <w:t>.</w:t>
-            </w:r>
-          </w:p>
-        </w:tc>
-      </w:tr>
-      <w:tr>
-        <w:trPr>
-          <w:gridAfter w:val="2"/>
-          <w:wAfter w:w="1212" w:type="dxa"/>
-        </w:trPr>
-        <w:tc>
-          <w:tcPr>
-            <w:tcW w:w="11741" w:type="dxa"/>
-            <w:gridSpan w:val="3"/>
-          </w:tcPr>
-          <w:p>
-            <w:pPr>
-              <w:pStyle w:val="NormalWeb"/>
-              <w:spacing w:before="0" w:beforeAutospacing="0" w:after="0" w:afterAutospacing="0"/>
-              <w:rPr>
-                <w:rFonts w:ascii="Lora" w:eastAsia="Times New Roman" w:hAnsi="Lora"/>
-                <w:sz w:val="22"/>
-                <w:szCs w:val="22"/>
-              </w:rPr>
-            </w:pPr>
-          </w:p>
-        </w:tc>
-      </w:tr>
-      <w:tr>
-        <w:trPr>
-          <w:gridAfter w:val="2"/>
-          <w:wAfter w:w="1212" w:type="dxa"/>
-        </w:trPr>
-        <w:tc>
-          <w:tcPr>
-            <w:tcW w:w="1446" w:type="dxa"/>
-          </w:tcPr>
-          <w:p>
-            <w:pPr>
-              <w:pStyle w:val="NormalWeb"/>
-              <w:spacing w:before="0" w:beforeAutospacing="0" w:after="0" w:afterAutospacing="0"/>
-              <w:rPr>
-                <w:rFonts w:ascii="Roboto" w:eastAsia="Times New Roman" w:hAnsi="Roboto"/>
-                <w:sz w:val="20"/>
-                <w:szCs w:val="20"/>
-                <w:lang w:val="en-US"/>
-              </w:rPr>
-            </w:pPr>
-            <w:r>
-              <w:rPr>
-                <w:rFonts w:ascii="Roboto" w:hAnsi="Roboto" w:cs="Times New Roman (Body CS)"/>
-                <w:sz w:val="20"/>
-                <w:szCs w:val="20"/>
-              </w:rPr>
-              <w:t>EACH SEMESTER</w:t>
-            </w:r>
-          </w:p>
-        </w:tc>
-        <w:tc>
-          <w:tcPr>
-            <w:tcW w:w="236" w:type="dxa"/>
-            <w:tcBorders>
-              <w:right w:val="single" w:sz="4" w:space="0" w:color="000000"/>
-            </w:tcBorders>
-          </w:tcPr>
-          <w:p>
-            <w:pPr>
-              <w:pStyle w:val="NormalWeb"/>
-              <w:spacing w:before="0" w:beforeAutospacing="0" w:after="0" w:afterAutospacing="0"/>
-              <w:rPr>
-                <w:rFonts w:ascii="Lora" w:eastAsia="Times New Roman" w:hAnsi="Lora"/>
-                <w:sz w:val="21"/>
-                <w:szCs w:val="21"/>
-                <w:lang w:val="en-US"/>
-              </w:rPr>
-            </w:pPr>
-          </w:p>
-        </w:tc>
-        <w:tc>
-          <w:tcPr>
-            <w:tcW w:w="10059" w:type="dxa"/>
-            <w:tcBorders>
-              <w:left w:val="single" w:sz="4" w:space="0" w:color="000000"/>
-            </w:tcBorders>
-          </w:tcPr>
-          <w:p>
-            <w:pPr>
-              <w:rPr>
-                <w:rFonts w:ascii="Roboto" w:hAnsi="Roboto"/>
-                <w:b/>
-                <w:bCs/>
-                <w:sz w:val="26"/>
-                <w:szCs w:val="26"/>
-              </w:rPr>
-            </w:pPr>
-            <w:r>
-              <w:rPr>
-                <w:rFonts w:ascii="Roboto" w:hAnsi="Roboto"/>
-                <w:b/>
-                <w:bCs/>
-                <w:sz w:val="26"/>
-                <w:szCs w:val="26"/>
-              </w:rPr>
-              <w:t>Provost’s Promise Scholarship</w:t>
-            </w:r>
-          </w:p>
-          <w:p>
-            <w:pPr>
-              <w:rPr>
-                <w:rFonts w:ascii="Lora" w:eastAsia="Times New Roman" w:hAnsi="Lora"/>
-                <w:b/>
-                <w:i/>
-                <w:iCs/>
-                <w:color w:val="2D4239"/>
-                <w:sz w:val="21"/>
-                <w:szCs w:val="21"/>
-                <w:lang w:eastAsia="zh-TW"/>
-              </w:rPr>
-            </w:pPr>
-            <w:r>
-              <w:rPr>
-                <w:rFonts w:ascii="Lora" w:eastAsia="Times New Roman" w:hAnsi="Lora"/>
-                <w:b/>
-                <w:i/>
-                <w:iCs/>
-                <w:color w:val="2D4239"/>
-                <w:sz w:val="21"/>
-                <w:szCs w:val="21"/>
-                <w:lang w:eastAsia="zh-TW"/>
-              </w:rPr>
-              <w:t>Binghamton University</w:t>
-            </w:r>
-          </w:p>
-          <w:p>
-            <w:pPr>
-              <w:rPr>
-                <w:rFonts w:ascii="Lora" w:eastAsia="Times New Roman" w:hAnsi="Lora"/>
-                <w:b/>
-                <w:color w:val="2D4239"/>
-                <w:sz w:val="21"/>
-                <w:szCs w:val="21"/>
-                <w:lang w:eastAsia="zh-TW"/>
-              </w:rPr>
-            </w:pPr>
-          </w:p>
-          <w:p>
-            <w:pPr>
-              <w:pStyle w:val="ListParagraph"/>
-              <w:numPr>
-                <w:ilvl w:val="0"/>
-                <w:numId w:val="1"/>
-              </w:numPr>
-              <w:spacing w:after="80"/>
-              <w:ind w:left="357" w:right="567" w:hanging="357"/>
-              <w:contextualSpacing w:val="0"/>
-              <w:rPr>
-                <w:rFonts w:ascii="Roboto" w:eastAsia="Times New Roman" w:hAnsi="Roboto"/>
-                <w:bCs/>
-                <w:sz w:val="20"/>
-                <w:szCs w:val="20"/>
-                <w:lang w:eastAsia="zh-TW"/>
-              </w:rPr>
-            </w:pPr>
-            <w:r>
-              <w:rPr>
-                <w:rFonts w:ascii="Roboto" w:eastAsia="Times New Roman" w:hAnsi="Roboto"/>
-                <w:bCs/>
-                <w:sz w:val="20"/>
-                <w:szCs w:val="20"/>
-                <w:lang w:eastAsia="zh-TW"/>
-              </w:rPr>
-              <w:t>Recipient of renewable financial support each semester throughout undergraduate study</w:t>
-            </w:r>
-            <w:r>
-              <w:rPr>
-                <w:rFonts w:ascii="Roboto" w:eastAsia="Times New Roman" w:hAnsi="Roboto"/>
-                <w:bCs/>
-                <w:sz w:val="20"/>
-                <w:szCs w:val="20"/>
-                <w:lang w:eastAsia="zh-TW"/>
-              </w:rPr>
-              <w:t>.</w:t>
-            </w:r>
-          </w:p>
-        </w:tc>
-      </w:tr>
-      <w:tr>
-        <w:trPr>
-          <w:gridAfter w:val="2"/>
-          <w:wAfter w:w="1212" w:type="dxa"/>
-        </w:trPr>
-        <w:tc>
-          <w:tcPr>
-            <w:tcW w:w="11741" w:type="dxa"/>
-            <w:gridSpan w:val="3"/>
-          </w:tcPr>
-          <w:p>
-            <w:pPr>
-              <w:pStyle w:val="NormalWeb"/>
-              <w:spacing w:before="0" w:beforeAutospacing="0" w:after="0" w:afterAutospacing="0"/>
-              <w:rPr>
-                <w:rFonts w:ascii="Roboto" w:eastAsia="Times New Roman" w:hAnsi="Roboto"/>
-                <w:b/>
-                <w:bCs/>
-                <w:color w:val="2D4239"/>
-                <w:sz w:val="32"/>
-                <w:szCs w:val="32"/>
-                <w:lang w:val="en-US"/>
-              </w:rPr>
-            </w:pPr>
-          </w:p>
-          <w:p>
-            <w:pPr>
-              <w:pStyle w:val="NormalWeb"/>
-              <w:spacing w:before="0" w:beforeAutospacing="0" w:after="0" w:afterAutospacing="0"/>
-              <w:rPr>
-                <w:rFonts w:ascii="Roboto" w:eastAsia="Times New Roman" w:hAnsi="Roboto"/>
-                <w:b/>
-                <w:bCs/>
-                <w:color w:val="2D4239"/>
-                <w:sz w:val="32"/>
-                <w:szCs w:val="32"/>
-                <w:lang w:val="en-US"/>
-              </w:rPr>
-            </w:pPr>
-          </w:p>
-          <w:p>
-            <w:pPr>
-              <w:pStyle w:val="NormalWeb"/>
-              <w:spacing w:before="0" w:beforeAutospacing="0" w:after="0" w:afterAutospacing="0"/>
-              <w:rPr>
-                <w:rFonts w:ascii="Roboto" w:eastAsia="Times New Roman" w:hAnsi="Roboto"/>
-                <w:b/>
-                <w:bCs/>
-                <w:color w:val="2D4239"/>
-                <w:sz w:val="32"/>
-                <w:szCs w:val="32"/>
-                <w:lang w:val="en-US"/>
-              </w:rPr>
-            </w:pPr>
-            <w:r>
-              <w:rPr>
-                <w:rFonts w:ascii="Roboto" w:eastAsia="Times New Roman" w:hAnsi="Roboto"/>
-                <w:b/>
-                <w:bCs/>
-                <w:color w:val="2D4239"/>
-                <w:sz w:val="32"/>
-                <w:szCs w:val="32"/>
-              </w:rPr>
-              <w:t>Leadership &amp; Activities</w:t>
-            </w:r>
-            <w:r>
-              <w:rPr>
-                <w:rFonts w:ascii="Roboto" w:eastAsia="Times New Roman" w:hAnsi="Roboto"/>
-                <w:b/>
-                <w:bCs/>
-                <w:color w:val="2D4239"/>
-                <w:sz w:val="32"/>
-                <w:szCs w:val="32"/>
-                <w:lang w:val="en-US"/>
-              </w:rPr>
-              <w:t xml:space="preserve"> </w:t>
-            </w:r>
-          </w:p>
-          <w:p>
-            <w:pPr>
-              <w:pStyle w:val="NormalWeb"/>
-              <w:spacing w:before="0" w:beforeAutospacing="0" w:after="0" w:afterAutospacing="0"/>
-              <w:rPr>
-                <w:rFonts w:ascii="Roboto" w:eastAsia="Times New Roman" w:hAnsi="Roboto"/>
-                <w:b/>
-                <w:bCs/>
-                <w:color w:val="2D4239"/>
-                <w:sz w:val="32"/>
-                <w:szCs w:val="32"/>
-                <w:lang w:val="en-US"/>
-              </w:rPr>
             </w:pPr>
           </w:p>
           <w:tbl>
             <w:tblPr>
               <w:tblStyle w:val="TableGrid"/>
-              <w:tblW w:w="11479" w:type="dxa"/>
-              <w:tblInd w:w="5" w:type="dxa"/>
+              <w:tblW w:w="11741" w:type="dxa"/>
               <w:tblBorders>
                 <w:top w:val="none" w:sz="0" w:space="0" w:color="auto"/>
                 <w:left w:val="none" w:sz="0" w:space="0" w:color="auto"/>
@@ -7088,14 +5896,14 @@
               <w:tblLook w:val="04A0" w:firstRow="1" w:lastRow="0" w:firstColumn="1" w:lastColumn="0" w:noHBand="0" w:noVBand="1"/>
             </w:tblPr>
             <w:tblGrid>
-              <w:gridCol w:w="1276"/>
-              <w:gridCol w:w="286"/>
-              <w:gridCol w:w="9917"/>
+              <w:gridCol w:w="1446"/>
+              <w:gridCol w:w="236"/>
+              <w:gridCol w:w="10059"/>
             </w:tblGrid>
             <w:tr>
               <w:tc>
                 <w:tcPr>
-                  <w:tcW w:w="1276" w:type="dxa"/>
+                  <w:tcW w:w="1446" w:type="dxa"/>
                 </w:tcPr>
                 <w:p>
                   <w:pPr>
@@ -7130,7 +5938,15 @@
                       <w:sz w:val="20"/>
                       <w:szCs w:val="20"/>
                     </w:rPr>
-                    <w:t>26</w:t>
+                    <w:t>2</w:t>
+                  </w:r>
+                  <w:r>
+                    <w:rPr>
+                      <w:rFonts w:ascii="Roboto" w:hAnsi="Roboto" w:cs="Times New Roman (Body CS)"/>
+                      <w:sz w:val="20"/>
+                      <w:szCs w:val="20"/>
+                    </w:rPr>
+                    <w:t>6</w:t>
                   </w:r>
                   <w:r>
                     <w:rPr>
@@ -7152,7 +5968,7 @@
               </w:tc>
               <w:tc>
                 <w:tcPr>
-                  <w:tcW w:w="286" w:type="dxa"/>
+                  <w:tcW w:w="236" w:type="dxa"/>
                   <w:tcBorders>
                     <w:right w:val="single" w:sz="4" w:space="0" w:color="000000"/>
                   </w:tcBorders>
@@ -7172,7 +5988,7 @@
               </w:tc>
               <w:tc>
                 <w:tcPr>
-                  <w:tcW w:w="9917" w:type="dxa"/>
+                  <w:tcW w:w="10059" w:type="dxa"/>
                   <w:tcBorders>
                     <w:left w:val="single" w:sz="4" w:space="0" w:color="000000"/>
                   </w:tcBorders>
@@ -7233,7 +6049,7 @@
                       <w:color w:val="2D4239"/>
                       <w:sz w:val="21"/>
                       <w:szCs w:val="21"/>
-                      <w:lang w:eastAsia="zh-TW"/>
+                      <w:lang w:val="en-US" w:eastAsia="zh-TW"/>
                     </w:rPr>
                   </w:pPr>
                 </w:p>
@@ -7263,6 +6079,7 @@
                       <w:szCs w:val="20"/>
                       <w:lang w:eastAsia="zh-TW"/>
                     </w:rPr>
+                    <w:lastRenderedPageBreak/>
                     <w:t>Design promotional graphics and event materials, including posters, to support club events, outreach, and student engagement.</w:t>
                   </w:r>
                 </w:p>
@@ -7297,30 +6114,34 @@
                 </w:p>
               </w:tc>
             </w:tr>
-            <w:tr>
-              <w:tc>
-                <w:tcPr>
-                  <w:tcW w:w="11479" w:type="dxa"/>
-                  <w:gridSpan w:val="3"/>
-                </w:tcPr>
-                <w:p>
-                  <w:pPr>
-                    <w:pStyle w:val="NormalWeb"/>
-                    <w:spacing w:before="0" w:beforeAutospacing="0" w:after="0" w:afterAutospacing="0"/>
-                    <w:rPr>
-                      <w:rFonts w:ascii="Lora" w:eastAsia="Times New Roman" w:hAnsi="Lora"/>
-                      <w:sz w:val="22"/>
-                      <w:szCs w:val="22"/>
-                    </w:rPr>
-                  </w:pPr>
-                </w:p>
-              </w:tc>
-            </w:tr>
           </w:tbl>
           <w:p>
             <w:pPr>
               <w:pStyle w:val="NormalWeb"/>
-              <w:spacing w:before="0" w:beforeAutospacing="0" w:after="0" w:afterAutospacing="0"/>
+              <w:spacing w:before="0" w:beforeAutospacing="0" w:after="0" w:afterAutospacing="0" w:line="276" w:lineRule="auto"/>
+              <w:rPr>
+                <w:rFonts w:ascii="Roboto" w:eastAsia="Times New Roman" w:hAnsi="Roboto"/>
+                <w:b/>
+                <w:bCs/>
+                <w:color w:val="2D4239"/>
+                <w:sz w:val="32"/>
+                <w:szCs w:val="32"/>
+              </w:rPr>
+            </w:pPr>
+          </w:p>
+          <w:p>
+            <w:pPr>
+              <w:pStyle w:val="NormalWeb"/>
+              <w:spacing w:before="0" w:beforeAutospacing="0" w:after="0" w:afterAutospacing="0" w:line="276" w:lineRule="auto"/>
+              <w:rPr>
+                <w:rFonts w:ascii="Roboto" w:eastAsia="Times New Roman" w:hAnsi="Roboto"/>
+                <w:color w:val="2D4239"/>
+                <w:sz w:val="28"/>
+                <w:szCs w:val="28"/>
+                <w:lang w:val="en-US"/>
+              </w:rPr>
+            </w:pPr>
+            <w:r>
               <w:rPr>
                 <w:rFonts w:ascii="Roboto" w:eastAsia="Times New Roman" w:hAnsi="Roboto"/>
                 <w:b/>
@@ -7330,20 +6151,8 @@
                 <w:szCs w:val="32"/>
                 <w:lang w:val="en-US"/>
               </w:rPr>
-            </w:pPr>
-          </w:p>
-          <w:p>
-            <w:pPr>
-              <w:pStyle w:val="NormalWeb"/>
-              <w:spacing w:before="0" w:beforeAutospacing="0" w:after="0" w:afterAutospacing="0"/>
-              <w:rPr>
-                <w:rFonts w:ascii="Roboto" w:eastAsia="Times New Roman" w:hAnsi="Roboto"/>
-                <w:color w:val="2D4239"/>
-                <w:sz w:val="28"/>
-                <w:szCs w:val="28"/>
-                <w:lang w:val="en-US"/>
-              </w:rPr>
-            </w:pPr>
+              <w:t>Awards</w:t>
+            </w:r>
             <w:r>
               <w:rPr>
                 <w:rFonts w:ascii="Roboto" w:eastAsia="Times New Roman" w:hAnsi="Roboto"/>
@@ -7354,7 +6163,7 @@
                 <w:szCs w:val="32"/>
                 <w:lang w:val="en-US"/>
               </w:rPr>
-              <w:t>Technical</w:t>
+              <w:t xml:space="preserve">, </w:t>
             </w:r>
             <w:r>
               <w:rPr>
@@ -7366,7 +6175,19 @@
                 <w:szCs w:val="32"/>
                 <w:lang w:val="en-US"/>
               </w:rPr>
-              <w:t xml:space="preserve"> Skills</w:t>
+              <w:t>Honors</w:t>
+            </w:r>
+            <w:r>
+              <w:rPr>
+                <w:rFonts w:ascii="Roboto" w:eastAsia="Times New Roman" w:hAnsi="Roboto"/>
+                <w:b/>
+                <w:bCs/>
+                <w:color w:val="2D4239"/>
+                <w:sz w:val="32"/>
+                <w:szCs w:val="32"/>
+                <w:lang w:val="en-US"/>
+              </w:rPr>
+              <w:t xml:space="preserve"> &amp; Scholarships</w:t>
             </w:r>
           </w:p>
         </w:tc>
@@ -7374,21 +6195,19 @@
       <w:tr>
         <w:trPr>
           <w:gridAfter w:val="2"/>
-          <w:wAfter w:w="1212" w:type="dxa"/>
+          <w:wAfter w:w="996" w:type="dxa"/>
         </w:trPr>
         <w:tc>
           <w:tcPr>
-            <w:tcW w:w="11741" w:type="dxa"/>
-            <w:gridSpan w:val="3"/>
+            <w:tcW w:w="11957" w:type="dxa"/>
+            <w:gridSpan w:val="4"/>
           </w:tcPr>
           <w:p>
             <w:pPr>
               <w:pStyle w:val="NormalWeb"/>
-              <w:spacing w:before="0" w:beforeAutospacing="0" w:after="0" w:afterAutospacing="0"/>
-              <w:rPr>
-                <w:rFonts w:ascii="Roboto" w:eastAsia="Times New Roman" w:hAnsi="Roboto"/>
-                <w:b/>
-                <w:bCs/>
+              <w:spacing w:before="0" w:beforeAutospacing="0" w:after="0" w:afterAutospacing="0" w:line="276" w:lineRule="auto"/>
+              <w:rPr>
+                <w:rFonts w:ascii="Roboto" w:eastAsia="Times New Roman" w:hAnsi="Roboto"/>
                 <w:sz w:val="20"/>
                 <w:szCs w:val="20"/>
                 <w:lang w:val="en-US"/>
@@ -7400,237 +6219,196 @@
       <w:tr>
         <w:trPr>
           <w:gridAfter w:val="2"/>
-          <w:wAfter w:w="1212" w:type="dxa"/>
+          <w:wAfter w:w="996" w:type="dxa"/>
         </w:trPr>
         <w:tc>
           <w:tcPr>
-            <w:tcW w:w="11741" w:type="dxa"/>
-            <w:gridSpan w:val="3"/>
+            <w:tcW w:w="1558" w:type="dxa"/>
           </w:tcPr>
           <w:p>
             <w:pPr>
               <w:pStyle w:val="NormalWeb"/>
               <w:spacing w:before="0" w:beforeAutospacing="0" w:after="0" w:afterAutospacing="0"/>
-              <w:ind w:left="79"/>
-              <w:rPr>
-                <w:rFonts w:ascii="Roboto" w:eastAsia="Times New Roman" w:hAnsi="Roboto"/>
-                <w:sz w:val="20"/>
-                <w:szCs w:val="20"/>
-              </w:rPr>
-            </w:pPr>
-            <w:r>
-              <w:rPr>
-                <w:rFonts w:ascii="Roboto" w:eastAsia="Times New Roman" w:hAnsi="Roboto"/>
-                <w:b/>
-                <w:bCs/>
-                <w:sz w:val="20"/>
-                <w:szCs w:val="20"/>
-              </w:rPr>
-              <w:t>Programming</w:t>
-            </w:r>
-            <w:r>
-              <w:rPr>
-                <w:rFonts w:ascii="Roboto" w:eastAsia="Times New Roman" w:hAnsi="Roboto"/>
-                <w:sz w:val="20"/>
-                <w:szCs w:val="20"/>
-              </w:rPr>
-              <w:t>: R (</w:t>
-            </w:r>
-            <w:proofErr w:type="spellStart"/>
-            <w:r>
-              <w:rPr>
-                <w:rFonts w:ascii="Roboto" w:eastAsia="Times New Roman" w:hAnsi="Roboto"/>
-                <w:sz w:val="20"/>
-                <w:szCs w:val="20"/>
-              </w:rPr>
-              <w:t>tidyverse</w:t>
-            </w:r>
-            <w:proofErr w:type="spellEnd"/>
-            <w:r>
-              <w:rPr>
-                <w:rFonts w:ascii="Roboto" w:eastAsia="Times New Roman" w:hAnsi="Roboto"/>
-                <w:sz w:val="20"/>
-                <w:szCs w:val="20"/>
-              </w:rPr>
-              <w:t xml:space="preserve">, </w:t>
-            </w:r>
-            <w:proofErr w:type="spellStart"/>
-            <w:r>
-              <w:rPr>
-                <w:rFonts w:ascii="Roboto" w:eastAsia="Times New Roman" w:hAnsi="Roboto"/>
-                <w:sz w:val="20"/>
-                <w:szCs w:val="20"/>
-              </w:rPr>
-              <w:t>tidymodels</w:t>
-            </w:r>
-            <w:proofErr w:type="spellEnd"/>
-            <w:r>
-              <w:rPr>
-                <w:rFonts w:ascii="Roboto" w:eastAsia="Times New Roman" w:hAnsi="Roboto"/>
-                <w:sz w:val="20"/>
-                <w:szCs w:val="20"/>
-              </w:rPr>
-              <w:t>, caret</w:t>
-            </w:r>
-            <w:r>
-              <w:rPr>
-                <w:rFonts w:ascii="Roboto" w:eastAsia="Times New Roman" w:hAnsi="Roboto"/>
-                <w:sz w:val="20"/>
-                <w:szCs w:val="20"/>
-              </w:rPr>
-              <w:t xml:space="preserve">), </w:t>
-            </w:r>
-            <w:r>
-              <w:rPr>
-                <w:rFonts w:ascii="Roboto" w:eastAsia="Times New Roman" w:hAnsi="Roboto"/>
-                <w:sz w:val="20"/>
-                <w:szCs w:val="20"/>
-              </w:rPr>
-              <w:t xml:space="preserve">Python (Pandas, NumPy, scikit-learn, </w:t>
-            </w:r>
-            <w:proofErr w:type="spellStart"/>
-            <w:r>
-              <w:rPr>
-                <w:rFonts w:ascii="Roboto" w:eastAsia="Times New Roman" w:hAnsi="Roboto"/>
-                <w:sz w:val="20"/>
-                <w:szCs w:val="20"/>
-              </w:rPr>
-              <w:t>PyTorch</w:t>
-            </w:r>
-            <w:proofErr w:type="spellEnd"/>
-            <w:r>
-              <w:rPr>
-                <w:rFonts w:ascii="Roboto" w:eastAsia="Times New Roman" w:hAnsi="Roboto"/>
-                <w:sz w:val="20"/>
-                <w:szCs w:val="20"/>
-              </w:rPr>
-              <w:t>), SPSS</w:t>
-            </w:r>
-            <w:r>
-              <w:rPr>
-                <w:rFonts w:ascii="Roboto" w:eastAsia="Times New Roman" w:hAnsi="Roboto"/>
-                <w:sz w:val="20"/>
-                <w:szCs w:val="20"/>
-              </w:rPr>
-              <w:br/>
-            </w:r>
-            <w:r>
-              <w:rPr>
-                <w:rFonts w:ascii="Roboto" w:eastAsia="Times New Roman" w:hAnsi="Roboto"/>
-                <w:b/>
-                <w:bCs/>
-                <w:sz w:val="20"/>
-                <w:szCs w:val="20"/>
-              </w:rPr>
-              <w:t>Data Visualization &amp; Applications</w:t>
-            </w:r>
-            <w:r>
-              <w:rPr>
-                <w:rFonts w:ascii="Roboto" w:eastAsia="Times New Roman" w:hAnsi="Roboto"/>
-                <w:sz w:val="20"/>
-                <w:szCs w:val="20"/>
-              </w:rPr>
-              <w:t xml:space="preserve">: ggplot2, </w:t>
-            </w:r>
-            <w:proofErr w:type="spellStart"/>
-            <w:r>
-              <w:rPr>
-                <w:rFonts w:ascii="Roboto" w:eastAsia="Times New Roman" w:hAnsi="Roboto"/>
-                <w:sz w:val="20"/>
-                <w:szCs w:val="20"/>
-              </w:rPr>
-              <w:t>Plotly</w:t>
-            </w:r>
-            <w:proofErr w:type="spellEnd"/>
-            <w:r>
-              <w:rPr>
-                <w:rFonts w:ascii="Roboto" w:eastAsia="Times New Roman" w:hAnsi="Roboto"/>
-                <w:sz w:val="20"/>
-                <w:szCs w:val="20"/>
-              </w:rPr>
-              <w:t>, Matplotlib, Observable JS, R Shiny, Qualtrics</w:t>
-            </w:r>
-            <w:r>
-              <w:rPr>
-                <w:rFonts w:ascii="Roboto" w:eastAsia="Times New Roman" w:hAnsi="Roboto"/>
-                <w:sz w:val="20"/>
-                <w:szCs w:val="20"/>
-              </w:rPr>
-              <w:br/>
-            </w:r>
-            <w:r>
-              <w:rPr>
-                <w:rFonts w:ascii="Roboto" w:eastAsia="Times New Roman" w:hAnsi="Roboto"/>
-                <w:b/>
-                <w:bCs/>
-                <w:sz w:val="20"/>
-                <w:szCs w:val="20"/>
-              </w:rPr>
-              <w:t>Research &amp; Reproducibility</w:t>
-            </w:r>
-            <w:r>
-              <w:rPr>
-                <w:rFonts w:ascii="Roboto" w:eastAsia="Times New Roman" w:hAnsi="Roboto"/>
-                <w:sz w:val="20"/>
-                <w:szCs w:val="20"/>
-              </w:rPr>
-              <w:t>: Quarto, GitHub, LaTeX</w:t>
-            </w:r>
-            <w:r>
-              <w:rPr>
-                <w:rFonts w:ascii="Roboto" w:eastAsia="Times New Roman" w:hAnsi="Roboto"/>
-                <w:sz w:val="20"/>
-                <w:szCs w:val="20"/>
-              </w:rPr>
-              <w:br/>
-            </w:r>
-            <w:r>
-              <w:rPr>
-                <w:rFonts w:ascii="Roboto" w:eastAsia="Times New Roman" w:hAnsi="Roboto"/>
-                <w:b/>
-                <w:bCs/>
-                <w:sz w:val="20"/>
-                <w:szCs w:val="20"/>
-              </w:rPr>
-              <w:t>Methods</w:t>
-            </w:r>
-            <w:r>
-              <w:rPr>
-                <w:rFonts w:ascii="Roboto" w:eastAsia="Times New Roman" w:hAnsi="Roboto"/>
-                <w:sz w:val="20"/>
-                <w:szCs w:val="20"/>
-              </w:rPr>
-              <w:t>: Regression, random forests, decision trees, MARS, deep learning, differential expression, GSEA, mixed-methods analysis</w:t>
-            </w:r>
-          </w:p>
+              <w:rPr>
+                <w:rFonts w:ascii="Roboto" w:eastAsia="Times New Roman" w:hAnsi="Roboto"/>
+                <w:sz w:val="20"/>
+                <w:szCs w:val="20"/>
+                <w:lang w:val="en-US"/>
+              </w:rPr>
+            </w:pPr>
+            <w:r>
+              <w:rPr>
+                <w:rFonts w:ascii="Roboto" w:hAnsi="Roboto" w:cs="Times New Roman (Body CS)"/>
+                <w:sz w:val="20"/>
+                <w:szCs w:val="20"/>
+              </w:rPr>
+              <w:t>FEB</w:t>
+            </w:r>
+            <w:r>
+              <w:rPr>
+                <w:rFonts w:ascii="Roboto" w:hAnsi="Roboto" w:cs="Times New Roman (Body CS)"/>
+                <w:sz w:val="20"/>
+                <w:szCs w:val="20"/>
+              </w:rPr>
+              <w:t xml:space="preserve"> 20</w:t>
+            </w:r>
+            <w:r>
+              <w:rPr>
+                <w:rFonts w:ascii="Roboto" w:hAnsi="Roboto" w:cs="Times New Roman (Body CS)"/>
+                <w:sz w:val="20"/>
+                <w:szCs w:val="20"/>
+              </w:rPr>
+              <w:t>26</w:t>
+            </w:r>
+            <w:r>
+              <w:rPr>
+                <w:rFonts w:ascii="Roboto" w:hAnsi="Roboto" w:cs="Times New Roman (Body CS)"/>
+                <w:sz w:val="20"/>
+                <w:szCs w:val="20"/>
+              </w:rPr>
+              <w:t xml:space="preserve"> - </w:t>
+            </w:r>
+            <w:r>
+              <w:rPr>
+                <w:rFonts w:ascii="Roboto" w:hAnsi="Roboto" w:cs="Times New Roman (Body CS)"/>
+                <w:sz w:val="20"/>
+                <w:szCs w:val="20"/>
+              </w:rPr>
+              <w:t>FEB</w:t>
+            </w:r>
+            <w:r>
+              <w:rPr>
+                <w:rFonts w:ascii="Roboto" w:hAnsi="Roboto" w:cs="Times New Roman (Body CS)"/>
+                <w:sz w:val="20"/>
+                <w:szCs w:val="20"/>
+              </w:rPr>
+              <w:t xml:space="preserve"> 202</w:t>
+            </w:r>
+            <w:r>
+              <w:rPr>
+                <w:rFonts w:ascii="Roboto" w:hAnsi="Roboto" w:cs="Times New Roman (Body CS)"/>
+                <w:sz w:val="20"/>
+                <w:szCs w:val="20"/>
+              </w:rPr>
+              <w:t>7</w:t>
+            </w:r>
+          </w:p>
+        </w:tc>
+        <w:tc>
+          <w:tcPr>
+            <w:tcW w:w="236" w:type="dxa"/>
+            <w:gridSpan w:val="2"/>
+            <w:tcBorders>
+              <w:right w:val="single" w:sz="4" w:space="0" w:color="000000"/>
+            </w:tcBorders>
+          </w:tcPr>
           <w:p>
             <w:pPr>
               <w:pStyle w:val="NormalWeb"/>
               <w:spacing w:before="0" w:beforeAutospacing="0" w:after="0" w:afterAutospacing="0"/>
-              <w:ind w:left="79"/>
-              <w:rPr>
-                <w:rFonts w:ascii="Roboto" w:eastAsia="Times New Roman" w:hAnsi="Roboto"/>
-                <w:sz w:val="20"/>
-                <w:szCs w:val="20"/>
-              </w:rPr>
-            </w:pPr>
-            <w:r>
-              <w:rPr>
-                <w:rFonts w:ascii="Roboto" w:eastAsia="Times New Roman" w:hAnsi="Roboto"/>
-                <w:b/>
-                <w:bCs/>
-                <w:sz w:val="20"/>
-                <w:szCs w:val="20"/>
-              </w:rPr>
-              <w:t>Communication &amp; Collaboration</w:t>
-            </w:r>
-            <w:r>
-              <w:rPr>
-                <w:rFonts w:ascii="Roboto" w:eastAsia="Times New Roman" w:hAnsi="Roboto"/>
-                <w:sz w:val="20"/>
-                <w:szCs w:val="20"/>
-              </w:rPr>
-              <w:t>: Public speaking; Team-based research in academic and internship settings</w:t>
+              <w:rPr>
+                <w:rFonts w:ascii="Lora" w:eastAsia="Times New Roman" w:hAnsi="Lora"/>
+                <w:sz w:val="21"/>
+                <w:szCs w:val="21"/>
+                <w:lang w:val="en-US"/>
+              </w:rPr>
+            </w:pPr>
+          </w:p>
+        </w:tc>
+        <w:tc>
+          <w:tcPr>
+            <w:tcW w:w="10163" w:type="dxa"/>
+            <w:tcBorders>
+              <w:left w:val="single" w:sz="4" w:space="0" w:color="000000"/>
+            </w:tcBorders>
+          </w:tcPr>
+          <w:p>
+            <w:pPr>
+              <w:rPr>
+                <w:rFonts w:ascii="Roboto" w:hAnsi="Roboto"/>
+                <w:b/>
+                <w:bCs/>
+                <w:sz w:val="26"/>
+                <w:szCs w:val="26"/>
+              </w:rPr>
+            </w:pPr>
+            <w:r>
+              <w:rPr>
+                <w:rFonts w:ascii="Roboto" w:hAnsi="Roboto"/>
+                <w:b/>
+                <w:bCs/>
+                <w:sz w:val="26"/>
+                <w:szCs w:val="26"/>
+              </w:rPr>
+              <w:t>NSF Research Experiences for Undergraduates (REU) Research Stipend Recipient</w:t>
+            </w:r>
+          </w:p>
+          <w:p>
+            <w:pPr>
+              <w:rPr>
+                <w:rFonts w:ascii="Lora" w:eastAsia="Times New Roman" w:hAnsi="Lora"/>
+                <w:b/>
+                <w:i/>
+                <w:iCs/>
+                <w:color w:val="2D4239"/>
+                <w:sz w:val="21"/>
+                <w:szCs w:val="21"/>
+                <w:lang w:eastAsia="zh-TW"/>
+              </w:rPr>
+            </w:pPr>
+            <w:r>
+              <w:rPr>
+                <w:rFonts w:ascii="Lora" w:eastAsia="Times New Roman" w:hAnsi="Lora"/>
+                <w:b/>
+                <w:i/>
+                <w:iCs/>
+                <w:color w:val="2D4239"/>
+                <w:sz w:val="21"/>
+                <w:szCs w:val="21"/>
+                <w:lang w:eastAsia="zh-TW"/>
+              </w:rPr>
+              <w:t>Binghamton University</w:t>
+            </w:r>
+          </w:p>
+          <w:p>
+            <w:pPr>
+              <w:rPr>
+                <w:rFonts w:ascii="Lora" w:eastAsia="Times New Roman" w:hAnsi="Lora"/>
+                <w:b/>
+                <w:color w:val="2D4239"/>
+                <w:sz w:val="21"/>
+                <w:szCs w:val="21"/>
+                <w:lang w:eastAsia="zh-TW"/>
+              </w:rPr>
+            </w:pPr>
+          </w:p>
+          <w:p>
+            <w:pPr>
+              <w:pStyle w:val="ListParagraph"/>
+              <w:numPr>
+                <w:ilvl w:val="0"/>
+                <w:numId w:val="1"/>
+              </w:numPr>
+              <w:spacing w:after="80"/>
+              <w:ind w:left="357" w:right="567" w:hanging="357"/>
+              <w:contextualSpacing w:val="0"/>
+              <w:rPr>
+                <w:rFonts w:ascii="Roboto" w:eastAsia="Times New Roman" w:hAnsi="Roboto"/>
+                <w:bCs/>
+                <w:sz w:val="20"/>
+                <w:szCs w:val="20"/>
+                <w:lang w:eastAsia="zh-TW"/>
+              </w:rPr>
+            </w:pPr>
+            <w:r>
+              <w:rPr>
+                <w:rFonts w:ascii="Roboto" w:eastAsia="Times New Roman" w:hAnsi="Roboto"/>
+                <w:bCs/>
+                <w:sz w:val="20"/>
+                <w:szCs w:val="20"/>
+                <w:lang w:eastAsia="zh-TW"/>
+              </w:rPr>
+              <w:t>Year-long research stipend supporting transcriptomic biomarker discovery and validation in chemo-immunotherapy with Dr. Nancy Guo.</w:t>
             </w:r>
           </w:p>
         </w:tc>
@@ -7638,22 +6416,21 @@
       <w:tr>
         <w:trPr>
           <w:gridAfter w:val="2"/>
-          <w:wAfter w:w="1212" w:type="dxa"/>
+          <w:wAfter w:w="996" w:type="dxa"/>
         </w:trPr>
         <w:tc>
           <w:tcPr>
-            <w:tcW w:w="11741" w:type="dxa"/>
-            <w:gridSpan w:val="3"/>
+            <w:tcW w:w="11957" w:type="dxa"/>
+            <w:gridSpan w:val="4"/>
           </w:tcPr>
           <w:p>
             <w:pPr>
               <w:pStyle w:val="NormalWeb"/>
               <w:spacing w:before="0" w:beforeAutospacing="0" w:after="0" w:afterAutospacing="0"/>
               <w:rPr>
-                <w:rFonts w:ascii="Roboto" w:eastAsia="Times New Roman" w:hAnsi="Roboto"/>
+                <w:rFonts w:ascii="Lora" w:eastAsia="Times New Roman" w:hAnsi="Lora"/>
                 <w:sz w:val="22"/>
                 <w:szCs w:val="22"/>
-                <w:lang w:val="en-US"/>
               </w:rPr>
             </w:pPr>
           </w:p>
@@ -7662,17 +6439,16 @@
       <w:tr>
         <w:trPr>
           <w:gridAfter w:val="2"/>
-          <w:wAfter w:w="1212" w:type="dxa"/>
+          <w:wAfter w:w="996" w:type="dxa"/>
         </w:trPr>
         <w:tc>
           <w:tcPr>
-            <w:tcW w:w="11741" w:type="dxa"/>
-            <w:gridSpan w:val="3"/>
+            <w:tcW w:w="1558" w:type="dxa"/>
           </w:tcPr>
           <w:p>
             <w:pPr>
               <w:pStyle w:val="NormalWeb"/>
-              <w:spacing w:before="0" w:beforeAutospacing="0" w:after="0" w:afterAutospacing="0" w:line="276" w:lineRule="auto"/>
+              <w:spacing w:before="0" w:beforeAutospacing="0" w:after="0" w:afterAutospacing="0"/>
               <w:rPr>
                 <w:rFonts w:ascii="Roboto" w:eastAsia="Times New Roman" w:hAnsi="Roboto"/>
                 <w:sz w:val="20"/>
@@ -7680,18 +6456,1001 @@
                 <w:lang w:val="en-US"/>
               </w:rPr>
             </w:pPr>
+            <w:r>
+              <w:rPr>
+                <w:rFonts w:ascii="Roboto" w:hAnsi="Roboto" w:cs="Times New Roman (Body CS)"/>
+                <w:sz w:val="20"/>
+                <w:szCs w:val="20"/>
+              </w:rPr>
+              <w:t>SUMMER 2026</w:t>
+            </w:r>
+          </w:p>
+        </w:tc>
+        <w:tc>
+          <w:tcPr>
+            <w:tcW w:w="236" w:type="dxa"/>
+            <w:gridSpan w:val="2"/>
+            <w:tcBorders>
+              <w:right w:val="single" w:sz="4" w:space="0" w:color="000000"/>
+            </w:tcBorders>
+          </w:tcPr>
+          <w:p>
+            <w:pPr>
+              <w:pStyle w:val="NormalWeb"/>
+              <w:spacing w:before="0" w:beforeAutospacing="0" w:after="0" w:afterAutospacing="0"/>
+              <w:rPr>
+                <w:rFonts w:ascii="Lora" w:eastAsia="Times New Roman" w:hAnsi="Lora"/>
+                <w:sz w:val="21"/>
+                <w:szCs w:val="21"/>
+                <w:lang w:val="en-US"/>
+              </w:rPr>
+            </w:pPr>
+          </w:p>
+        </w:tc>
+        <w:tc>
+          <w:tcPr>
+            <w:tcW w:w="10163" w:type="dxa"/>
+            <w:tcBorders>
+              <w:left w:val="single" w:sz="4" w:space="0" w:color="000000"/>
+            </w:tcBorders>
+          </w:tcPr>
+          <w:p>
+            <w:pPr>
+              <w:rPr>
+                <w:rFonts w:ascii="Roboto" w:hAnsi="Roboto"/>
+                <w:b/>
+                <w:bCs/>
+                <w:sz w:val="26"/>
+                <w:szCs w:val="26"/>
+              </w:rPr>
+            </w:pPr>
+            <w:r>
+              <w:rPr>
+                <w:rFonts w:ascii="Roboto" w:hAnsi="Roboto"/>
+                <w:b/>
+                <w:bCs/>
+                <w:sz w:val="26"/>
+                <w:szCs w:val="26"/>
+              </w:rPr>
+              <w:t>Fleishman Internship Funding Award</w:t>
+            </w:r>
+          </w:p>
+          <w:p>
+            <w:pPr>
+              <w:rPr>
+                <w:rFonts w:ascii="Lora" w:eastAsia="Times New Roman" w:hAnsi="Lora"/>
+                <w:b/>
+                <w:i/>
+                <w:iCs/>
+                <w:color w:val="2D4239"/>
+                <w:sz w:val="21"/>
+                <w:szCs w:val="21"/>
+                <w:lang w:eastAsia="zh-TW"/>
+              </w:rPr>
+            </w:pPr>
+            <w:r>
+              <w:rPr>
+                <w:rFonts w:ascii="Lora" w:eastAsia="Times New Roman" w:hAnsi="Lora"/>
+                <w:b/>
+                <w:i/>
+                <w:iCs/>
+                <w:color w:val="2D4239"/>
+                <w:sz w:val="21"/>
+                <w:szCs w:val="21"/>
+                <w:lang w:eastAsia="zh-TW"/>
+              </w:rPr>
+              <w:t>Binghamton University</w:t>
+            </w:r>
+          </w:p>
+          <w:p>
+            <w:pPr>
+              <w:rPr>
+                <w:rFonts w:ascii="Lora" w:eastAsia="Times New Roman" w:hAnsi="Lora"/>
+                <w:b/>
+                <w:color w:val="2D4239"/>
+                <w:sz w:val="21"/>
+                <w:szCs w:val="21"/>
+                <w:lang w:eastAsia="zh-TW"/>
+              </w:rPr>
+            </w:pPr>
+          </w:p>
+          <w:p>
+            <w:pPr>
+              <w:pStyle w:val="ListParagraph"/>
+              <w:numPr>
+                <w:ilvl w:val="0"/>
+                <w:numId w:val="1"/>
+              </w:numPr>
+              <w:spacing w:after="80"/>
+              <w:ind w:left="357" w:right="567" w:hanging="357"/>
+              <w:contextualSpacing w:val="0"/>
+              <w:rPr>
+                <w:rFonts w:ascii="Roboto" w:eastAsia="Times New Roman" w:hAnsi="Roboto"/>
+                <w:bCs/>
+                <w:sz w:val="20"/>
+                <w:szCs w:val="20"/>
+                <w:lang w:eastAsia="zh-TW"/>
+              </w:rPr>
+            </w:pPr>
+            <w:r>
+              <w:rPr>
+                <w:rFonts w:ascii="Roboto" w:eastAsia="Times New Roman" w:hAnsi="Roboto"/>
+                <w:bCs/>
+                <w:sz w:val="20"/>
+                <w:szCs w:val="20"/>
+                <w:lang w:eastAsia="zh-TW"/>
+              </w:rPr>
+              <w:t>Awarded summer internship funding to support a quantitative research internship with the First-year Research Immersion (FRI) program.</w:t>
+            </w:r>
           </w:p>
         </w:tc>
       </w:tr>
       <w:tr>
         <w:trPr>
           <w:gridAfter w:val="2"/>
-          <w:wAfter w:w="1212" w:type="dxa"/>
+          <w:wAfter w:w="996" w:type="dxa"/>
         </w:trPr>
         <w:tc>
           <w:tcPr>
-            <w:tcW w:w="11741" w:type="dxa"/>
-            <w:gridSpan w:val="3"/>
+            <w:tcW w:w="11957" w:type="dxa"/>
+            <w:gridSpan w:val="4"/>
+          </w:tcPr>
+          <w:p>
+            <w:pPr>
+              <w:pStyle w:val="NormalWeb"/>
+              <w:spacing w:before="0" w:beforeAutospacing="0" w:after="0" w:afterAutospacing="0"/>
+              <w:rPr>
+                <w:rFonts w:ascii="Lora" w:eastAsia="Times New Roman" w:hAnsi="Lora"/>
+                <w:sz w:val="22"/>
+                <w:szCs w:val="22"/>
+              </w:rPr>
+            </w:pPr>
+          </w:p>
+        </w:tc>
+      </w:tr>
+      <w:tr>
+        <w:trPr>
+          <w:gridAfter w:val="2"/>
+          <w:wAfter w:w="996" w:type="dxa"/>
+        </w:trPr>
+        <w:tc>
+          <w:tcPr>
+            <w:tcW w:w="1558" w:type="dxa"/>
+          </w:tcPr>
+          <w:p>
+            <w:pPr>
+              <w:pStyle w:val="NormalWeb"/>
+              <w:spacing w:before="0" w:beforeAutospacing="0" w:after="0" w:afterAutospacing="0"/>
+              <w:rPr>
+                <w:rFonts w:ascii="Roboto" w:eastAsia="Times New Roman" w:hAnsi="Roboto"/>
+                <w:sz w:val="20"/>
+                <w:szCs w:val="20"/>
+                <w:lang w:val="en-US"/>
+              </w:rPr>
+            </w:pPr>
+            <w:r>
+              <w:rPr>
+                <w:rFonts w:ascii="Roboto" w:hAnsi="Roboto" w:cs="Times New Roman (Body CS)"/>
+                <w:sz w:val="20"/>
+                <w:szCs w:val="20"/>
+              </w:rPr>
+              <w:t>FEB 2026</w:t>
+            </w:r>
+          </w:p>
+        </w:tc>
+        <w:tc>
+          <w:tcPr>
+            <w:tcW w:w="236" w:type="dxa"/>
+            <w:gridSpan w:val="2"/>
+            <w:tcBorders>
+              <w:right w:val="single" w:sz="4" w:space="0" w:color="000000"/>
+            </w:tcBorders>
+          </w:tcPr>
+          <w:p>
+            <w:pPr>
+              <w:pStyle w:val="NormalWeb"/>
+              <w:spacing w:before="0" w:beforeAutospacing="0" w:after="0" w:afterAutospacing="0"/>
+              <w:rPr>
+                <w:rFonts w:ascii="Lora" w:eastAsia="Times New Roman" w:hAnsi="Lora"/>
+                <w:sz w:val="21"/>
+                <w:szCs w:val="21"/>
+                <w:lang w:val="en-US"/>
+              </w:rPr>
+            </w:pPr>
+          </w:p>
+        </w:tc>
+        <w:tc>
+          <w:tcPr>
+            <w:tcW w:w="10163" w:type="dxa"/>
+            <w:tcBorders>
+              <w:left w:val="single" w:sz="4" w:space="0" w:color="000000"/>
+            </w:tcBorders>
+          </w:tcPr>
+          <w:p>
+            <w:pPr>
+              <w:rPr>
+                <w:rFonts w:ascii="Roboto" w:hAnsi="Roboto"/>
+                <w:b/>
+                <w:bCs/>
+                <w:sz w:val="26"/>
+                <w:szCs w:val="26"/>
+              </w:rPr>
+            </w:pPr>
+            <w:r>
+              <w:rPr>
+                <w:rFonts w:ascii="Roboto" w:hAnsi="Roboto"/>
+                <w:b/>
+                <w:bCs/>
+                <w:sz w:val="26"/>
+                <w:szCs w:val="26"/>
+              </w:rPr>
+              <w:t>Pi Mu Epsilon</w:t>
+            </w:r>
+          </w:p>
+          <w:p>
+            <w:pPr>
+              <w:rPr>
+                <w:rFonts w:ascii="Lora" w:eastAsia="Times New Roman" w:hAnsi="Lora"/>
+                <w:b/>
+                <w:i/>
+                <w:iCs/>
+                <w:color w:val="2D4239"/>
+                <w:sz w:val="21"/>
+                <w:szCs w:val="21"/>
+                <w:lang w:eastAsia="zh-TW"/>
+              </w:rPr>
+            </w:pPr>
+            <w:r>
+              <w:rPr>
+                <w:rFonts w:ascii="Lora" w:eastAsia="Times New Roman" w:hAnsi="Lora"/>
+                <w:b/>
+                <w:i/>
+                <w:iCs/>
+                <w:color w:val="2D4239"/>
+                <w:sz w:val="21"/>
+                <w:szCs w:val="21"/>
+                <w:lang w:eastAsia="zh-TW"/>
+              </w:rPr>
+              <w:t>National Mathematics Honor Society</w:t>
+            </w:r>
+          </w:p>
+        </w:tc>
+      </w:tr>
+      <w:tr>
+        <w:trPr>
+          <w:gridAfter w:val="2"/>
+          <w:wAfter w:w="996" w:type="dxa"/>
+        </w:trPr>
+        <w:tc>
+          <w:tcPr>
+            <w:tcW w:w="11957" w:type="dxa"/>
+            <w:gridSpan w:val="4"/>
+          </w:tcPr>
+          <w:p>
+            <w:pPr>
+              <w:pStyle w:val="NormalWeb"/>
+              <w:spacing w:before="0" w:beforeAutospacing="0" w:after="0" w:afterAutospacing="0"/>
+              <w:rPr>
+                <w:rFonts w:ascii="Roboto" w:eastAsia="Times New Roman" w:hAnsi="Roboto"/>
+                <w:sz w:val="22"/>
+                <w:szCs w:val="22"/>
+                <w:lang w:val="en-US"/>
+              </w:rPr>
+            </w:pPr>
+          </w:p>
+        </w:tc>
+      </w:tr>
+      <w:tr>
+        <w:trPr>
+          <w:gridAfter w:val="2"/>
+          <w:wAfter w:w="996" w:type="dxa"/>
+        </w:trPr>
+        <w:tc>
+          <w:tcPr>
+            <w:tcW w:w="1558" w:type="dxa"/>
+          </w:tcPr>
+          <w:p>
+            <w:pPr>
+              <w:pStyle w:val="NormalWeb"/>
+              <w:spacing w:before="0" w:beforeAutospacing="0" w:after="0" w:afterAutospacing="0"/>
+              <w:rPr>
+                <w:rFonts w:ascii="Roboto" w:eastAsia="Times New Roman" w:hAnsi="Roboto"/>
+                <w:sz w:val="20"/>
+                <w:szCs w:val="20"/>
+                <w:lang w:val="en-US"/>
+              </w:rPr>
+            </w:pPr>
+            <w:r>
+              <w:rPr>
+                <w:rFonts w:ascii="Roboto" w:hAnsi="Roboto" w:cs="Times New Roman (Body CS)"/>
+                <w:sz w:val="20"/>
+                <w:szCs w:val="20"/>
+              </w:rPr>
+              <w:t>FALL</w:t>
+            </w:r>
+            <w:r>
+              <w:rPr>
+                <w:rFonts w:ascii="Roboto" w:hAnsi="Roboto" w:cs="Times New Roman (Body CS)"/>
+                <w:sz w:val="20"/>
+                <w:szCs w:val="20"/>
+              </w:rPr>
+              <w:t xml:space="preserve"> 20</w:t>
+            </w:r>
+            <w:r>
+              <w:rPr>
+                <w:rFonts w:ascii="Roboto" w:hAnsi="Roboto" w:cs="Times New Roman (Body CS)"/>
+                <w:sz w:val="20"/>
+                <w:szCs w:val="20"/>
+              </w:rPr>
+              <w:t>23</w:t>
+            </w:r>
+            <w:r>
+              <w:rPr>
+                <w:rFonts w:ascii="Roboto" w:hAnsi="Roboto" w:cs="Times New Roman (Body CS)"/>
+                <w:sz w:val="20"/>
+                <w:szCs w:val="20"/>
+              </w:rPr>
+              <w:t xml:space="preserve"> - </w:t>
+            </w:r>
+            <w:r>
+              <w:rPr>
+                <w:rFonts w:ascii="Roboto" w:hAnsi="Roboto" w:cs="Times New Roman (Body CS)"/>
+                <w:sz w:val="20"/>
+                <w:szCs w:val="20"/>
+              </w:rPr>
+              <w:t>PRESENT</w:t>
+            </w:r>
+          </w:p>
+        </w:tc>
+        <w:tc>
+          <w:tcPr>
+            <w:tcW w:w="236" w:type="dxa"/>
+            <w:gridSpan w:val="2"/>
+            <w:tcBorders>
+              <w:right w:val="single" w:sz="4" w:space="0" w:color="000000"/>
+            </w:tcBorders>
+          </w:tcPr>
+          <w:p>
+            <w:pPr>
+              <w:pStyle w:val="NormalWeb"/>
+              <w:spacing w:before="0" w:beforeAutospacing="0" w:after="0" w:afterAutospacing="0"/>
+              <w:rPr>
+                <w:rFonts w:ascii="Lora" w:eastAsia="Times New Roman" w:hAnsi="Lora"/>
+                <w:sz w:val="21"/>
+                <w:szCs w:val="21"/>
+                <w:lang w:val="en-US"/>
+              </w:rPr>
+            </w:pPr>
+          </w:p>
+        </w:tc>
+        <w:tc>
+          <w:tcPr>
+            <w:tcW w:w="10163" w:type="dxa"/>
+            <w:tcBorders>
+              <w:left w:val="single" w:sz="4" w:space="0" w:color="000000"/>
+            </w:tcBorders>
+          </w:tcPr>
+          <w:p>
+            <w:pPr>
+              <w:rPr>
+                <w:rFonts w:ascii="Roboto" w:hAnsi="Roboto"/>
+                <w:b/>
+                <w:bCs/>
+                <w:sz w:val="26"/>
+                <w:szCs w:val="26"/>
+              </w:rPr>
+            </w:pPr>
+            <w:r>
+              <w:rPr>
+                <w:rFonts w:ascii="Roboto" w:hAnsi="Roboto"/>
+                <w:b/>
+                <w:bCs/>
+                <w:sz w:val="26"/>
+                <w:szCs w:val="26"/>
+              </w:rPr>
+              <w:t>Harpur College Dean’s List</w:t>
+            </w:r>
+          </w:p>
+          <w:p>
+            <w:pPr>
+              <w:rPr>
+                <w:rFonts w:ascii="Lora" w:eastAsia="Times New Roman" w:hAnsi="Lora"/>
+                <w:b/>
+                <w:i/>
+                <w:iCs/>
+                <w:color w:val="2D4239"/>
+                <w:sz w:val="21"/>
+                <w:szCs w:val="21"/>
+                <w:lang w:eastAsia="zh-TW"/>
+              </w:rPr>
+            </w:pPr>
+            <w:r>
+              <w:rPr>
+                <w:rFonts w:ascii="Lora" w:eastAsia="Times New Roman" w:hAnsi="Lora"/>
+                <w:b/>
+                <w:i/>
+                <w:iCs/>
+                <w:color w:val="2D4239"/>
+                <w:sz w:val="21"/>
+                <w:szCs w:val="21"/>
+                <w:lang w:eastAsia="zh-TW"/>
+              </w:rPr>
+              <w:t>Binghamton University</w:t>
+            </w:r>
+          </w:p>
+          <w:p>
+            <w:pPr>
+              <w:rPr>
+                <w:rFonts w:ascii="Lora" w:eastAsia="Times New Roman" w:hAnsi="Lora"/>
+                <w:b/>
+                <w:i/>
+                <w:iCs/>
+                <w:color w:val="2D4239"/>
+                <w:sz w:val="21"/>
+                <w:szCs w:val="21"/>
+                <w:lang w:eastAsia="zh-TW"/>
+              </w:rPr>
+            </w:pPr>
+          </w:p>
+          <w:p>
+            <w:pPr>
+              <w:pStyle w:val="ListParagraph"/>
+              <w:numPr>
+                <w:ilvl w:val="0"/>
+                <w:numId w:val="1"/>
+              </w:numPr>
+              <w:spacing w:after="80"/>
+              <w:ind w:left="357" w:right="567" w:hanging="357"/>
+              <w:contextualSpacing w:val="0"/>
+              <w:rPr>
+                <w:rFonts w:ascii="Roboto" w:eastAsia="Times New Roman" w:hAnsi="Roboto"/>
+                <w:bCs/>
+                <w:sz w:val="20"/>
+                <w:szCs w:val="20"/>
+                <w:lang w:eastAsia="zh-TW"/>
+              </w:rPr>
+            </w:pPr>
+            <w:r>
+              <w:rPr>
+                <w:rFonts w:ascii="Roboto" w:eastAsia="Times New Roman" w:hAnsi="Roboto"/>
+                <w:bCs/>
+                <w:sz w:val="20"/>
+                <w:szCs w:val="20"/>
+                <w:lang w:eastAsia="zh-TW"/>
+              </w:rPr>
+              <w:t>Named to the Dean’s List every semester attended</w:t>
+            </w:r>
+            <w:r>
+              <w:rPr>
+                <w:rFonts w:ascii="Roboto" w:eastAsia="Times New Roman" w:hAnsi="Roboto"/>
+                <w:bCs/>
+                <w:sz w:val="20"/>
+                <w:szCs w:val="20"/>
+                <w:lang w:eastAsia="zh-TW"/>
+              </w:rPr>
+              <w:t>.</w:t>
+            </w:r>
+          </w:p>
+        </w:tc>
+      </w:tr>
+      <w:tr>
+        <w:trPr>
+          <w:gridAfter w:val="2"/>
+          <w:wAfter w:w="996" w:type="dxa"/>
+        </w:trPr>
+        <w:tc>
+          <w:tcPr>
+            <w:tcW w:w="11957" w:type="dxa"/>
+            <w:gridSpan w:val="4"/>
+          </w:tcPr>
+          <w:p>
+            <w:pPr>
+              <w:pStyle w:val="NormalWeb"/>
+              <w:spacing w:before="0" w:beforeAutospacing="0" w:after="0" w:afterAutospacing="0"/>
+              <w:rPr>
+                <w:rFonts w:ascii="Lora" w:eastAsia="Times New Roman" w:hAnsi="Lora"/>
+                <w:sz w:val="22"/>
+                <w:szCs w:val="22"/>
+              </w:rPr>
+            </w:pPr>
+          </w:p>
+        </w:tc>
+      </w:tr>
+      <w:tr>
+        <w:trPr>
+          <w:gridAfter w:val="2"/>
+          <w:wAfter w:w="996" w:type="dxa"/>
+        </w:trPr>
+        <w:tc>
+          <w:tcPr>
+            <w:tcW w:w="1558" w:type="dxa"/>
+          </w:tcPr>
+          <w:p>
+            <w:pPr>
+              <w:pStyle w:val="NormalWeb"/>
+              <w:spacing w:before="0" w:beforeAutospacing="0" w:after="0" w:afterAutospacing="0"/>
+              <w:rPr>
+                <w:rFonts w:ascii="Roboto" w:eastAsia="Times New Roman" w:hAnsi="Roboto"/>
+                <w:sz w:val="20"/>
+                <w:szCs w:val="20"/>
+                <w:lang w:val="en-US"/>
+              </w:rPr>
+            </w:pPr>
+            <w:r>
+              <w:rPr>
+                <w:rFonts w:ascii="Roboto" w:hAnsi="Roboto" w:cs="Times New Roman (Body CS)"/>
+                <w:sz w:val="20"/>
+                <w:szCs w:val="20"/>
+              </w:rPr>
+              <w:t>EACH SEMESTER</w:t>
+            </w:r>
+          </w:p>
+        </w:tc>
+        <w:tc>
+          <w:tcPr>
+            <w:tcW w:w="236" w:type="dxa"/>
+            <w:gridSpan w:val="2"/>
+            <w:tcBorders>
+              <w:right w:val="single" w:sz="4" w:space="0" w:color="000000"/>
+            </w:tcBorders>
+          </w:tcPr>
+          <w:p>
+            <w:pPr>
+              <w:pStyle w:val="NormalWeb"/>
+              <w:spacing w:before="0" w:beforeAutospacing="0" w:after="0" w:afterAutospacing="0"/>
+              <w:rPr>
+                <w:rFonts w:ascii="Lora" w:eastAsia="Times New Roman" w:hAnsi="Lora"/>
+                <w:sz w:val="21"/>
+                <w:szCs w:val="21"/>
+                <w:lang w:val="en-US"/>
+              </w:rPr>
+            </w:pPr>
+          </w:p>
+        </w:tc>
+        <w:tc>
+          <w:tcPr>
+            <w:tcW w:w="10163" w:type="dxa"/>
+            <w:tcBorders>
+              <w:left w:val="single" w:sz="4" w:space="0" w:color="000000"/>
+            </w:tcBorders>
+          </w:tcPr>
+          <w:p>
+            <w:pPr>
+              <w:rPr>
+                <w:rFonts w:ascii="Roboto" w:hAnsi="Roboto"/>
+                <w:b/>
+                <w:bCs/>
+                <w:sz w:val="26"/>
+                <w:szCs w:val="26"/>
+              </w:rPr>
+            </w:pPr>
+            <w:r>
+              <w:rPr>
+                <w:rFonts w:ascii="Roboto" w:hAnsi="Roboto"/>
+                <w:b/>
+                <w:bCs/>
+                <w:sz w:val="26"/>
+                <w:szCs w:val="26"/>
+              </w:rPr>
+              <w:t>Provost’s Promise Scholarship</w:t>
+            </w:r>
+          </w:p>
+          <w:p>
+            <w:pPr>
+              <w:rPr>
+                <w:rFonts w:ascii="Lora" w:eastAsia="Times New Roman" w:hAnsi="Lora"/>
+                <w:b/>
+                <w:i/>
+                <w:iCs/>
+                <w:color w:val="2D4239"/>
+                <w:sz w:val="21"/>
+                <w:szCs w:val="21"/>
+                <w:lang w:eastAsia="zh-TW"/>
+              </w:rPr>
+            </w:pPr>
+            <w:r>
+              <w:rPr>
+                <w:rFonts w:ascii="Lora" w:eastAsia="Times New Roman" w:hAnsi="Lora"/>
+                <w:b/>
+                <w:i/>
+                <w:iCs/>
+                <w:color w:val="2D4239"/>
+                <w:sz w:val="21"/>
+                <w:szCs w:val="21"/>
+                <w:lang w:eastAsia="zh-TW"/>
+              </w:rPr>
+              <w:t>Binghamton University</w:t>
+            </w:r>
+          </w:p>
+          <w:p>
+            <w:pPr>
+              <w:rPr>
+                <w:rFonts w:ascii="Lora" w:eastAsia="Times New Roman" w:hAnsi="Lora"/>
+                <w:b/>
+                <w:color w:val="2D4239"/>
+                <w:sz w:val="21"/>
+                <w:szCs w:val="21"/>
+                <w:lang w:eastAsia="zh-TW"/>
+              </w:rPr>
+            </w:pPr>
+          </w:p>
+          <w:p>
+            <w:pPr>
+              <w:pStyle w:val="ListParagraph"/>
+              <w:numPr>
+                <w:ilvl w:val="0"/>
+                <w:numId w:val="1"/>
+              </w:numPr>
+              <w:spacing w:after="80"/>
+              <w:ind w:left="357" w:right="567" w:hanging="357"/>
+              <w:contextualSpacing w:val="0"/>
+              <w:rPr>
+                <w:rFonts w:ascii="Roboto" w:eastAsia="Times New Roman" w:hAnsi="Roboto"/>
+                <w:bCs/>
+                <w:sz w:val="20"/>
+                <w:szCs w:val="20"/>
+                <w:lang w:eastAsia="zh-TW"/>
+              </w:rPr>
+            </w:pPr>
+            <w:r>
+              <w:rPr>
+                <w:rFonts w:ascii="Roboto" w:eastAsia="Times New Roman" w:hAnsi="Roboto"/>
+                <w:bCs/>
+                <w:sz w:val="20"/>
+                <w:szCs w:val="20"/>
+                <w:lang w:eastAsia="zh-TW"/>
+              </w:rPr>
+              <w:t>Recipient of renewable financial support each semester throughout undergraduate study</w:t>
+            </w:r>
+            <w:r>
+              <w:rPr>
+                <w:rFonts w:ascii="Roboto" w:eastAsia="Times New Roman" w:hAnsi="Roboto"/>
+                <w:bCs/>
+                <w:sz w:val="20"/>
+                <w:szCs w:val="20"/>
+                <w:lang w:eastAsia="zh-TW"/>
+              </w:rPr>
+              <w:t>.</w:t>
+            </w:r>
+          </w:p>
+        </w:tc>
+      </w:tr>
+      <w:tr>
+        <w:trPr>
+          <w:gridAfter w:val="2"/>
+          <w:wAfter w:w="996" w:type="dxa"/>
+        </w:trPr>
+        <w:tc>
+          <w:tcPr>
+            <w:tcW w:w="11957" w:type="dxa"/>
+            <w:gridSpan w:val="4"/>
+          </w:tcPr>
+          <w:p>
+            <w:pPr>
+              <w:pStyle w:val="NormalWeb"/>
+              <w:spacing w:before="0" w:beforeAutospacing="0" w:after="0" w:afterAutospacing="0"/>
+              <w:rPr>
+                <w:rFonts w:ascii="Roboto" w:eastAsia="Times New Roman" w:hAnsi="Roboto"/>
+                <w:b/>
+                <w:bCs/>
+                <w:color w:val="2D4239"/>
+                <w:sz w:val="32"/>
+                <w:szCs w:val="32"/>
+                <w:lang w:val="en-US"/>
+              </w:rPr>
+            </w:pPr>
+          </w:p>
+          <w:p>
+            <w:pPr>
+              <w:pStyle w:val="NormalWeb"/>
+              <w:spacing w:before="0" w:beforeAutospacing="0" w:after="0" w:afterAutospacing="0"/>
+              <w:rPr>
+                <w:rFonts w:ascii="Roboto" w:eastAsia="Times New Roman" w:hAnsi="Roboto"/>
+                <w:b/>
+                <w:bCs/>
+                <w:color w:val="2D4239"/>
+                <w:sz w:val="32"/>
+                <w:szCs w:val="32"/>
+                <w:lang w:val="en-US"/>
+              </w:rPr>
+            </w:pPr>
+          </w:p>
+          <w:p>
+            <w:pPr>
+              <w:pStyle w:val="NormalWeb"/>
+              <w:spacing w:before="0" w:beforeAutospacing="0" w:after="0" w:afterAutospacing="0"/>
+              <w:rPr>
+                <w:rFonts w:ascii="Roboto" w:eastAsia="Times New Roman" w:hAnsi="Roboto"/>
+                <w:color w:val="2D4239"/>
+                <w:sz w:val="28"/>
+                <w:szCs w:val="28"/>
+                <w:lang w:val="en-US"/>
+              </w:rPr>
+            </w:pPr>
+            <w:r>
+              <w:rPr>
+                <w:rFonts w:ascii="Roboto" w:eastAsia="Times New Roman" w:hAnsi="Roboto"/>
+                <w:b/>
+                <w:bCs/>
+                <w:color w:val="2D4239"/>
+                <w:sz w:val="32"/>
+                <w:szCs w:val="32"/>
+                <w:lang w:val="en-US"/>
+              </w:rPr>
+              <w:t>Technical</w:t>
+            </w:r>
+            <w:r>
+              <w:rPr>
+                <w:rFonts w:ascii="Roboto" w:eastAsia="Times New Roman" w:hAnsi="Roboto"/>
+                <w:b/>
+                <w:bCs/>
+                <w:color w:val="2D4239"/>
+                <w:sz w:val="32"/>
+                <w:szCs w:val="32"/>
+                <w:lang w:val="en-US"/>
+              </w:rPr>
+              <w:t xml:space="preserve"> Skills</w:t>
+            </w:r>
+          </w:p>
+        </w:tc>
+      </w:tr>
+      <w:tr>
+        <w:trPr>
+          <w:gridAfter w:val="2"/>
+          <w:wAfter w:w="996" w:type="dxa"/>
+        </w:trPr>
+        <w:tc>
+          <w:tcPr>
+            <w:tcW w:w="11957" w:type="dxa"/>
+            <w:gridSpan w:val="4"/>
+          </w:tcPr>
+          <w:p>
+            <w:pPr>
+              <w:pStyle w:val="NormalWeb"/>
+              <w:spacing w:before="0" w:beforeAutospacing="0" w:after="0" w:afterAutospacing="0"/>
+              <w:rPr>
+                <w:rFonts w:ascii="Roboto" w:eastAsia="Times New Roman" w:hAnsi="Roboto"/>
+                <w:b/>
+                <w:bCs/>
+                <w:sz w:val="20"/>
+                <w:szCs w:val="20"/>
+                <w:lang w:val="en-US"/>
+              </w:rPr>
+            </w:pPr>
+          </w:p>
+        </w:tc>
+      </w:tr>
+      <w:tr>
+        <w:trPr>
+          <w:gridAfter w:val="2"/>
+          <w:wAfter w:w="996" w:type="dxa"/>
+        </w:trPr>
+        <w:tc>
+          <w:tcPr>
+            <w:tcW w:w="11957" w:type="dxa"/>
+            <w:gridSpan w:val="4"/>
+          </w:tcPr>
+          <w:p>
+            <w:pPr>
+              <w:pStyle w:val="NormalWeb"/>
+              <w:spacing w:before="0" w:beforeAutospacing="0" w:after="0" w:afterAutospacing="0"/>
+              <w:ind w:left="79"/>
+              <w:rPr>
+                <w:rFonts w:ascii="Roboto" w:eastAsia="Times New Roman" w:hAnsi="Roboto"/>
+                <w:sz w:val="20"/>
+                <w:szCs w:val="20"/>
+              </w:rPr>
+            </w:pPr>
+            <w:r>
+              <w:rPr>
+                <w:rFonts w:ascii="Roboto" w:eastAsia="Times New Roman" w:hAnsi="Roboto"/>
+                <w:b/>
+                <w:bCs/>
+                <w:sz w:val="20"/>
+                <w:szCs w:val="20"/>
+              </w:rPr>
+              <w:t>Programming</w:t>
+            </w:r>
+            <w:r>
+              <w:rPr>
+                <w:rFonts w:ascii="Roboto" w:eastAsia="Times New Roman" w:hAnsi="Roboto"/>
+                <w:sz w:val="20"/>
+                <w:szCs w:val="20"/>
+              </w:rPr>
+              <w:t>: R (tidyverse</w:t>
+            </w:r>
+            <w:r>
+              <w:rPr>
+                <w:rFonts w:ascii="Roboto" w:eastAsia="Times New Roman" w:hAnsi="Roboto"/>
+                <w:sz w:val="20"/>
+                <w:szCs w:val="20"/>
+              </w:rPr>
+              <w:t>, tidymodels, caret</w:t>
+            </w:r>
+            <w:r>
+              <w:rPr>
+                <w:rFonts w:ascii="Roboto" w:eastAsia="Times New Roman" w:hAnsi="Roboto"/>
+                <w:sz w:val="20"/>
+                <w:szCs w:val="20"/>
+              </w:rPr>
+              <w:t xml:space="preserve">), </w:t>
+            </w:r>
+            <w:r>
+              <w:rPr>
+                <w:rFonts w:ascii="Roboto" w:eastAsia="Times New Roman" w:hAnsi="Roboto"/>
+                <w:sz w:val="20"/>
+                <w:szCs w:val="20"/>
+              </w:rPr>
+              <w:t>Python (Pandas, NumPy, scikit-learn, PyTorch), SPSS</w:t>
+            </w:r>
+            <w:r>
+              <w:rPr>
+                <w:rFonts w:ascii="Roboto" w:eastAsia="Times New Roman" w:hAnsi="Roboto"/>
+                <w:sz w:val="20"/>
+                <w:szCs w:val="20"/>
+              </w:rPr>
+              <w:br/>
+            </w:r>
+            <w:r>
+              <w:rPr>
+                <w:rFonts w:ascii="Roboto" w:eastAsia="Times New Roman" w:hAnsi="Roboto"/>
+                <w:b/>
+                <w:bCs/>
+                <w:sz w:val="20"/>
+                <w:szCs w:val="20"/>
+              </w:rPr>
+              <w:t>Data Visualization &amp; Applications</w:t>
+            </w:r>
+            <w:r>
+              <w:rPr>
+                <w:rFonts w:ascii="Roboto" w:eastAsia="Times New Roman" w:hAnsi="Roboto"/>
+                <w:sz w:val="20"/>
+                <w:szCs w:val="20"/>
+              </w:rPr>
+              <w:t>: ggplot2, Plotly, Matplotlib, Observable JS, R Shiny, Qualtrics</w:t>
+            </w:r>
+            <w:r>
+              <w:rPr>
+                <w:rFonts w:ascii="Roboto" w:eastAsia="Times New Roman" w:hAnsi="Roboto"/>
+                <w:sz w:val="20"/>
+                <w:szCs w:val="20"/>
+              </w:rPr>
+              <w:br/>
+            </w:r>
+            <w:r>
+              <w:rPr>
+                <w:rFonts w:ascii="Roboto" w:eastAsia="Times New Roman" w:hAnsi="Roboto"/>
+                <w:b/>
+                <w:bCs/>
+                <w:sz w:val="20"/>
+                <w:szCs w:val="20"/>
+              </w:rPr>
+              <w:t>Research &amp; Reproducibility</w:t>
+            </w:r>
+            <w:r>
+              <w:rPr>
+                <w:rFonts w:ascii="Roboto" w:eastAsia="Times New Roman" w:hAnsi="Roboto"/>
+                <w:sz w:val="20"/>
+                <w:szCs w:val="20"/>
+              </w:rPr>
+              <w:t>: Quarto, GitHub, LaTeX</w:t>
+            </w:r>
+            <w:r>
+              <w:rPr>
+                <w:rFonts w:ascii="Roboto" w:eastAsia="Times New Roman" w:hAnsi="Roboto"/>
+                <w:sz w:val="20"/>
+                <w:szCs w:val="20"/>
+              </w:rPr>
+              <w:br/>
+            </w:r>
+            <w:r>
+              <w:rPr>
+                <w:rFonts w:ascii="Roboto" w:eastAsia="Times New Roman" w:hAnsi="Roboto"/>
+                <w:b/>
+                <w:bCs/>
+                <w:sz w:val="20"/>
+                <w:szCs w:val="20"/>
+              </w:rPr>
+              <w:t>Methods</w:t>
+            </w:r>
+            <w:r>
+              <w:rPr>
+                <w:rFonts w:ascii="Roboto" w:eastAsia="Times New Roman" w:hAnsi="Roboto"/>
+                <w:sz w:val="20"/>
+                <w:szCs w:val="20"/>
+              </w:rPr>
+              <w:t>: Regression, random forests, decision trees, MARS, deep learning, differential expression, GSEA, mixed-methods analysis</w:t>
+            </w:r>
+          </w:p>
+          <w:p>
+            <w:pPr>
+              <w:pStyle w:val="NormalWeb"/>
+              <w:spacing w:before="0" w:beforeAutospacing="0" w:after="0" w:afterAutospacing="0"/>
+              <w:ind w:left="79"/>
+              <w:rPr>
+                <w:rFonts w:ascii="Roboto" w:eastAsia="Times New Roman" w:hAnsi="Roboto"/>
+                <w:sz w:val="20"/>
+                <w:szCs w:val="20"/>
+              </w:rPr>
+            </w:pPr>
+            <w:r>
+              <w:rPr>
+                <w:rFonts w:ascii="Roboto" w:eastAsia="Times New Roman" w:hAnsi="Roboto"/>
+                <w:b/>
+                <w:bCs/>
+                <w:sz w:val="20"/>
+                <w:szCs w:val="20"/>
+              </w:rPr>
+              <w:t>Communication &amp; Collaboration</w:t>
+            </w:r>
+            <w:r>
+              <w:rPr>
+                <w:rFonts w:ascii="Roboto" w:eastAsia="Times New Roman" w:hAnsi="Roboto"/>
+                <w:sz w:val="20"/>
+                <w:szCs w:val="20"/>
+              </w:rPr>
+              <w:t>: Public speaking; Team-based research in academic and internship settings</w:t>
+            </w:r>
+          </w:p>
+        </w:tc>
+      </w:tr>
+      <w:tr>
+        <w:trPr>
+          <w:gridAfter w:val="2"/>
+          <w:wAfter w:w="996" w:type="dxa"/>
+        </w:trPr>
+        <w:tc>
+          <w:tcPr>
+            <w:tcW w:w="11957" w:type="dxa"/>
+            <w:gridSpan w:val="4"/>
+          </w:tcPr>
+          <w:p>
+            <w:pPr>
+              <w:pStyle w:val="NormalWeb"/>
+              <w:spacing w:before="0" w:beforeAutospacing="0" w:after="0" w:afterAutospacing="0"/>
+              <w:rPr>
+                <w:rFonts w:ascii="Roboto" w:eastAsia="Times New Roman" w:hAnsi="Roboto"/>
+                <w:sz w:val="22"/>
+                <w:szCs w:val="22"/>
+                <w:lang w:val="en-US"/>
+              </w:rPr>
+            </w:pPr>
+          </w:p>
+        </w:tc>
+      </w:tr>
+      <w:tr>
+        <w:trPr>
+          <w:gridAfter w:val="2"/>
+          <w:wAfter w:w="996" w:type="dxa"/>
+        </w:trPr>
+        <w:tc>
+          <w:tcPr>
+            <w:tcW w:w="11957" w:type="dxa"/>
+            <w:gridSpan w:val="4"/>
+          </w:tcPr>
+          <w:p>
+            <w:pPr>
+              <w:pStyle w:val="NormalWeb"/>
+              <w:spacing w:before="0" w:beforeAutospacing="0" w:after="0" w:afterAutospacing="0" w:line="276" w:lineRule="auto"/>
+              <w:rPr>
+                <w:rFonts w:ascii="Roboto" w:eastAsia="Times New Roman" w:hAnsi="Roboto"/>
+                <w:sz w:val="20"/>
+                <w:szCs w:val="20"/>
+                <w:lang w:val="en-US"/>
+              </w:rPr>
+            </w:pPr>
+          </w:p>
+        </w:tc>
+      </w:tr>
+      <w:tr>
+        <w:trPr>
+          <w:gridAfter w:val="2"/>
+          <w:wAfter w:w="996" w:type="dxa"/>
+        </w:trPr>
+        <w:tc>
+          <w:tcPr>
+            <w:tcW w:w="11957" w:type="dxa"/>
+            <w:gridSpan w:val="4"/>
           </w:tcPr>
           <w:tbl>
             <w:tblPr>
@@ -9354,11 +9113,12 @@
   <w:style w:type="paragraph" w:default="1" w:styleId="Normal">
     <w:name w:val="Normal"/>
     <w:qFormat/>
-    <w:rsid w:val="00D138F9"/>
+    <w:rsid w:val="007E17B8"/>
   </w:style>
   <w:style w:type="character" w:default="1" w:styleId="DefaultParagraphFont">
     <w:name w:val="Default Paragraph Font"/>
     <w:uiPriority w:val="1"/>
+    <w:semiHidden/>
     <w:unhideWhenUsed/>
   </w:style>
   <w:style w:type="table" w:default="1" w:styleId="TableNormal">

</xml_diff>